<commit_message>
docs: restore rich content in PDF_split_and_Mine
</commit_message>
<xml_diff>
--- a/PDF_split_and_Mine.docx
+++ b/PDF_split_and_Mine.docx
@@ -4,52 +4,1277 @@
   <w:body>
     <w:p>
       <w:pPr>
+        <w:pStyle w:val="Title"/>
+      </w:pPr>
+      <w:r>
+        <w:t>PDF Splitter &amp; Data Extractor</w:t>
+      </w:r>
+    </w:p>
+    <w:p>
+      <w:r>
+        <w:t>Technical Overview — Compute, Execution &amp; Cost Analysis</w:t>
+      </w:r>
+    </w:p>
+    <w:p>
+      <w:pPr>
         <w:pStyle w:val="Heading1"/>
       </w:pPr>
       <w:r>
-        <w:t>PDF Deal Jacket Splitter Overview</w:t>
+        <w:t>1. What It Does</w:t>
       </w:r>
     </w:p>
-    <w:p/>
+    <w:p>
+      <w:r>
+        <w:t>The application processes multi-document PDF scanned auto-finance deal jackets and splits each one into individual output files, one per logical document. A secondary extraction stage reads any credit applications found and records each customer's telemarketing opt-in status, name, and phone numbers in an Excel file.</w:t>
+      </w:r>
+    </w:p>
+    <w:p>
+      <w:pPr>
+        <w:pStyle w:val="Heading1"/>
+      </w:pPr>
+      <w:r>
+        <w:t>2. How to Use run.ps1</w:t>
+      </w:r>
+    </w:p>
+    <w:p>
+      <w:r>
+        <w:t>run.ps1 is the single entry point for all operations — splitting PDFs, extracting opt-in data, and managing Azure jobs. Run it from the repository root in PowerShell.</w:t>
+      </w:r>
+    </w:p>
     <w:p>
       <w:pPr>
         <w:pStyle w:val="Heading2"/>
       </w:pPr>
       <w:r>
-        <w:t>Objective</w:t>
+        <w:t>Quick Start</w:t>
       </w:r>
     </w:p>
-    <w:p/>
+    <w:p>
+      <w:pPr>
+        <w:ind w:left="576"/>
+      </w:pPr>
+      <w:r>
+        <w:rPr>
+          <w:rFonts w:ascii="Courier New" w:hAnsi="Courier New"/>
+          <w:color w:val="1F507D"/>
+          <w:sz w:val="18"/>
+        </w:rPr>
+        <w:t>.\run.ps1</w:t>
+      </w:r>
+    </w:p>
     <w:p>
       <w:r>
-        <w:t>Process large scanned deal-jacket PDFs reliably on the smallest practical hardware profile, while preserving document boundary accuracy and enabling batch throughput.</w:t>
+        <w:t>An interactive menu appears. Choose Local mode (runs on your machine) or Azure mode (cloud-based via Container Apps).</w:t>
       </w:r>
     </w:p>
-    <w:p/>
+    <w:p>
+      <w:r>
+        <w:t>For help at any time:</w:t>
+      </w:r>
+    </w:p>
+    <w:p>
+      <w:pPr>
+        <w:ind w:left="576"/>
+      </w:pPr>
+      <w:r>
+        <w:rPr>
+          <w:rFonts w:ascii="Courier New" w:hAnsi="Courier New"/>
+          <w:color w:val="1F507D"/>
+          <w:sz w:val="18"/>
+        </w:rPr>
+        <w:t>.\run.ps1 -Help</w:t>
+      </w:r>
+    </w:p>
     <w:p>
       <w:pPr>
         <w:pStyle w:val="Heading2"/>
       </w:pPr>
       <w:r>
-        <w:t>What was implemented</w:t>
+        <w:t>One-Time Setup</w:t>
       </w:r>
     </w:p>
-    <w:p/>
+    <w:p>
+      <w:r>
+        <w:t>Local mode requires a Python 3.11 virtual environment:</w:t>
+      </w:r>
+    </w:p>
     <w:p>
       <w:pPr>
-        <w:pStyle w:val="Heading3"/>
+        <w:ind w:left="576"/>
       </w:pPr>
       <w:r>
-        <w:t>1) OCR process isolation</w:t>
+        <w:rPr>
+          <w:rFonts w:ascii="Courier New" w:hAnsi="Courier New"/>
+          <w:color w:val="1F507D"/>
+          <w:sz w:val="18"/>
+        </w:rPr>
+        <w:t>py -3.11 -m venv .venv</w:t>
+        <w:br/>
+        <w:t>.venv\Scripts\pip install -e ".[dev]"</w:t>
       </w:r>
     </w:p>
-    <w:p/>
+    <w:p>
+      <w:r>
+        <w:t>Azure mode requires the Azure CLI:</w:t>
+      </w:r>
+    </w:p>
     <w:p>
       <w:pPr>
-        <w:pStyle w:val="ListBullet"/>
+        <w:ind w:left="576"/>
       </w:pPr>
       <w:r>
-        <w:t>Added an isolated OCR worker mode in `src/pdf_extractor/image_splitter.py`.</w:t>
+        <w:rPr>
+          <w:rFonts w:ascii="Courier New" w:hAnsi="Courier New"/>
+          <w:color w:val="1F507D"/>
+          <w:sz w:val="18"/>
+        </w:rPr>
+        <w:t># Download from: https://aka.ms/installazurecliwindows</w:t>
+      </w:r>
+    </w:p>
+    <w:p>
+      <w:r>
+        <w:t>A .env file with Azure OpenAI credentials is required for opt-in extraction (vision fallback):</w:t>
+      </w:r>
+    </w:p>
+    <w:p>
+      <w:pPr>
+        <w:ind w:left="576"/>
+      </w:pPr>
+      <w:r>
+        <w:rPr>
+          <w:rFonts w:ascii="Courier New" w:hAnsi="Courier New"/>
+          <w:color w:val="1F507D"/>
+          <w:sz w:val="18"/>
+        </w:rPr>
+        <w:t>AZURE_OPENAI_ENDPOINT=https://&lt;your-resource&gt;.openai.azure.com/</w:t>
+        <w:br/>
+        <w:t>AZURE_OPENAI_API_KEY=&lt;your-key&gt;</w:t>
+        <w:br/>
+        <w:t>AZURE_OPENAI_DEPLOYMENT=gpt-4o-mini</w:t>
+      </w:r>
+    </w:p>
+    <w:p>
+      <w:pPr>
+        <w:pStyle w:val="Heading2"/>
+      </w:pPr>
+      <w:r>
+        <w:t>Input and Output Locations</w:t>
+      </w:r>
+    </w:p>
+    <w:p>
+      <w:r>
+        <w:t>Place input PDFs in:</w:t>
+      </w:r>
+    </w:p>
+    <w:p>
+      <w:pPr>
+        <w:ind w:left="576"/>
+      </w:pPr>
+      <w:r>
+        <w:rPr>
+          <w:rFonts w:ascii="Courier New" w:hAnsi="Courier New"/>
+          <w:color w:val="1F507D"/>
+          <w:sz w:val="18"/>
+        </w:rPr>
+        <w:t>src/pdf_extractor/Data/</w:t>
+      </w:r>
+    </w:p>
+    <w:tbl>
+      <w:tblPr>
+        <w:tblStyle w:val="TableGrid"/>
+        <w:tblW w:type="auto" w:w="0"/>
+        <w:tblLook w:firstColumn="1" w:firstRow="1" w:lastColumn="0" w:lastRow="0" w:noHBand="0" w:noVBand="1" w:val="04A0"/>
+      </w:tblPr>
+      <w:tblGrid>
+        <w:gridCol w:w="2880"/>
+        <w:gridCol w:w="2880"/>
+        <w:gridCol w:w="2880"/>
+      </w:tblGrid>
+      <w:tr>
+        <w:tc>
+          <w:tcPr>
+            <w:tcW w:type="dxa" w:w="2880"/>
+          </w:tcPr>
+          <w:p>
+            <w:r>
+              <w:rPr>
+                <w:b/>
+              </w:rPr>
+              <w:t>Output</w:t>
+            </w:r>
+          </w:p>
+        </w:tc>
+        <w:tc>
+          <w:tcPr>
+            <w:tcW w:type="dxa" w:w="2880"/>
+          </w:tcPr>
+          <w:p>
+            <w:r>
+              <w:rPr>
+                <w:b/>
+              </w:rPr>
+              <w:t>Location</w:t>
+            </w:r>
+          </w:p>
+        </w:tc>
+        <w:tc>
+          <w:tcPr>
+            <w:tcW w:type="dxa" w:w="2880"/>
+          </w:tcPr>
+          <w:p>
+            <w:r>
+              <w:rPr>
+                <w:b/>
+              </w:rPr>
+              <w:t>Description</w:t>
+            </w:r>
+          </w:p>
+        </w:tc>
+      </w:tr>
+      <w:tr>
+        <w:tc>
+          <w:tcPr>
+            <w:tcW w:type="dxa" w:w="2880"/>
+          </w:tcPr>
+          <w:p>
+            <w:r>
+              <w:t>Split PDFs</w:t>
+            </w:r>
+          </w:p>
+        </w:tc>
+        <w:tc>
+          <w:tcPr>
+            <w:tcW w:type="dxa" w:w="2880"/>
+          </w:tcPr>
+          <w:p>
+            <w:r>
+              <w:t>output/split-&lt;filename&gt;/</w:t>
+            </w:r>
+          </w:p>
+        </w:tc>
+        <w:tc>
+          <w:tcPr>
+            <w:tcW w:type="dxa" w:w="2880"/>
+          </w:tcPr>
+          <w:p>
+            <w:r>
+              <w:t>One PDF per logical document detected in the source file</w:t>
+            </w:r>
+          </w:p>
+        </w:tc>
+      </w:tr>
+      <w:tr>
+        <w:tc>
+          <w:tcPr>
+            <w:tcW w:type="dxa" w:w="2880"/>
+          </w:tcPr>
+          <w:p>
+            <w:r>
+              <w:t>Excel results</w:t>
+            </w:r>
+          </w:p>
+        </w:tc>
+        <w:tc>
+          <w:tcPr>
+            <w:tcW w:type="dxa" w:w="2880"/>
+          </w:tcPr>
+          <w:p>
+            <w:r>
+              <w:t>output/opt_in_results-&lt;filename&gt;.xlsx</w:t>
+            </w:r>
+          </w:p>
+        </w:tc>
+        <w:tc>
+          <w:tcPr>
+            <w:tcW w:type="dxa" w:w="2880"/>
+          </w:tcPr>
+          <w:p>
+            <w:r>
+              <w:t>Opt-in status, name, and phones for each credit application found</w:t>
+            </w:r>
+          </w:p>
+        </w:tc>
+      </w:tr>
+      <w:tr>
+        <w:tc>
+          <w:tcPr>
+            <w:tcW w:type="dxa" w:w="2880"/>
+          </w:tcPr>
+          <w:p>
+            <w:r>
+              <w:t>Job logs</w:t>
+            </w:r>
+          </w:p>
+        </w:tc>
+        <w:tc>
+          <w:tcPr>
+            <w:tcW w:type="dxa" w:w="2880"/>
+          </w:tcPr>
+          <w:p>
+            <w:r>
+              <w:t>output/job-logs/&lt;execution&gt;-&lt;timestamp&gt;.log</w:t>
+            </w:r>
+          </w:p>
+        </w:tc>
+        <w:tc>
+          <w:tcPr>
+            <w:tcW w:type="dxa" w:w="2880"/>
+          </w:tcPr>
+          <w:p>
+            <w:r>
+              <w:t>Full container logs from Azure jobs, saved locally after each run</w:t>
+            </w:r>
+          </w:p>
+        </w:tc>
+      </w:tr>
+      <w:tr>
+        <w:tc>
+          <w:tcPr>
+            <w:tcW w:type="dxa" w:w="2880"/>
+          </w:tcPr>
+          <w:p>
+            <w:r>
+              <w:t>Config</w:t>
+            </w:r>
+          </w:p>
+        </w:tc>
+        <w:tc>
+          <w:tcPr>
+            <w:tcW w:type="dxa" w:w="2880"/>
+          </w:tcPr>
+          <w:p>
+            <w:r>
+              <w:t>run-config.json</w:t>
+            </w:r>
+          </w:p>
+        </w:tc>
+        <w:tc>
+          <w:tcPr>
+            <w:tcW w:type="dxa" w:w="2880"/>
+          </w:tcPr>
+          <w:p>
+            <w:r>
+              <w:t>Saved input/output path settings (created on first Configure use)</w:t>
+            </w:r>
+          </w:p>
+        </w:tc>
+      </w:tr>
+    </w:tbl>
+    <w:p>
+      <w:pPr>
+        <w:pStyle w:val="Heading2"/>
+      </w:pPr>
+      <w:r>
+        <w:t>Local Mode Menu</w:t>
+      </w:r>
+    </w:p>
+    <w:p>
+      <w:r>
+        <w:t>Select option 1 at startup to enter Local mode. The following options are available:</w:t>
+      </w:r>
+    </w:p>
+    <w:tbl>
+      <w:tblPr>
+        <w:tblStyle w:val="TableGrid"/>
+        <w:tblW w:type="auto" w:w="0"/>
+        <w:tblLook w:firstColumn="1" w:firstRow="1" w:lastColumn="0" w:lastRow="0" w:noHBand="0" w:noVBand="1" w:val="04A0"/>
+      </w:tblPr>
+      <w:tblGrid>
+        <w:gridCol w:w="2880"/>
+        <w:gridCol w:w="2880"/>
+        <w:gridCol w:w="2880"/>
+      </w:tblGrid>
+      <w:tr>
+        <w:tc>
+          <w:tcPr>
+            <w:tcW w:type="dxa" w:w="2880"/>
+          </w:tcPr>
+          <w:p>
+            <w:r>
+              <w:rPr>
+                <w:b/>
+              </w:rPr>
+              <w:t>Option</w:t>
+            </w:r>
+          </w:p>
+        </w:tc>
+        <w:tc>
+          <w:tcPr>
+            <w:tcW w:type="dxa" w:w="2880"/>
+          </w:tcPr>
+          <w:p>
+            <w:r>
+              <w:rPr>
+                <w:b/>
+              </w:rPr>
+              <w:t>Action</w:t>
+            </w:r>
+          </w:p>
+        </w:tc>
+        <w:tc>
+          <w:tcPr>
+            <w:tcW w:type="dxa" w:w="2880"/>
+          </w:tcPr>
+          <w:p>
+            <w:r>
+              <w:rPr>
+                <w:b/>
+              </w:rPr>
+              <w:t>Description</w:t>
+            </w:r>
+          </w:p>
+        </w:tc>
+      </w:tr>
+      <w:tr>
+        <w:tc>
+          <w:tcPr>
+            <w:tcW w:type="dxa" w:w="2880"/>
+          </w:tcPr>
+          <w:p>
+            <w:r>
+              <w:t>1</w:t>
+            </w:r>
+          </w:p>
+        </w:tc>
+        <w:tc>
+          <w:tcPr>
+            <w:tcW w:type="dxa" w:w="2880"/>
+          </w:tcPr>
+          <w:p>
+            <w:r>
+              <w:t>Process one PDF</w:t>
+            </w:r>
+          </w:p>
+        </w:tc>
+        <w:tc>
+          <w:tcPr>
+            <w:tcW w:type="dxa" w:w="2880"/>
+          </w:tcPr>
+          <w:p>
+            <w:r>
+              <w:t>Lists all PDFs in the Data folder; user selects by number. Optionally runs opt-in extraction to Excel.</w:t>
+            </w:r>
+          </w:p>
+        </w:tc>
+      </w:tr>
+      <w:tr>
+        <w:tc>
+          <w:tcPr>
+            <w:tcW w:type="dxa" w:w="2880"/>
+          </w:tcPr>
+          <w:p>
+            <w:r>
+              <w:t>2</w:t>
+            </w:r>
+          </w:p>
+        </w:tc>
+        <w:tc>
+          <w:tcPr>
+            <w:tcW w:type="dxa" w:w="2880"/>
+          </w:tcPr>
+          <w:p>
+            <w:r>
+              <w:t>Process all PDFs</w:t>
+            </w:r>
+          </w:p>
+        </w:tc>
+        <w:tc>
+          <w:tcPr>
+            <w:tcW w:type="dxa" w:w="2880"/>
+          </w:tcPr>
+          <w:p>
+            <w:r>
+              <w:t>Splits every PDF in the Data folder in sequence. Optionally includes opt-in extraction.</w:t>
+            </w:r>
+          </w:p>
+        </w:tc>
+      </w:tr>
+      <w:tr>
+        <w:tc>
+          <w:tcPr>
+            <w:tcW w:type="dxa" w:w="2880"/>
+          </w:tcPr>
+          <w:p>
+            <w:r>
+              <w:t>3</w:t>
+            </w:r>
+          </w:p>
+        </w:tc>
+        <w:tc>
+          <w:tcPr>
+            <w:tcW w:type="dxa" w:w="2880"/>
+          </w:tcPr>
+          <w:p>
+            <w:r>
+              <w:t>Process by pattern</w:t>
+            </w:r>
+          </w:p>
+        </w:tc>
+        <w:tc>
+          <w:tcPr>
+            <w:tcW w:type="dxa" w:w="2880"/>
+          </w:tcPr>
+          <w:p>
+            <w:r>
+              <w:t>Accepts a wildcard pattern (e.g. 6*, Sample-*). Shows matching files for confirmation before processing.</w:t>
+            </w:r>
+          </w:p>
+        </w:tc>
+      </w:tr>
+      <w:tr>
+        <w:tc>
+          <w:tcPr>
+            <w:tcW w:type="dxa" w:w="2880"/>
+          </w:tcPr>
+          <w:p>
+            <w:r>
+              <w:t>4</w:t>
+            </w:r>
+          </w:p>
+        </w:tc>
+        <w:tc>
+          <w:tcPr>
+            <w:tcW w:type="dxa" w:w="2880"/>
+          </w:tcPr>
+          <w:p>
+            <w:r>
+              <w:t>View outputs</w:t>
+            </w:r>
+          </w:p>
+        </w:tc>
+        <w:tc>
+          <w:tcPr>
+            <w:tcW w:type="dxa" w:w="2880"/>
+          </w:tcPr>
+          <w:p>
+            <w:r>
+              <w:t>Displays split folders, Excel files, and recent job logs.</w:t>
+            </w:r>
+          </w:p>
+        </w:tc>
+      </w:tr>
+      <w:tr>
+        <w:tc>
+          <w:tcPr>
+            <w:tcW w:type="dxa" w:w="2880"/>
+          </w:tcPr>
+          <w:p>
+            <w:r>
+              <w:t>5</w:t>
+            </w:r>
+          </w:p>
+        </w:tc>
+        <w:tc>
+          <w:tcPr>
+            <w:tcW w:type="dxa" w:w="2880"/>
+          </w:tcPr>
+          <w:p>
+            <w:r>
+              <w:t>Configure settings</w:t>
+            </w:r>
+          </w:p>
+        </w:tc>
+        <w:tc>
+          <w:tcPr>
+            <w:tcW w:type="dxa" w:w="2880"/>
+          </w:tcPr>
+          <w:p>
+            <w:r>
+              <w:t>Customise the input PDF directory and output directory. Settings saved to run-config.json and persist across runs.</w:t>
+            </w:r>
+          </w:p>
+        </w:tc>
+      </w:tr>
+      <w:tr>
+        <w:tc>
+          <w:tcPr>
+            <w:tcW w:type="dxa" w:w="2880"/>
+          </w:tcPr>
+          <w:p>
+            <w:r>
+              <w:t>6</w:t>
+            </w:r>
+          </w:p>
+        </w:tc>
+        <w:tc>
+          <w:tcPr>
+            <w:tcW w:type="dxa" w:w="2880"/>
+          </w:tcPr>
+          <w:p>
+            <w:r>
+              <w:t>Switch to Azure mode</w:t>
+            </w:r>
+          </w:p>
+        </w:tc>
+        <w:tc>
+          <w:tcPr>
+            <w:tcW w:type="dxa" w:w="2880"/>
+          </w:tcPr>
+          <w:p>
+            <w:r>
+              <w:t>Enters Azure mode (checks az CLI is installed first; shows error and stays in local menu if not).</w:t>
+            </w:r>
+          </w:p>
+        </w:tc>
+      </w:tr>
+      <w:tr>
+        <w:tc>
+          <w:tcPr>
+            <w:tcW w:type="dxa" w:w="2880"/>
+          </w:tcPr>
+          <w:p>
+            <w:r>
+              <w:t>0</w:t>
+            </w:r>
+          </w:p>
+        </w:tc>
+        <w:tc>
+          <w:tcPr>
+            <w:tcW w:type="dxa" w:w="2880"/>
+          </w:tcPr>
+          <w:p>
+            <w:r>
+              <w:t>Exit</w:t>
+            </w:r>
+          </w:p>
+        </w:tc>
+        <w:tc>
+          <w:tcPr>
+            <w:tcW w:type="dxa" w:w="2880"/>
+          </w:tcPr>
+          <w:p>
+            <w:r>
+              <w:t>Exits the script.</w:t>
+            </w:r>
+          </w:p>
+        </w:tc>
+      </w:tr>
+    </w:tbl>
+    <w:p>
+      <w:pPr>
+        <w:pStyle w:val="Heading2"/>
+      </w:pPr>
+      <w:r>
+        <w:t>Azure Mode Menu</w:t>
+      </w:r>
+    </w:p>
+    <w:p>
+      <w:r>
+        <w:t>Select option 2 at startup to enter Azure mode (requires az CLI and Contributor access to the nader-test-rag resource group).</w:t>
+      </w:r>
+    </w:p>
+    <w:tbl>
+      <w:tblPr>
+        <w:tblStyle w:val="TableGrid"/>
+        <w:tblW w:type="auto" w:w="0"/>
+        <w:tblLook w:firstColumn="1" w:firstRow="1" w:lastColumn="0" w:lastRow="0" w:noHBand="0" w:noVBand="1" w:val="04A0"/>
+      </w:tblPr>
+      <w:tblGrid>
+        <w:gridCol w:w="2880"/>
+        <w:gridCol w:w="2880"/>
+        <w:gridCol w:w="2880"/>
+      </w:tblGrid>
+      <w:tr>
+        <w:tc>
+          <w:tcPr>
+            <w:tcW w:type="dxa" w:w="2880"/>
+          </w:tcPr>
+          <w:p>
+            <w:r>
+              <w:rPr>
+                <w:b/>
+              </w:rPr>
+              <w:t>Option</w:t>
+            </w:r>
+          </w:p>
+        </w:tc>
+        <w:tc>
+          <w:tcPr>
+            <w:tcW w:type="dxa" w:w="2880"/>
+          </w:tcPr>
+          <w:p>
+            <w:r>
+              <w:rPr>
+                <w:b/>
+              </w:rPr>
+              <w:t>Action</w:t>
+            </w:r>
+          </w:p>
+        </w:tc>
+        <w:tc>
+          <w:tcPr>
+            <w:tcW w:type="dxa" w:w="2880"/>
+          </w:tcPr>
+          <w:p>
+            <w:r>
+              <w:rPr>
+                <w:b/>
+              </w:rPr>
+              <w:t>Description</w:t>
+            </w:r>
+          </w:p>
+        </w:tc>
+      </w:tr>
+      <w:tr>
+        <w:tc>
+          <w:tcPr>
+            <w:tcW w:type="dxa" w:w="2880"/>
+          </w:tcPr>
+          <w:p>
+            <w:r>
+              <w:t>1</w:t>
+            </w:r>
+          </w:p>
+        </w:tc>
+        <w:tc>
+          <w:tcPr>
+            <w:tcW w:type="dxa" w:w="2880"/>
+          </w:tcPr>
+          <w:p>
+            <w:r>
+              <w:t>Run job on current file</w:t>
+            </w:r>
+          </w:p>
+        </w:tc>
+        <w:tc>
+          <w:tcPr>
+            <w:tcW w:type="dxa" w:w="2880"/>
+          </w:tcPr>
+          <w:p>
+            <w:r>
+              <w:t>Submits a Container Apps job for the file currently configured in the job definition. Streams status and saves logs locally.</w:t>
+            </w:r>
+          </w:p>
+        </w:tc>
+      </w:tr>
+      <w:tr>
+        <w:tc>
+          <w:tcPr>
+            <w:tcW w:type="dxa" w:w="2880"/>
+          </w:tcPr>
+          <w:p>
+            <w:r>
+              <w:t>2</w:t>
+            </w:r>
+          </w:p>
+        </w:tc>
+        <w:tc>
+          <w:tcPr>
+            <w:tcW w:type="dxa" w:w="2880"/>
+          </w:tcPr>
+          <w:p>
+            <w:r>
+              <w:t>Pick different file and run</w:t>
+            </w:r>
+          </w:p>
+        </w:tc>
+        <w:tc>
+          <w:tcPr>
+            <w:tcW w:type="dxa" w:w="2880"/>
+          </w:tcPr>
+          <w:p>
+            <w:r>
+              <w:t>Lists blobs in the pdfinput container, lets user enter a filename, updates the job, and runs it.</w:t>
+            </w:r>
+          </w:p>
+        </w:tc>
+      </w:tr>
+      <w:tr>
+        <w:tc>
+          <w:tcPr>
+            <w:tcW w:type="dxa" w:w="2880"/>
+          </w:tcPr>
+          <w:p>
+            <w:r>
+              <w:t>3</w:t>
+            </w:r>
+          </w:p>
+        </w:tc>
+        <w:tc>
+          <w:tcPr>
+            <w:tcW w:type="dxa" w:w="2880"/>
+          </w:tcPr>
+          <w:p>
+            <w:r>
+              <w:t>Check last run status</w:t>
+            </w:r>
+          </w:p>
+        </w:tc>
+        <w:tc>
+          <w:tcPr>
+            <w:tcW w:type="dxa" w:w="2880"/>
+          </w:tcPr>
+          <w:p>
+            <w:r>
+              <w:t>Shows the most recent execution name and its status (Succeeded / Failed / Running).</w:t>
+            </w:r>
+          </w:p>
+        </w:tc>
+      </w:tr>
+      <w:tr>
+        <w:tc>
+          <w:tcPr>
+            <w:tcW w:type="dxa" w:w="2880"/>
+          </w:tcPr>
+          <w:p>
+            <w:r>
+              <w:t>4</w:t>
+            </w:r>
+          </w:p>
+        </w:tc>
+        <w:tc>
+          <w:tcPr>
+            <w:tcW w:type="dxa" w:w="2880"/>
+          </w:tcPr>
+          <w:p>
+            <w:r>
+              <w:t>List output files in blob storage</w:t>
+            </w:r>
+          </w:p>
+        </w:tc>
+        <w:tc>
+          <w:tcPr>
+            <w:tcW w:type="dxa" w:w="2880"/>
+          </w:tcPr>
+          <w:p>
+            <w:r>
+              <w:t>Lists all files in the pdfoutput blob container.</w:t>
+            </w:r>
+          </w:p>
+        </w:tc>
+      </w:tr>
+      <w:tr>
+        <w:tc>
+          <w:tcPr>
+            <w:tcW w:type="dxa" w:w="2880"/>
+          </w:tcPr>
+          <w:p>
+            <w:r>
+              <w:t>5</w:t>
+            </w:r>
+          </w:p>
+        </w:tc>
+        <w:tc>
+          <w:tcPr>
+            <w:tcW w:type="dxa" w:w="2880"/>
+          </w:tcPr>
+          <w:p>
+            <w:r>
+              <w:t>Rebuild Docker image</w:t>
+            </w:r>
+          </w:p>
+        </w:tc>
+        <w:tc>
+          <w:tcPr>
+            <w:tcW w:type="dxa" w:w="2880"/>
+          </w:tcPr>
+          <w:p>
+            <w:r>
+              <w:t>Triggers az acr build to rebuild the container image in Azure Container Registry (~3-5 minutes).</w:t>
+            </w:r>
+          </w:p>
+        </w:tc>
+      </w:tr>
+      <w:tr>
+        <w:tc>
+          <w:tcPr>
+            <w:tcW w:type="dxa" w:w="2880"/>
+          </w:tcPr>
+          <w:p>
+            <w:r>
+              <w:t>6</w:t>
+            </w:r>
+          </w:p>
+        </w:tc>
+        <w:tc>
+          <w:tcPr>
+            <w:tcW w:type="dxa" w:w="2880"/>
+          </w:tcPr>
+          <w:p>
+            <w:r>
+              <w:t>View job logs</w:t>
+            </w:r>
+          </w:p>
+        </w:tc>
+        <w:tc>
+          <w:tcPr>
+            <w:tcW w:type="dxa" w:w="2880"/>
+          </w:tcPr>
+          <w:p>
+            <w:r>
+              <w:t>Streams the last 50 log lines from the most recent execution.</w:t>
+            </w:r>
+          </w:p>
+        </w:tc>
+      </w:tr>
+      <w:tr>
+        <w:tc>
+          <w:tcPr>
+            <w:tcW w:type="dxa" w:w="2880"/>
+          </w:tcPr>
+          <w:p>
+            <w:r>
+              <w:t>0</w:t>
+            </w:r>
+          </w:p>
+        </w:tc>
+        <w:tc>
+          <w:tcPr>
+            <w:tcW w:type="dxa" w:w="2880"/>
+          </w:tcPr>
+          <w:p>
+            <w:r>
+              <w:t>Exit</w:t>
+            </w:r>
+          </w:p>
+        </w:tc>
+        <w:tc>
+          <w:tcPr>
+            <w:tcW w:type="dxa" w:w="2880"/>
+          </w:tcPr>
+          <w:p>
+            <w:r>
+              <w:t>Exits the script.</w:t>
+            </w:r>
+          </w:p>
+        </w:tc>
+      </w:tr>
+    </w:tbl>
+    <w:p>
+      <w:pPr>
+        <w:pStyle w:val="Heading2"/>
+      </w:pPr>
+      <w:r>
+        <w:t>Non-Interactive (Command-Line) Usage</w:t>
+      </w:r>
+    </w:p>
+    <w:p>
+      <w:r>
+        <w:t>For scripted or automated runs, all options can be passed as flags:</w:t>
+      </w:r>
+    </w:p>
+    <w:tbl>
+      <w:tblPr>
+        <w:tblStyle w:val="TableGrid"/>
+        <w:tblW w:type="auto" w:w="0"/>
+        <w:tblLook w:firstColumn="1" w:firstRow="1" w:lastColumn="0" w:lastRow="0" w:noHBand="0" w:noVBand="1" w:val="04A0"/>
+      </w:tblPr>
+      <w:tblGrid>
+        <w:gridCol w:w="4320"/>
+        <w:gridCol w:w="4320"/>
+      </w:tblGrid>
+      <w:tr>
+        <w:tc>
+          <w:tcPr>
+            <w:tcW w:type="dxa" w:w="4320"/>
+          </w:tcPr>
+          <w:p>
+            <w:r>
+              <w:rPr>
+                <w:b/>
+              </w:rPr>
+              <w:t>Command</w:t>
+            </w:r>
+          </w:p>
+        </w:tc>
+        <w:tc>
+          <w:tcPr>
+            <w:tcW w:type="dxa" w:w="4320"/>
+          </w:tcPr>
+          <w:p>
+            <w:r>
+              <w:rPr>
+                <w:b/>
+              </w:rPr>
+              <w:t>Effect</w:t>
+            </w:r>
+          </w:p>
+        </w:tc>
+      </w:tr>
+      <w:tr>
+        <w:tc>
+          <w:tcPr>
+            <w:tcW w:type="dxa" w:w="4320"/>
+          </w:tcPr>
+          <w:p>
+            <w:r>
+              <w:t>.\run.ps1 -Mode local -File Sample-1.pdf</w:t>
+            </w:r>
+          </w:p>
+        </w:tc>
+        <w:tc>
+          <w:tcPr>
+            <w:tcW w:type="dxa" w:w="4320"/>
+          </w:tcPr>
+          <w:p>
+            <w:r>
+              <w:t>Split a single file without opt-in extraction</w:t>
+            </w:r>
+          </w:p>
+        </w:tc>
+      </w:tr>
+      <w:tr>
+        <w:tc>
+          <w:tcPr>
+            <w:tcW w:type="dxa" w:w="4320"/>
+          </w:tcPr>
+          <w:p>
+            <w:r>
+              <w:t>.\run.ps1 -Mode local -File Sample-1.pdf -OptIn</w:t>
+            </w:r>
+          </w:p>
+        </w:tc>
+        <w:tc>
+          <w:tcPr>
+            <w:tcW w:type="dxa" w:w="4320"/>
+          </w:tcPr>
+          <w:p>
+            <w:r>
+              <w:t>Split and extract opt-in data to Excel</w:t>
+            </w:r>
+          </w:p>
+        </w:tc>
+      </w:tr>
+      <w:tr>
+        <w:tc>
+          <w:tcPr>
+            <w:tcW w:type="dxa" w:w="4320"/>
+          </w:tcPr>
+          <w:p>
+            <w:r>
+              <w:t>.\run.ps1 -Mode azure</w:t>
+            </w:r>
+          </w:p>
+        </w:tc>
+        <w:tc>
+          <w:tcPr>
+            <w:tcW w:type="dxa" w:w="4320"/>
+          </w:tcPr>
+          <w:p>
+            <w:r>
+              <w:t>Enter Azure mode directly (skips mode selection menu)</w:t>
+            </w:r>
+          </w:p>
+        </w:tc>
+      </w:tr>
+      <w:tr>
+        <w:tc>
+          <w:tcPr>
+            <w:tcW w:type="dxa" w:w="4320"/>
+          </w:tcPr>
+          <w:p>
+            <w:r>
+              <w:t>.\run.ps1 -Help</w:t>
+            </w:r>
+          </w:p>
+        </w:tc>
+        <w:tc>
+          <w:tcPr>
+            <w:tcW w:type="dxa" w:w="4320"/>
+          </w:tcPr>
+          <w:p>
+            <w:r>
+              <w:t>Display full usage guide and exit</w:t>
+            </w:r>
+          </w:p>
+        </w:tc>
+      </w:tr>
+    </w:tbl>
+    <w:p>
+      <w:pPr>
+        <w:pStyle w:val="Heading2"/>
+      </w:pPr>
+      <w:r>
+        <w:t>Pattern Matching Examples (Local Mode, Option 3)</w:t>
+      </w:r>
+    </w:p>
+    <w:tbl>
+      <w:tblPr>
+        <w:tblStyle w:val="TableGrid"/>
+        <w:tblW w:type="auto" w:w="0"/>
+        <w:tblLook w:firstColumn="1" w:firstRow="1" w:lastColumn="0" w:lastRow="0" w:noHBand="0" w:noVBand="1" w:val="04A0"/>
+      </w:tblPr>
+      <w:tblGrid>
+        <w:gridCol w:w="4320"/>
+        <w:gridCol w:w="4320"/>
+      </w:tblGrid>
+      <w:tr>
+        <w:tc>
+          <w:tcPr>
+            <w:tcW w:type="dxa" w:w="4320"/>
+          </w:tcPr>
+          <w:p>
+            <w:r>
+              <w:rPr>
+                <w:b/>
+              </w:rPr>
+              <w:t>Pattern</w:t>
+            </w:r>
+          </w:p>
+        </w:tc>
+        <w:tc>
+          <w:tcPr>
+            <w:tcW w:type="dxa" w:w="4320"/>
+          </w:tcPr>
+          <w:p>
+            <w:r>
+              <w:rPr>
+                <w:b/>
+              </w:rPr>
+              <w:t>Matches</w:t>
+            </w:r>
+          </w:p>
+        </w:tc>
+      </w:tr>
+      <w:tr>
+        <w:tc>
+          <w:tcPr>
+            <w:tcW w:type="dxa" w:w="4320"/>
+          </w:tcPr>
+          <w:p>
+            <w:r>
+              <w:t>6*</w:t>
+            </w:r>
+          </w:p>
+        </w:tc>
+        <w:tc>
+          <w:tcPr>
+            <w:tcW w:type="dxa" w:w="4320"/>
+          </w:tcPr>
+          <w:p>
+            <w:r>
+              <w:t>All files starting with "6" (e.g. 600156961.pdf, 600157748.pdf)</w:t>
+            </w:r>
+          </w:p>
+        </w:tc>
+      </w:tr>
+      <w:tr>
+        <w:tc>
+          <w:tcPr>
+            <w:tcW w:type="dxa" w:w="4320"/>
+          </w:tcPr>
+          <w:p>
+            <w:r>
+              <w:t>Sample-*</w:t>
+            </w:r>
+          </w:p>
+        </w:tc>
+        <w:tc>
+          <w:tcPr>
+            <w:tcW w:type="dxa" w:w="4320"/>
+          </w:tcPr>
+          <w:p>
+            <w:r>
+              <w:t>All files starting with "Sample-" (e.g. Sample-1.pdf, Sample-2.pdf)</w:t>
+            </w:r>
+          </w:p>
+        </w:tc>
+      </w:tr>
+      <w:tr>
+        <w:tc>
+          <w:tcPr>
+            <w:tcW w:type="dxa" w:w="4320"/>
+          </w:tcPr>
+          <w:p>
+            <w:r>
+              <w:t>RouteOne*</w:t>
+            </w:r>
+          </w:p>
+        </w:tc>
+        <w:tc>
+          <w:tcPr>
+            <w:tcW w:type="dxa" w:w="4320"/>
+          </w:tcPr>
+          <w:p>
+            <w:r>
+              <w:t>All files starting with "RouteOne" (e.g. RouteOne.pdf)</w:t>
+            </w:r>
+          </w:p>
+        </w:tc>
+      </w:tr>
+      <w:tr>
+        <w:tc>
+          <w:tcPr>
+            <w:tcW w:type="dxa" w:w="4320"/>
+          </w:tcPr>
+          <w:p>
+            <w:r>
+              <w:t>*.pdf</w:t>
+            </w:r>
+          </w:p>
+        </w:tc>
+        <w:tc>
+          <w:tcPr>
+            <w:tcW w:type="dxa" w:w="4320"/>
+          </w:tcPr>
+          <w:p>
+            <w:r>
+              <w:t>All PDF files (equivalent to option 2: process all)</w:t>
+            </w:r>
+          </w:p>
+        </w:tc>
+      </w:tr>
+    </w:tbl>
+    <w:p>
+      <w:pPr>
+        <w:pStyle w:val="Heading2"/>
+      </w:pPr>
+      <w:r>
+        <w:t>Configuration (run-config.json)</w:t>
+      </w:r>
+    </w:p>
+    <w:p>
+      <w:r>
+        <w:t>Settings are saved to run-config.json in the repository root. This allows different machines or users to have different input/output paths without modifying the script. Select "Configure settings" (option 5 in Local mode) to change paths; they persist across sessions.</w:t>
+      </w:r>
+    </w:p>
+    <w:p>
+      <w:r>
+        <w:t>Example run-config.json:</w:t>
+      </w:r>
+    </w:p>
+    <w:p>
+      <w:pPr>
+        <w:ind w:left="576"/>
+      </w:pPr>
+      <w:r>
+        <w:rPr>
+          <w:rFonts w:ascii="Courier New" w:hAnsi="Courier New"/>
+          <w:color w:val="1F507D"/>
+          <w:sz w:val="18"/>
+        </w:rPr>
+        <w:t>{</w:t>
+        <w:br/>
+        <w:t xml:space="preserve">  "data_dir": "D:\\PDFs\\ToProcess",</w:t>
+        <w:br/>
+        <w:t xml:space="preserve">  "output_dir": "D:\\PDFs\\Results",</w:t>
+        <w:br/>
+        <w:t xml:space="preserve">  "log_dir": "D:\\PDFs\\Results\\job-logs",</w:t>
+        <w:br/>
+        <w:t xml:space="preserve">  "last_updated": "2026-05-12 14:30:00"</w:t>
+        <w:br/>
+        <w:t>}</w:t>
+      </w:r>
+    </w:p>
+    <w:p>
+      <w:pPr>
+        <w:pStyle w:val="Heading1"/>
+      </w:pPr>
+      <w:r>
+        <w:t>3. Code Architecture</w:t>
+      </w:r>
+    </w:p>
+    <w:p>
+      <w:pPr>
+        <w:pStyle w:val="Heading2"/>
+      </w:pPr>
+      <w:r>
+        <w:t>Splitting Pipeline  (image_splitter.py)</w:t>
+      </w:r>
+    </w:p>
+    <w:p>
+      <w:r>
+        <w:t>Every page passes through a unified analysis function regardless of content type:</w:t>
       </w:r>
     </w:p>
     <w:p>
@@ -57,7 +1282,7 @@
         <w:pStyle w:val="ListBullet"/>
       </w:pPr>
       <w:r>
-        <w:t>Controlled by `PDF_EXTRACTOR_OCR_ISOLATED=1`.</w:t>
+        <w:t>Digital text pages: text is analyzed directly for structural signals.</w:t>
       </w:r>
     </w:p>
     <w:p>
@@ -65,25 +1290,136 @@
         <w:pStyle w:val="ListBullet"/>
       </w:pPr>
       <w:r>
-        <w:t>Benefit: OCR memory is isolated from the main process and can be reclaimed by recycling workers.</w:t>
+        <w:t>Scanned image pages: First renders the page at 150 DPI, then PaddleOCR extracts text.</w:t>
+      </w:r>
+    </w:p>
+    <w:p>
+      <w:r>
+        <w:t>Each page produces a PageSignal with one of three classifications:</w:t>
       </w:r>
     </w:p>
     <w:p/>
+    <w:tbl>
+      <w:tblPr>
+        <w:tblStyle w:val="TableGrid"/>
+        <w:tblW w:type="auto" w:w="0"/>
+        <w:tblLook w:firstColumn="1" w:firstRow="1" w:lastColumn="0" w:lastRow="0" w:noHBand="0" w:noVBand="1" w:val="04A0"/>
+      </w:tblPr>
+      <w:tblGrid>
+        <w:gridCol w:w="4320"/>
+        <w:gridCol w:w="4320"/>
+      </w:tblGrid>
+      <w:tr>
+        <w:tc>
+          <w:tcPr>
+            <w:tcW w:type="dxa" w:w="4320"/>
+          </w:tcPr>
+          <w:p>
+            <w:r>
+              <w:rPr>
+                <w:b/>
+              </w:rPr>
+              <w:t>Classification</w:t>
+            </w:r>
+          </w:p>
+        </w:tc>
+        <w:tc>
+          <w:tcPr>
+            <w:tcW w:type="dxa" w:w="4320"/>
+          </w:tcPr>
+          <w:p>
+            <w:r>
+              <w:rPr>
+                <w:b/>
+              </w:rPr>
+              <w:t>Trigger</w:t>
+            </w:r>
+          </w:p>
+        </w:tc>
+      </w:tr>
+      <w:tr>
+        <w:tc>
+          <w:tcPr>
+            <w:tcW w:type="dxa" w:w="4320"/>
+          </w:tcPr>
+          <w:p>
+            <w:r>
+              <w:t>NEW_DOC</w:t>
+            </w:r>
+          </w:p>
+        </w:tc>
+        <w:tc>
+          <w:tcPr>
+            <w:tcW w:type="dxa" w:w="4320"/>
+          </w:tcPr>
+          <w:p>
+            <w:r>
+              <w:t>"Page 1 of N" footer, DOCUMENT N OF N marker, or a prominent ALL-CAPS title</w:t>
+            </w:r>
+          </w:p>
+        </w:tc>
+      </w:tr>
+      <w:tr>
+        <w:tc>
+          <w:tcPr>
+            <w:tcW w:type="dxa" w:w="4320"/>
+          </w:tcPr>
+          <w:p>
+            <w:r>
+              <w:t>CONTINUATION</w:t>
+            </w:r>
+          </w:p>
+        </w:tc>
+        <w:tc>
+          <w:tcPr>
+            <w:tcW w:type="dxa" w:w="4320"/>
+          </w:tcPr>
+          <w:p>
+            <w:r>
+              <w:t>"Page N of M" (N &gt; 1), or a page-total change between adjacent forms</w:t>
+            </w:r>
+          </w:p>
+        </w:tc>
+      </w:tr>
+      <w:tr>
+        <w:tc>
+          <w:tcPr>
+            <w:tcW w:type="dxa" w:w="4320"/>
+          </w:tcPr>
+          <w:p>
+            <w:r>
+              <w:t>AMBIGUOUS</w:t>
+            </w:r>
+          </w:p>
+        </w:tc>
+        <w:tc>
+          <w:tcPr>
+            <w:tcW w:type="dxa" w:w="4320"/>
+          </w:tcPr>
+          <w:p>
+            <w:r>
+              <w:t>No boundary detected — attached to the preceding document</w:t>
+            </w:r>
+          </w:p>
+        </w:tc>
+      </w:tr>
+    </w:tbl>
+    <w:p>
+      <w:r>
+        <w:t>The grouper collects consecutive pages into runs and writes one output PDF per run.</w:t>
+      </w:r>
+    </w:p>
     <w:p>
       <w:pPr>
-        <w:pStyle w:val="Heading3"/>
+        <w:pStyle w:val="Heading2"/>
       </w:pPr>
       <w:r>
-        <w:t>2) Worker recycling</w:t>
+        <w:t>Opt-In Extraction  (opt_in_extractor.py)</w:t>
       </w:r>
     </w:p>
-    <w:p/>
     <w:p>
-      <w:pPr>
-        <w:pStyle w:val="ListBullet"/>
-      </w:pPr>
       <w:r>
-        <w:t>Added configurable worker recycling via `PDF_EXTRACTOR_OCR_RECYCLE_CALLS`.</w:t>
+        <w:t>After splitting, any credit application PDF is processed by the opt-in extractor:</w:t>
       </w:r>
     </w:p>
     <w:p>
@@ -91,7 +1427,7 @@
         <w:pStyle w:val="ListBullet"/>
       </w:pPr>
       <w:r>
-        <w:t>Production profile uses `PDF_EXTRACTOR_OCR_RECYCLE_CALLS=6`.</w:t>
+        <w:t>Form detection: pattern-matches "RouteOne" or "DT \d" in the page text.</w:t>
       </w:r>
     </w:p>
     <w:p>
@@ -99,25 +1435,7 @@
         <w:pStyle w:val="ListBullet"/>
       </w:pPr>
       <w:r>
-        <w:t>Benefit: prevents unbounded memory growth during long runs.</w:t>
-      </w:r>
-    </w:p>
-    <w:p/>
-    <w:p>
-      <w:pPr>
-        <w:pStyle w:val="Heading3"/>
-      </w:pPr>
-      <w:r>
-        <w:t>3) Retry on OCR worker failure</w:t>
-      </w:r>
-    </w:p>
-    <w:p/>
-    <w:p>
-      <w:pPr>
-        <w:pStyle w:val="ListBullet"/>
-      </w:pPr>
-      <w:r>
-        <w:t>Added retry behavior for broken OCR process pools via `PDF_EXTRACTOR_OCR_POOL_RETRIES`.</w:t>
+        <w:t>RouteOne — text path: name and phones extracted via regex. Opt-in detected from presence of a date on the Optional Consent (second) signature line. If the first (mandatory) signature is handwritten (no extractable date), a vision fallback is triggered using a strict GPT-4o-mini prompt that inspects only the Optional Consent line.</w:t>
       </w:r>
     </w:p>
     <w:p>
@@ -125,7 +1443,7 @@
         <w:pStyle w:val="ListBullet"/>
       </w:pPr>
       <w:r>
-        <w:t>Production profile uses `PDF_EXTRACTOR_OCR_POOL_RETRIES=2`.</w:t>
+        <w:t>DealerTrack — text path: name and phones extracted via regex anchored to SSN pattern. Checkbox state requires vision (GPT-4o-mini).</w:t>
       </w:r>
     </w:p>
     <w:p>
@@ -133,25 +1451,1480 @@
         <w:pStyle w:val="ListBullet"/>
       </w:pPr>
       <w:r>
-        <w:t>Benefit: transient worker crashes or OOM events do not fail the entire job immediately.</w:t>
+        <w:t>Scanned pages (any form type): full page images sent to GPT-4o-mini with a form-specific structured JSON prompt.</w:t>
       </w:r>
     </w:p>
-    <w:p/>
+    <w:p>
+      <w:r>
+        <w:t>The JSON result schema per credit application:</w:t>
+      </w:r>
+    </w:p>
     <w:p>
       <w:pPr>
-        <w:pStyle w:val="Heading3"/>
+        <w:ind w:left="576"/>
       </w:pPr>
       <w:r>
-        <w:t>4) OCR render downscale cap</w:t>
+        <w:rPr>
+          <w:rFonts w:ascii="Courier New" w:hAnsi="Courier New"/>
+          <w:color w:val="1F507D"/>
+          <w:sz w:val="18"/>
+        </w:rPr>
+        <w:t>{</w:t>
+        <w:br/>
+        <w:t xml:space="preserve">  "form_type": "routeone" | "dealertrack" | "unknown",</w:t>
+        <w:br/>
+        <w:t xml:space="preserve">  "last_name": "&lt;string or null&gt;",</w:t>
+        <w:br/>
+        <w:t xml:space="preserve">  "first_name": "&lt;string or null&gt;",</w:t>
+        <w:br/>
+        <w:t xml:space="preserve">  "opt_in_status": "opted_in" | "opted_out" | "unclear" | "not_found",</w:t>
+        <w:br/>
+        <w:t xml:space="preserve">  "telemarketing_phones": ["&lt;phone&gt;", ...],</w:t>
+        <w:br/>
+        <w:t xml:space="preserve">  "confidence": "high" | "medium" | "low"</w:t>
+        <w:br/>
+        <w:t>}</w:t>
       </w:r>
     </w:p>
-    <w:p/>
     <w:p>
       <w:pPr>
-        <w:pStyle w:val="ListBullet"/>
+        <w:pStyle w:val="Heading1"/>
       </w:pPr>
       <w:r>
-        <w:t>Added configurable render width cap via `PDF_EXTRACTOR_OCR_MAX_WIDTH`.</w:t>
+        <w:t>4. Execution Flow (Azure Mode)</w:t>
+      </w:r>
+    </w:p>
+    <w:p>
+      <w:r>
+        <w:t>Manual trigger  (az containerapp job start)</w:t>
+        <w:br/>
+        <w:t xml:space="preserve"> |</w:t>
+        <w:br/>
+        <w:t xml:space="preserve"> +-- Download input PDF from Azure Blob Storage  (pdfinput container)</w:t>
+        <w:br/>
+        <w:t xml:space="preserve"> |</w:t>
+        <w:br/>
+        <w:t xml:space="preserve"> +-- Split PDF</w:t>
+        <w:br/>
+        <w:t xml:space="preserve"> |     +-- pypdf text extraction  (fast, digital pages)</w:t>
+        <w:br/>
+        <w:t xml:space="preserve"> |     +-- PaddleOCR              (slower, scanned pages)</w:t>
+        <w:br/>
+        <w:t xml:space="preserve"> |</w:t>
+        <w:br/>
+        <w:t xml:space="preserve"> +-- Upload split PDFs  -&gt;  pdfoutput/{source_filename}/ subfolder</w:t>
+        <w:br/>
+        <w:t xml:space="preserve"> |</w:t>
+        <w:br/>
+        <w:t xml:space="preserve"> +-- Extract opt-in data from each Credit_Application.pdf</w:t>
+        <w:br/>
+        <w:t xml:space="preserve"> |     +-- GPT-4o-mini vision calls  (Azure OpenAI)</w:t>
+        <w:br/>
+        <w:t xml:space="preserve"> |</w:t>
+        <w:br/>
+        <w:t xml:space="preserve"> +-- Container exits.  Billing stops.</w:t>
+      </w:r>
+    </w:p>
+    <w:p>
+      <w:r>
+        <w:t>Credentials (storage connection string, OpenAI API key) are stored as Container Apps secrets and injected as environment variables at runtime. The container image is built in Azure Container Registry (NaderContainerRegistry) and tagged :latest on each code push.</w:t>
+      </w:r>
+    </w:p>
+    <w:p>
+      <w:pPr>
+        <w:pStyle w:val="Heading1"/>
+      </w:pPr>
+      <w:r>
+        <w:t>5. Compute Configuration</w:t>
+      </w:r>
+    </w:p>
+    <w:tbl>
+      <w:tblPr>
+        <w:tblStyle w:val="TableGrid"/>
+        <w:tblW w:type="auto" w:w="0"/>
+        <w:tblLook w:firstColumn="1" w:firstRow="1" w:lastColumn="0" w:lastRow="0" w:noHBand="0" w:noVBand="1" w:val="04A0"/>
+      </w:tblPr>
+      <w:tblGrid>
+        <w:gridCol w:w="4320"/>
+        <w:gridCol w:w="4320"/>
+      </w:tblGrid>
+      <w:tr>
+        <w:tc>
+          <w:tcPr>
+            <w:tcW w:type="dxa" w:w="4320"/>
+          </w:tcPr>
+          <w:p>
+            <w:r>
+              <w:rPr>
+                <w:b/>
+              </w:rPr>
+              <w:t>Setting</w:t>
+            </w:r>
+          </w:p>
+        </w:tc>
+        <w:tc>
+          <w:tcPr>
+            <w:tcW w:type="dxa" w:w="4320"/>
+          </w:tcPr>
+          <w:p>
+            <w:r>
+              <w:rPr>
+                <w:b/>
+              </w:rPr>
+              <w:t>Value</w:t>
+            </w:r>
+          </w:p>
+        </w:tc>
+      </w:tr>
+      <w:tr>
+        <w:tc>
+          <w:tcPr>
+            <w:tcW w:type="dxa" w:w="4320"/>
+          </w:tcPr>
+          <w:p>
+            <w:r>
+              <w:t>Platform</w:t>
+            </w:r>
+          </w:p>
+        </w:tc>
+        <w:tc>
+          <w:tcPr>
+            <w:tcW w:type="dxa" w:w="4320"/>
+          </w:tcPr>
+          <w:p>
+            <w:r>
+              <w:t>Azure Container Apps Job</w:t>
+            </w:r>
+          </w:p>
+        </w:tc>
+      </w:tr>
+      <w:tr>
+        <w:tc>
+          <w:tcPr>
+            <w:tcW w:type="dxa" w:w="4320"/>
+          </w:tcPr>
+          <w:p>
+            <w:r>
+              <w:t>Workload Profile</w:t>
+            </w:r>
+          </w:p>
+        </w:tc>
+        <w:tc>
+          <w:tcPr>
+            <w:tcW w:type="dxa" w:w="4320"/>
+          </w:tcPr>
+          <w:p>
+            <w:r>
+              <w:t>Consumption (pay-per-use)</w:t>
+            </w:r>
+          </w:p>
+        </w:tc>
+      </w:tr>
+      <w:tr>
+        <w:tc>
+          <w:tcPr>
+            <w:tcW w:type="dxa" w:w="4320"/>
+          </w:tcPr>
+          <w:p>
+            <w:r>
+              <w:t>CPU</w:t>
+            </w:r>
+          </w:p>
+        </w:tc>
+        <w:tc>
+          <w:tcPr>
+            <w:tcW w:type="dxa" w:w="4320"/>
+          </w:tcPr>
+          <w:p>
+            <w:r>
+              <w:t>4.0 vCPU</w:t>
+            </w:r>
+          </w:p>
+        </w:tc>
+      </w:tr>
+      <w:tr>
+        <w:tc>
+          <w:tcPr>
+            <w:tcW w:type="dxa" w:w="4320"/>
+          </w:tcPr>
+          <w:p>
+            <w:r>
+              <w:t>Memory</w:t>
+            </w:r>
+          </w:p>
+        </w:tc>
+        <w:tc>
+          <w:tcPr>
+            <w:tcW w:type="dxa" w:w="4320"/>
+          </w:tcPr>
+          <w:p>
+            <w:r>
+              <w:t>8 GiB</w:t>
+            </w:r>
+          </w:p>
+        </w:tc>
+      </w:tr>
+      <w:tr>
+        <w:tc>
+          <w:tcPr>
+            <w:tcW w:type="dxa" w:w="4320"/>
+          </w:tcPr>
+          <w:p>
+            <w:r>
+              <w:t>Region</w:t>
+            </w:r>
+          </w:p>
+        </w:tc>
+        <w:tc>
+          <w:tcPr>
+            <w:tcW w:type="dxa" w:w="4320"/>
+          </w:tcPr>
+          <w:p>
+            <w:r>
+              <w:t>Central US</w:t>
+            </w:r>
+          </w:p>
+        </w:tc>
+      </w:tr>
+      <w:tr>
+        <w:tc>
+          <w:tcPr>
+            <w:tcW w:type="dxa" w:w="4320"/>
+          </w:tcPr>
+          <w:p>
+            <w:r>
+              <w:t>Trigger</w:t>
+            </w:r>
+          </w:p>
+        </w:tc>
+        <w:tc>
+          <w:tcPr>
+            <w:tcW w:type="dxa" w:w="4320"/>
+          </w:tcPr>
+          <w:p>
+            <w:r>
+              <w:t>Manual</w:t>
+            </w:r>
+          </w:p>
+        </w:tc>
+      </w:tr>
+      <w:tr>
+        <w:tc>
+          <w:tcPr>
+            <w:tcW w:type="dxa" w:w="4320"/>
+          </w:tcPr>
+          <w:p>
+            <w:r>
+              <w:t>Max runtime</w:t>
+            </w:r>
+          </w:p>
+        </w:tc>
+        <w:tc>
+          <w:tcPr>
+            <w:tcW w:type="dxa" w:w="4320"/>
+          </w:tcPr>
+          <w:p>
+            <w:r>
+              <w:t>2 hours (7,200-second timeout)</w:t>
+            </w:r>
+          </w:p>
+        </w:tc>
+      </w:tr>
+      <w:tr>
+        <w:tc>
+          <w:tcPr>
+            <w:tcW w:type="dxa" w:w="4320"/>
+          </w:tcPr>
+          <w:p>
+            <w:r>
+              <w:t>Parallelism</w:t>
+            </w:r>
+          </w:p>
+        </w:tc>
+        <w:tc>
+          <w:tcPr>
+            <w:tcW w:type="dxa" w:w="4320"/>
+          </w:tcPr>
+          <w:p>
+            <w:r>
+              <w:t>1 replica per run</w:t>
+            </w:r>
+          </w:p>
+        </w:tc>
+      </w:tr>
+      <w:tr>
+        <w:tc>
+          <w:tcPr>
+            <w:tcW w:type="dxa" w:w="4320"/>
+          </w:tcPr>
+          <w:p>
+            <w:r>
+              <w:t>AI model</w:t>
+            </w:r>
+          </w:p>
+        </w:tc>
+        <w:tc>
+          <w:tcPr>
+            <w:tcW w:type="dxa" w:w="4320"/>
+          </w:tcPr>
+          <w:p>
+            <w:r>
+              <w:t>GPT-4o-mini (Azure OpenAI)</w:t>
+            </w:r>
+          </w:p>
+        </w:tc>
+      </w:tr>
+    </w:tbl>
+    <w:p>
+      <w:pPr>
+        <w:pStyle w:val="Heading1"/>
+      </w:pPr>
+      <w:r>
+        <w:t>6. Cost Estimate</w:t>
+      </w:r>
+    </w:p>
+    <w:p>
+      <w:pPr>
+        <w:pStyle w:val="Heading2"/>
+      </w:pPr>
+      <w:r>
+        <w:t>Per-run billing  (Consumption plan, Central US)</w:t>
+      </w:r>
+    </w:p>
+    <w:p>
+      <w:r>
+        <w:t>Billing stops the moment the container exits. There is no idle charge.</w:t>
+      </w:r>
+    </w:p>
+    <w:tbl>
+      <w:tblPr>
+        <w:tblStyle w:val="TableGrid"/>
+        <w:tblW w:type="auto" w:w="0"/>
+        <w:tblLook w:firstColumn="1" w:firstRow="1" w:lastColumn="0" w:lastRow="0" w:noHBand="0" w:noVBand="1" w:val="04A0"/>
+      </w:tblPr>
+      <w:tblGrid>
+        <w:gridCol w:w="2880"/>
+        <w:gridCol w:w="2880"/>
+        <w:gridCol w:w="2880"/>
+      </w:tblGrid>
+      <w:tr>
+        <w:tc>
+          <w:tcPr>
+            <w:tcW w:type="dxa" w:w="2880"/>
+          </w:tcPr>
+          <w:p>
+            <w:r>
+              <w:rPr>
+                <w:b/>
+              </w:rPr>
+              <w:t>Resource</w:t>
+            </w:r>
+          </w:p>
+        </w:tc>
+        <w:tc>
+          <w:tcPr>
+            <w:tcW w:type="dxa" w:w="2880"/>
+          </w:tcPr>
+          <w:p>
+            <w:r>
+              <w:rPr>
+                <w:b/>
+              </w:rPr>
+              <w:t>Rate</w:t>
+            </w:r>
+          </w:p>
+        </w:tc>
+        <w:tc>
+          <w:tcPr>
+            <w:tcW w:type="dxa" w:w="2880"/>
+          </w:tcPr>
+          <w:p>
+            <w:r>
+              <w:rPr>
+                <w:b/>
+              </w:rPr>
+              <w:t>Per active hour at full allocation</w:t>
+            </w:r>
+          </w:p>
+        </w:tc>
+      </w:tr>
+      <w:tr>
+        <w:tc>
+          <w:tcPr>
+            <w:tcW w:type="dxa" w:w="2880"/>
+          </w:tcPr>
+          <w:p>
+            <w:r>
+              <w:t>vCPU</w:t>
+            </w:r>
+          </w:p>
+        </w:tc>
+        <w:tc>
+          <w:tcPr>
+            <w:tcW w:type="dxa" w:w="2880"/>
+          </w:tcPr>
+          <w:p>
+            <w:r>
+              <w:t>$0.000024 / vCPU-second</w:t>
+            </w:r>
+          </w:p>
+        </w:tc>
+        <w:tc>
+          <w:tcPr>
+            <w:tcW w:type="dxa" w:w="2880"/>
+          </w:tcPr>
+          <w:p>
+            <w:r>
+              <w:t>4 x 3,600 x $0.000024 = $0.35</w:t>
+            </w:r>
+          </w:p>
+        </w:tc>
+      </w:tr>
+      <w:tr>
+        <w:tc>
+          <w:tcPr>
+            <w:tcW w:type="dxa" w:w="2880"/>
+          </w:tcPr>
+          <w:p>
+            <w:r>
+              <w:t>Memory</w:t>
+            </w:r>
+          </w:p>
+        </w:tc>
+        <w:tc>
+          <w:tcPr>
+            <w:tcW w:type="dxa" w:w="2880"/>
+          </w:tcPr>
+          <w:p>
+            <w:r>
+              <w:t>$0.000003 / GiB-second</w:t>
+            </w:r>
+          </w:p>
+        </w:tc>
+        <w:tc>
+          <w:tcPr>
+            <w:tcW w:type="dxa" w:w="2880"/>
+          </w:tcPr>
+          <w:p>
+            <w:r>
+              <w:t>8 x 3,600 x $0.000003 = $0.09</w:t>
+            </w:r>
+          </w:p>
+        </w:tc>
+      </w:tr>
+      <w:tr>
+        <w:tc>
+          <w:tcPr>
+            <w:tcW w:type="dxa" w:w="2880"/>
+          </w:tcPr>
+          <w:p>
+            <w:r>
+              <w:t>Total</w:t>
+            </w:r>
+          </w:p>
+        </w:tc>
+        <w:tc>
+          <w:tcPr>
+            <w:tcW w:type="dxa" w:w="2880"/>
+          </w:tcPr>
+          <w:p>
+            <w:r/>
+          </w:p>
+        </w:tc>
+        <w:tc>
+          <w:tcPr>
+            <w:tcW w:type="dxa" w:w="2880"/>
+          </w:tcPr>
+          <w:p>
+            <w:r>
+              <w:t>~$0.44 / active hour</w:t>
+            </w:r>
+          </w:p>
+        </w:tc>
+      </w:tr>
+    </w:tbl>
+    <w:p>
+      <w:pPr>
+        <w:pStyle w:val="Heading2"/>
+      </w:pPr>
+      <w:r>
+        <w:t>Per-million-document estimate  (current hardware: Consumption 4 vCPU / 8 GiB)</w:t>
+      </w:r>
+    </w:p>
+    <w:p>
+      <w:r>
+        <w:t>A representative 220-page scanned batch (73 output documents) processes in approximately 1 hour. PaddleOCR is the bottleneck; it runs single-threaded on each page image.</w:t>
+      </w:r>
+    </w:p>
+    <w:tbl>
+      <w:tblPr>
+        <w:tblStyle w:val="TableGrid"/>
+        <w:tblW w:type="auto" w:w="0"/>
+        <w:tblLook w:firstColumn="1" w:firstRow="1" w:lastColumn="0" w:lastRow="0" w:noHBand="0" w:noVBand="1" w:val="04A0"/>
+      </w:tblPr>
+      <w:tblGrid>
+        <w:gridCol w:w="4320"/>
+        <w:gridCol w:w="4320"/>
+      </w:tblGrid>
+      <w:tr>
+        <w:tc>
+          <w:tcPr>
+            <w:tcW w:type="dxa" w:w="4320"/>
+          </w:tcPr>
+          <w:p>
+            <w:r>
+              <w:rPr>
+                <w:b/>
+              </w:rPr>
+              <w:t>Metric</w:t>
+            </w:r>
+          </w:p>
+        </w:tc>
+        <w:tc>
+          <w:tcPr>
+            <w:tcW w:type="dxa" w:w="4320"/>
+          </w:tcPr>
+          <w:p>
+            <w:r>
+              <w:rPr>
+                <w:b/>
+              </w:rPr>
+              <w:t>Value</w:t>
+            </w:r>
+          </w:p>
+        </w:tc>
+      </w:tr>
+      <w:tr>
+        <w:tc>
+          <w:tcPr>
+            <w:tcW w:type="dxa" w:w="4320"/>
+          </w:tcPr>
+          <w:p>
+            <w:r>
+              <w:t>Output documents per hour</w:t>
+            </w:r>
+          </w:p>
+        </w:tc>
+        <w:tc>
+          <w:tcPr>
+            <w:tcW w:type="dxa" w:w="4320"/>
+          </w:tcPr>
+          <w:p>
+            <w:r>
+              <w:t>~73</w:t>
+            </w:r>
+          </w:p>
+        </w:tc>
+      </w:tr>
+      <w:tr>
+        <w:tc>
+          <w:tcPr>
+            <w:tcW w:type="dxa" w:w="4320"/>
+          </w:tcPr>
+          <w:p>
+            <w:r>
+              <w:t>Compute cost per output document</w:t>
+            </w:r>
+          </w:p>
+        </w:tc>
+        <w:tc>
+          <w:tcPr>
+            <w:tcW w:type="dxa" w:w="4320"/>
+          </w:tcPr>
+          <w:p>
+            <w:r>
+              <w:t>~$0.006</w:t>
+            </w:r>
+          </w:p>
+        </w:tc>
+      </w:tr>
+      <w:tr>
+        <w:tc>
+          <w:tcPr>
+            <w:tcW w:type="dxa" w:w="4320"/>
+          </w:tcPr>
+          <w:p>
+            <w:r>
+              <w:t>GPT-4o-mini per credit app (~1.5% of documents)</w:t>
+            </w:r>
+          </w:p>
+        </w:tc>
+        <w:tc>
+          <w:tcPr>
+            <w:tcW w:type="dxa" w:w="4320"/>
+          </w:tcPr>
+          <w:p>
+            <w:r>
+              <w:t>~$0.0003</w:t>
+            </w:r>
+          </w:p>
+        </w:tc>
+      </w:tr>
+      <w:tr>
+        <w:tc>
+          <w:tcPr>
+            <w:tcW w:type="dxa" w:w="4320"/>
+          </w:tcPr>
+          <w:p>
+            <w:r>
+              <w:t>Estimated total per 1 million output documents</w:t>
+            </w:r>
+          </w:p>
+        </w:tc>
+        <w:tc>
+          <w:tcPr>
+            <w:tcW w:type="dxa" w:w="4320"/>
+          </w:tcPr>
+          <w:p>
+            <w:r>
+              <w:t>~$6,500 – $7,000</w:t>
+            </w:r>
+          </w:p>
+        </w:tc>
+      </w:tr>
+    </w:tbl>
+    <w:p>
+      <w:r>
+        <w:t>AI token costs are negligible (less than $5 per million documents). The dominant cost is CPU time for OCR.</w:t>
+      </w:r>
+    </w:p>
+    <w:p>
+      <w:pPr>
+        <w:pStyle w:val="Heading1"/>
+      </w:pPr>
+      <w:r>
+        <w:t>7. Current Hardware Limitations and Upgrade Path</w:t>
+      </w:r>
+    </w:p>
+    <w:p>
+      <w:pPr>
+        <w:pStyle w:val="Heading2"/>
+      </w:pPr>
+      <w:r>
+        <w:t>The file-size constraint</w:t>
+      </w:r>
+    </w:p>
+    <w:p>
+      <w:r>
+        <w:t>The current Consumption plan allocates a fixed 8 GiB of RAM per execution. PaddleOCR loads its neural network models at startup (~2-3 GB), and PyMuPDF buffers rendered page images in memory during processing. For large or dense PDF files — particularly those with many high-resolution scanned pages — the container can exhaust available memory mid-run, causing the job to fail before all pages are processed.</w:t>
+      </w:r>
+    </w:p>
+    <w:p>
+      <w:r>
+        <w:t>The Consumption plan's 8 GiB ceiling cannot be raised without moving to a Dedicated workload profile. If you need to process larger files reliably, upgrading to a Dedicated D2 or D4 profile is required.</w:t>
+      </w:r>
+    </w:p>
+    <w:p>
+      <w:pPr>
+        <w:pStyle w:val="Heading2"/>
+      </w:pPr>
+      <w:r>
+        <w:t>Dedicated Workload Profile Options</w:t>
+      </w:r>
+    </w:p>
+    <w:p>
+      <w:r>
+        <w:t>Dedicated profiles allocate reserved compute continuously, regardless of whether a job is running. This eliminates the memory ceiling but changes the billing model from pay-per-second to always-on hourly.</w:t>
+      </w:r>
+    </w:p>
+    <w:tbl>
+      <w:tblPr>
+        <w:tblStyle w:val="TableGrid"/>
+        <w:tblW w:type="auto" w:w="0"/>
+        <w:tblLook w:firstColumn="1" w:firstRow="1" w:lastColumn="0" w:lastRow="0" w:noHBand="0" w:noVBand="1" w:val="04A0"/>
+      </w:tblPr>
+      <w:tblGrid>
+        <w:gridCol w:w="1234"/>
+        <w:gridCol w:w="1234"/>
+        <w:gridCol w:w="1234"/>
+        <w:gridCol w:w="1234"/>
+        <w:gridCol w:w="1234"/>
+        <w:gridCol w:w="1234"/>
+        <w:gridCol w:w="1234"/>
+      </w:tblGrid>
+      <w:tr>
+        <w:tc>
+          <w:tcPr>
+            <w:tcW w:type="dxa" w:w="1234"/>
+          </w:tcPr>
+          <w:p>
+            <w:r>
+              <w:rPr>
+                <w:b/>
+              </w:rPr>
+              <w:t>Plan</w:t>
+            </w:r>
+          </w:p>
+        </w:tc>
+        <w:tc>
+          <w:tcPr>
+            <w:tcW w:type="dxa" w:w="1234"/>
+          </w:tcPr>
+          <w:p>
+            <w:r>
+              <w:rPr>
+                <w:b/>
+              </w:rPr>
+              <w:t>vCPU</w:t>
+            </w:r>
+          </w:p>
+        </w:tc>
+        <w:tc>
+          <w:tcPr>
+            <w:tcW w:type="dxa" w:w="1234"/>
+          </w:tcPr>
+          <w:p>
+            <w:r>
+              <w:rPr>
+                <w:b/>
+              </w:rPr>
+              <w:t>RAM</w:t>
+            </w:r>
+          </w:p>
+        </w:tc>
+        <w:tc>
+          <w:tcPr>
+            <w:tcW w:type="dxa" w:w="1234"/>
+          </w:tcPr>
+          <w:p>
+            <w:r>
+              <w:rPr>
+                <w:b/>
+              </w:rPr>
+              <w:t>Max file size suitability</w:t>
+            </w:r>
+          </w:p>
+        </w:tc>
+        <w:tc>
+          <w:tcPr>
+            <w:tcW w:type="dxa" w:w="1234"/>
+          </w:tcPr>
+          <w:p>
+            <w:r>
+              <w:rPr>
+                <w:b/>
+              </w:rPr>
+              <w:t>Always-on rate (est.)</w:t>
+            </w:r>
+          </w:p>
+        </w:tc>
+        <w:tc>
+          <w:tcPr>
+            <w:tcW w:type="dxa" w:w="1234"/>
+          </w:tcPr>
+          <w:p>
+            <w:r>
+              <w:rPr>
+                <w:b/>
+              </w:rPr>
+              <w:t>Daily cost</w:t>
+              <w:br/>
+              <w:t>(24 hrs)</w:t>
+            </w:r>
+          </w:p>
+        </w:tc>
+        <w:tc>
+          <w:tcPr>
+            <w:tcW w:type="dxa" w:w="1234"/>
+          </w:tcPr>
+          <w:p>
+            <w:r>
+              <w:rPr>
+                <w:b/>
+              </w:rPr>
+              <w:t>Daily cost</w:t>
+              <w:br/>
+              <w:t>(2 hrs active)</w:t>
+            </w:r>
+          </w:p>
+        </w:tc>
+      </w:tr>
+      <w:tr>
+        <w:tc>
+          <w:tcPr>
+            <w:tcW w:type="dxa" w:w="1234"/>
+          </w:tcPr>
+          <w:p>
+            <w:r>
+              <w:t>Consumption (current)</w:t>
+            </w:r>
+          </w:p>
+        </w:tc>
+        <w:tc>
+          <w:tcPr>
+            <w:tcW w:type="dxa" w:w="1234"/>
+          </w:tcPr>
+          <w:p>
+            <w:r>
+              <w:t>4</w:t>
+            </w:r>
+          </w:p>
+        </w:tc>
+        <w:tc>
+          <w:tcPr>
+            <w:tcW w:type="dxa" w:w="1234"/>
+          </w:tcPr>
+          <w:p>
+            <w:r>
+              <w:t>8 GiB</w:t>
+            </w:r>
+          </w:p>
+        </w:tc>
+        <w:tc>
+          <w:tcPr>
+            <w:tcW w:type="dxa" w:w="1234"/>
+          </w:tcPr>
+          <w:p>
+            <w:r>
+              <w:t>Small-medium files (~50-100 pages)</w:t>
+            </w:r>
+          </w:p>
+        </w:tc>
+        <w:tc>
+          <w:tcPr>
+            <w:tcW w:type="dxa" w:w="1234"/>
+          </w:tcPr>
+          <w:p>
+            <w:r>
+              <w:t>$0.44 / active hr</w:t>
+            </w:r>
+          </w:p>
+        </w:tc>
+        <w:tc>
+          <w:tcPr>
+            <w:tcW w:type="dxa" w:w="1234"/>
+          </w:tcPr>
+          <w:p>
+            <w:r>
+              <w:t>N/A (pay-per-use)</w:t>
+            </w:r>
+          </w:p>
+        </w:tc>
+        <w:tc>
+          <w:tcPr>
+            <w:tcW w:type="dxa" w:w="1234"/>
+          </w:tcPr>
+          <w:p>
+            <w:r>
+              <w:t>~$0.88</w:t>
+            </w:r>
+          </w:p>
+        </w:tc>
+      </w:tr>
+      <w:tr>
+        <w:tc>
+          <w:tcPr>
+            <w:tcW w:type="dxa" w:w="1234"/>
+          </w:tcPr>
+          <w:p>
+            <w:r>
+              <w:t>Dedicated D2</w:t>
+            </w:r>
+          </w:p>
+        </w:tc>
+        <w:tc>
+          <w:tcPr>
+            <w:tcW w:type="dxa" w:w="1234"/>
+          </w:tcPr>
+          <w:p>
+            <w:r>
+              <w:t>2</w:t>
+            </w:r>
+          </w:p>
+        </w:tc>
+        <w:tc>
+          <w:tcPr>
+            <w:tcW w:type="dxa" w:w="1234"/>
+          </w:tcPr>
+          <w:p>
+            <w:r>
+              <w:t>8 GiB</w:t>
+            </w:r>
+          </w:p>
+        </w:tc>
+        <w:tc>
+          <w:tcPr>
+            <w:tcW w:type="dxa" w:w="1234"/>
+          </w:tcPr>
+          <w:p>
+            <w:r>
+              <w:t>Similar to Consumption but reserved</w:t>
+            </w:r>
+          </w:p>
+        </w:tc>
+        <w:tc>
+          <w:tcPr>
+            <w:tcW w:type="dxa" w:w="1234"/>
+          </w:tcPr>
+          <w:p>
+            <w:r>
+              <w:t>~$0.28 / hr</w:t>
+            </w:r>
+          </w:p>
+        </w:tc>
+        <w:tc>
+          <w:tcPr>
+            <w:tcW w:type="dxa" w:w="1234"/>
+          </w:tcPr>
+          <w:p>
+            <w:r>
+              <w:t>~$6.72</w:t>
+            </w:r>
+          </w:p>
+        </w:tc>
+        <w:tc>
+          <w:tcPr>
+            <w:tcW w:type="dxa" w:w="1234"/>
+          </w:tcPr>
+          <w:p>
+            <w:r>
+              <w:t>~$0.56</w:t>
+            </w:r>
+          </w:p>
+        </w:tc>
+      </w:tr>
+      <w:tr>
+        <w:tc>
+          <w:tcPr>
+            <w:tcW w:type="dxa" w:w="1234"/>
+          </w:tcPr>
+          <w:p>
+            <w:r>
+              <w:t>Dedicated D4</w:t>
+            </w:r>
+          </w:p>
+        </w:tc>
+        <w:tc>
+          <w:tcPr>
+            <w:tcW w:type="dxa" w:w="1234"/>
+          </w:tcPr>
+          <w:p>
+            <w:r>
+              <w:t>4</w:t>
+            </w:r>
+          </w:p>
+        </w:tc>
+        <w:tc>
+          <w:tcPr>
+            <w:tcW w:type="dxa" w:w="1234"/>
+          </w:tcPr>
+          <w:p>
+            <w:r>
+              <w:t>16 GiB</w:t>
+            </w:r>
+          </w:p>
+        </w:tc>
+        <w:tc>
+          <w:tcPr>
+            <w:tcW w:type="dxa" w:w="1234"/>
+          </w:tcPr>
+          <w:p>
+            <w:r>
+              <w:t>Medium-large files (~200-400 pages)</w:t>
+            </w:r>
+          </w:p>
+        </w:tc>
+        <w:tc>
+          <w:tcPr>
+            <w:tcW w:type="dxa" w:w="1234"/>
+          </w:tcPr>
+          <w:p>
+            <w:r>
+              <w:t>~$0.55 / hr</w:t>
+            </w:r>
+          </w:p>
+        </w:tc>
+        <w:tc>
+          <w:tcPr>
+            <w:tcW w:type="dxa" w:w="1234"/>
+          </w:tcPr>
+          <w:p>
+            <w:r>
+              <w:t>~$13.20</w:t>
+            </w:r>
+          </w:p>
+        </w:tc>
+        <w:tc>
+          <w:tcPr>
+            <w:tcW w:type="dxa" w:w="1234"/>
+          </w:tcPr>
+          <w:p>
+            <w:r>
+              <w:t>~$1.10</w:t>
+            </w:r>
+          </w:p>
+        </w:tc>
+      </w:tr>
+      <w:tr>
+        <w:tc>
+          <w:tcPr>
+            <w:tcW w:type="dxa" w:w="1234"/>
+          </w:tcPr>
+          <w:p>
+            <w:r>
+              <w:t>Dedicated D8</w:t>
+            </w:r>
+          </w:p>
+        </w:tc>
+        <w:tc>
+          <w:tcPr>
+            <w:tcW w:type="dxa" w:w="1234"/>
+          </w:tcPr>
+          <w:p>
+            <w:r>
+              <w:t>8</w:t>
+            </w:r>
+          </w:p>
+        </w:tc>
+        <w:tc>
+          <w:tcPr>
+            <w:tcW w:type="dxa" w:w="1234"/>
+          </w:tcPr>
+          <w:p>
+            <w:r>
+              <w:t>32 GiB</w:t>
+            </w:r>
+          </w:p>
+        </w:tc>
+        <w:tc>
+          <w:tcPr>
+            <w:tcW w:type="dxa" w:w="1234"/>
+          </w:tcPr>
+          <w:p>
+            <w:r>
+              <w:t>Large files (400+ pages)</w:t>
+            </w:r>
+          </w:p>
+        </w:tc>
+        <w:tc>
+          <w:tcPr>
+            <w:tcW w:type="dxa" w:w="1234"/>
+          </w:tcPr>
+          <w:p>
+            <w:r>
+              <w:t>~$1.10 / hr</w:t>
+            </w:r>
+          </w:p>
+        </w:tc>
+        <w:tc>
+          <w:tcPr>
+            <w:tcW w:type="dxa" w:w="1234"/>
+          </w:tcPr>
+          <w:p>
+            <w:r>
+              <w:t>~$26.40</w:t>
+            </w:r>
+          </w:p>
+        </w:tc>
+        <w:tc>
+          <w:tcPr>
+            <w:tcW w:type="dxa" w:w="1234"/>
+          </w:tcPr>
+          <w:p>
+            <w:r>
+              <w:t>~$2.20</w:t>
+            </w:r>
+          </w:p>
+        </w:tc>
+      </w:tr>
+      <w:tr>
+        <w:tc>
+          <w:tcPr>
+            <w:tcW w:type="dxa" w:w="1234"/>
+          </w:tcPr>
+          <w:p>
+            <w:r>
+              <w:t>Dedicated D16</w:t>
+            </w:r>
+          </w:p>
+        </w:tc>
+        <w:tc>
+          <w:tcPr>
+            <w:tcW w:type="dxa" w:w="1234"/>
+          </w:tcPr>
+          <w:p>
+            <w:r>
+              <w:t>16</w:t>
+            </w:r>
+          </w:p>
+        </w:tc>
+        <w:tc>
+          <w:tcPr>
+            <w:tcW w:type="dxa" w:w="1234"/>
+          </w:tcPr>
+          <w:p>
+            <w:r>
+              <w:t>64 GiB</w:t>
+            </w:r>
+          </w:p>
+        </w:tc>
+        <w:tc>
+          <w:tcPr>
+            <w:tcW w:type="dxa" w:w="1234"/>
+          </w:tcPr>
+          <w:p>
+            <w:r>
+              <w:t>Very large or batch-heavy workloads</w:t>
+            </w:r>
+          </w:p>
+        </w:tc>
+        <w:tc>
+          <w:tcPr>
+            <w:tcW w:type="dxa" w:w="1234"/>
+          </w:tcPr>
+          <w:p>
+            <w:r>
+              <w:t>~$2.20 / hr</w:t>
+            </w:r>
+          </w:p>
+        </w:tc>
+        <w:tc>
+          <w:tcPr>
+            <w:tcW w:type="dxa" w:w="1234"/>
+          </w:tcPr>
+          <w:p>
+            <w:r>
+              <w:t>~$52.80</w:t>
+            </w:r>
+          </w:p>
+        </w:tc>
+        <w:tc>
+          <w:tcPr>
+            <w:tcW w:type="dxa" w:w="1234"/>
+          </w:tcPr>
+          <w:p>
+            <w:r>
+              <w:t>~$4.40</w:t>
+            </w:r>
+          </w:p>
+        </w:tc>
+      </w:tr>
+    </w:tbl>
+    <w:p>
+      <w:r>
+        <w:t>Note: D2 offers the same 8 GiB as Consumption but as a reserved allocation — meaning memory is guaranteed even under peak load and will not be preempted. It also allows future scaling without a plan migration. For files consistently exceeding the current failure threshold, D4 (16 GiB) is the recommended minimum upgrade.</w:t>
+      </w:r>
+    </w:p>
+    <w:p>
+      <w:pPr>
+        <w:pStyle w:val="Heading2"/>
+      </w:pPr>
+      <w:r>
+        <w:t>Cost Comparison: 1 Million Output Documents Across Hardware Tiers</w:t>
+      </w:r>
+    </w:p>
+    <w:p>
+      <w:r>
+        <w:t>The table below estimates total cost to produce 1 million split output documents, based on the throughput rate of ~73 documents/hour. Dedicated plans are costed assuming 2 active job hours per day (the rest of the day the environment is idle but still billed).</w:t>
+      </w:r>
+    </w:p>
+    <w:tbl>
+      <w:tblPr>
+        <w:tblStyle w:val="TableGrid"/>
+        <w:tblW w:type="auto" w:w="0"/>
+        <w:tblLook w:firstColumn="1" w:firstRow="1" w:lastColumn="0" w:lastRow="0" w:noHBand="0" w:noVBand="1" w:val="04A0"/>
+      </w:tblPr>
+      <w:tblGrid>
+        <w:gridCol w:w="1440"/>
+        <w:gridCol w:w="1440"/>
+        <w:gridCol w:w="1440"/>
+        <w:gridCol w:w="1440"/>
+        <w:gridCol w:w="1440"/>
+        <w:gridCol w:w="1440"/>
+      </w:tblGrid>
+      <w:tr>
+        <w:tc>
+          <w:tcPr>
+            <w:tcW w:type="dxa" w:w="1440"/>
+          </w:tcPr>
+          <w:p>
+            <w:r>
+              <w:rPr>
+                <w:b/>
+              </w:rPr>
+              <w:t>Plan</w:t>
+            </w:r>
+          </w:p>
+        </w:tc>
+        <w:tc>
+          <w:tcPr>
+            <w:tcW w:type="dxa" w:w="1440"/>
+          </w:tcPr>
+          <w:p>
+            <w:r>
+              <w:rPr>
+                <w:b/>
+              </w:rPr>
+              <w:t>Hours to process</w:t>
+              <w:br/>
+              <w:t>1M documents</w:t>
+            </w:r>
+          </w:p>
+        </w:tc>
+        <w:tc>
+          <w:tcPr>
+            <w:tcW w:type="dxa" w:w="1440"/>
+          </w:tcPr>
+          <w:p>
+            <w:r>
+              <w:rPr>
+                <w:b/>
+              </w:rPr>
+              <w:t>Days</w:t>
+              <w:br/>
+              <w:t>(2 hrs/day)</w:t>
+            </w:r>
+          </w:p>
+        </w:tc>
+        <w:tc>
+          <w:tcPr>
+            <w:tcW w:type="dxa" w:w="1440"/>
+          </w:tcPr>
+          <w:p>
+            <w:r>
+              <w:rPr>
+                <w:b/>
+              </w:rPr>
+              <w:t>Compute cost</w:t>
+              <w:br/>
+              <w:t>(active hours)</w:t>
+            </w:r>
+          </w:p>
+        </w:tc>
+        <w:tc>
+          <w:tcPr>
+            <w:tcW w:type="dxa" w:w="1440"/>
+          </w:tcPr>
+          <w:p>
+            <w:r>
+              <w:rPr>
+                <w:b/>
+              </w:rPr>
+              <w:t>Idle cost</w:t>
+              <w:br/>
+              <w:t>(22 hrs/day × days)</w:t>
+            </w:r>
+          </w:p>
+        </w:tc>
+        <w:tc>
+          <w:tcPr>
+            <w:tcW w:type="dxa" w:w="1440"/>
+          </w:tcPr>
+          <w:p>
+            <w:r>
+              <w:rPr>
+                <w:b/>
+              </w:rPr>
+              <w:t>Total estimated</w:t>
+              <w:br/>
+              <w:t>cost (1M docs)</w:t>
+            </w:r>
+          </w:p>
+        </w:tc>
+      </w:tr>
+      <w:tr>
+        <w:tc>
+          <w:tcPr>
+            <w:tcW w:type="dxa" w:w="1440"/>
+          </w:tcPr>
+          <w:p>
+            <w:r>
+              <w:t>Consumption (current)</w:t>
+            </w:r>
+          </w:p>
+        </w:tc>
+        <w:tc>
+          <w:tcPr>
+            <w:tcW w:type="dxa" w:w="1440"/>
+          </w:tcPr>
+          <w:p>
+            <w:r>
+              <w:t>~13,700 hrs</w:t>
+            </w:r>
+          </w:p>
+        </w:tc>
+        <w:tc>
+          <w:tcPr>
+            <w:tcW w:type="dxa" w:w="1440"/>
+          </w:tcPr>
+          <w:p>
+            <w:r>
+              <w:t>~6,850 days</w:t>
+            </w:r>
+          </w:p>
+        </w:tc>
+        <w:tc>
+          <w:tcPr>
+            <w:tcW w:type="dxa" w:w="1440"/>
+          </w:tcPr>
+          <w:p>
+            <w:r>
+              <w:t>~$6,028</w:t>
+            </w:r>
+          </w:p>
+        </w:tc>
+        <w:tc>
+          <w:tcPr>
+            <w:tcW w:type="dxa" w:w="1440"/>
+          </w:tcPr>
+          <w:p>
+            <w:r>
+              <w:t>None (pay-per-use)</w:t>
+            </w:r>
+          </w:p>
+        </w:tc>
+        <w:tc>
+          <w:tcPr>
+            <w:tcW w:type="dxa" w:w="1440"/>
+          </w:tcPr>
+          <w:p>
+            <w:r>
+              <w:t>~$6,000 – $7,000</w:t>
+            </w:r>
+          </w:p>
+        </w:tc>
+      </w:tr>
+      <w:tr>
+        <w:tc>
+          <w:tcPr>
+            <w:tcW w:type="dxa" w:w="1440"/>
+          </w:tcPr>
+          <w:p>
+            <w:r>
+              <w:t>Dedicated D4</w:t>
+            </w:r>
+          </w:p>
+        </w:tc>
+        <w:tc>
+          <w:tcPr>
+            <w:tcW w:type="dxa" w:w="1440"/>
+          </w:tcPr>
+          <w:p>
+            <w:r>
+              <w:t>~13,700 hrs</w:t>
+            </w:r>
+          </w:p>
+        </w:tc>
+        <w:tc>
+          <w:tcPr>
+            <w:tcW w:type="dxa" w:w="1440"/>
+          </w:tcPr>
+          <w:p>
+            <w:r>
+              <w:t>~6,850 days</w:t>
+            </w:r>
+          </w:p>
+        </w:tc>
+        <w:tc>
+          <w:tcPr>
+            <w:tcW w:type="dxa" w:w="1440"/>
+          </w:tcPr>
+          <w:p>
+            <w:r>
+              <w:t>~$7,535</w:t>
+            </w:r>
+          </w:p>
+        </w:tc>
+        <w:tc>
+          <w:tcPr>
+            <w:tcW w:type="dxa" w:w="1440"/>
+          </w:tcPr>
+          <w:p>
+            <w:r>
+              <w:t>~$83,000 idle</w:t>
+            </w:r>
+          </w:p>
+        </w:tc>
+        <w:tc>
+          <w:tcPr>
+            <w:tcW w:type="dxa" w:w="1440"/>
+          </w:tcPr>
+          <w:p>
+            <w:r>
+              <w:t>~$90,000+</w:t>
+            </w:r>
+          </w:p>
+        </w:tc>
+      </w:tr>
+      <w:tr>
+        <w:tc>
+          <w:tcPr>
+            <w:tcW w:type="dxa" w:w="1440"/>
+          </w:tcPr>
+          <w:p>
+            <w:r>
+              <w:t>Dedicated D8</w:t>
+            </w:r>
+          </w:p>
+        </w:tc>
+        <w:tc>
+          <w:tcPr>
+            <w:tcW w:type="dxa" w:w="1440"/>
+          </w:tcPr>
+          <w:p>
+            <w:r>
+              <w:t>~10,000 hrs*</w:t>
+            </w:r>
+          </w:p>
+        </w:tc>
+        <w:tc>
+          <w:tcPr>
+            <w:tcW w:type="dxa" w:w="1440"/>
+          </w:tcPr>
+          <w:p>
+            <w:r>
+              <w:t>~5,000 days</w:t>
+            </w:r>
+          </w:p>
+        </w:tc>
+        <w:tc>
+          <w:tcPr>
+            <w:tcW w:type="dxa" w:w="1440"/>
+          </w:tcPr>
+          <w:p>
+            <w:r>
+              <w:t>~$11,000</w:t>
+            </w:r>
+          </w:p>
+        </w:tc>
+        <w:tc>
+          <w:tcPr>
+            <w:tcW w:type="dxa" w:w="1440"/>
+          </w:tcPr>
+          <w:p>
+            <w:r>
+              <w:t>~$121,000 idle</w:t>
+            </w:r>
+          </w:p>
+        </w:tc>
+        <w:tc>
+          <w:tcPr>
+            <w:tcW w:type="dxa" w:w="1440"/>
+          </w:tcPr>
+          <w:p>
+            <w:r>
+              <w:t>~$132,000+</w:t>
+            </w:r>
+          </w:p>
+        </w:tc>
+      </w:tr>
+    </w:tbl>
+    <w:p>
+      <w:r>
+        <w:t>* D8 has 2x CPU cores, which may improve PaddleOCR throughput depending on parallelisation. A conservative 25% speed improvement is assumed above. Actual improvement requires benchmarking.</w:t>
+      </w:r>
+    </w:p>
+    <w:p>
+      <w:r>
+        <w:t>Conclusion: Dedicated plans are significantly more expensive for batch workloads that run only a few hours per day. The Consumption plan remains the most cost-effective option for this workload pattern. Dedicated plans should only be adopted if large-file failures become a consistent operational problem and cannot be resolved by splitting oversized source PDFs before upload.</w:t>
+      </w:r>
+    </w:p>
+    <w:p>
+      <w:pPr>
+        <w:pStyle w:val="Heading2"/>
+      </w:pPr>
+      <w:r>
+        <w:t>Recommended Approach for Oversized Files</w:t>
       </w:r>
     </w:p>
     <w:p>
@@ -159,7 +2932,7 @@
         <w:pStyle w:val="ListBullet"/>
       </w:pPr>
       <w:r>
-        <w:t>Production profile uses `PDF_EXTRACTOR_OCR_MAX_WIDTH=1200`.</w:t>
+        <w:t>Split the source PDF into smaller segments (e.g. 50-page chunks) before uploading to blob storage.</w:t>
       </w:r>
     </w:p>
     <w:p>
@@ -167,25 +2940,7 @@
         <w:pStyle w:val="ListBullet"/>
       </w:pPr>
       <w:r>
-        <w:t>Benefit: lowers peak memory use per OCR pass while maintaining usable recognition quality.</w:t>
-      </w:r>
-    </w:p>
-    <w:p/>
-    <w:p>
-      <w:pPr>
-        <w:pStyle w:val="Heading3"/>
-      </w:pPr>
-      <w:r>
-        <w:t>5) Azure wildcard batch processing</w:t>
-      </w:r>
-    </w:p>
-    <w:p/>
-    <w:p>
-      <w:pPr>
-        <w:pStyle w:val="ListBullet"/>
-      </w:pPr>
-      <w:r>
-        <w:t>Added glob pattern support in Azure mode input path (`*`, `6*`, `abc*`, `?`, `[]`) in `src/pdf_extractor/cli.py`.</w:t>
+        <w:t>Process each segment as a separate Azure job. The output is recombined in the pdfoutput container.</w:t>
       </w:r>
     </w:p>
     <w:p>
@@ -193,109 +2948,324 @@
         <w:pStyle w:val="ListBullet"/>
       </w:pPr>
       <w:r>
-        <w:t>Benefit: one run can process many files and generate one consolidated opt-in Excel output.</w:t>
+        <w:t>This keeps the Consumption plan viable for files of any size without incurring dedicated plan costs.</w:t>
       </w:r>
     </w:p>
-    <w:p/>
+    <w:p>
+      <w:pPr>
+        <w:pStyle w:val="Heading1"/>
+      </w:pPr>
+      <w:r>
+        <w:t>8. Why We Stayed on Consumption</w:t>
+      </w:r>
+    </w:p>
     <w:p>
       <w:pPr>
         <w:pStyle w:val="Heading2"/>
       </w:pPr>
       <w:r>
-        <w:t>Hardened production profile</w:t>
-      </w:r>
-    </w:p>
-    <w:p/>
-    <w:p>
-      <w:r>
-        <w:t>Set these environment variables in Azure job configuration:</w:t>
-      </w:r>
-    </w:p>
-    <w:p/>
-    <w:p>
-      <w:pPr>
-        <w:pStyle w:val="ListBullet"/>
-      </w:pPr>
-      <w:r>
-        <w:t>`PDF_EXTRACTOR_OCR_ISOLATED=1`</w:t>
-      </w:r>
-    </w:p>
-    <w:p>
-      <w:pPr>
-        <w:pStyle w:val="ListBullet"/>
-      </w:pPr>
-      <w:r>
-        <w:t>`PDF_EXTRACTOR_OCR_RECYCLE_CALLS=6`</w:t>
-      </w:r>
-    </w:p>
-    <w:p>
-      <w:pPr>
-        <w:pStyle w:val="ListBullet"/>
-      </w:pPr>
-      <w:r>
-        <w:t>`PDF_EXTRACTOR_OCR_POOL_RETRIES=2`</w:t>
-      </w:r>
-    </w:p>
-    <w:p>
-      <w:pPr>
-        <w:pStyle w:val="ListBullet"/>
-      </w:pPr>
-      <w:r>
-        <w:t>`PDF_EXTRACTOR_OCR_MAX_WIDTH=1200`</w:t>
-      </w:r>
-    </w:p>
-    <w:p/>
-    <w:p>
-      <w:pPr>
-        <w:pStyle w:val="Heading2"/>
-      </w:pPr>
-      <w:r>
-        <w:t>Validation summary</w:t>
-      </w:r>
-    </w:p>
-    <w:p/>
-    <w:p>
-      <w:pPr>
-        <w:pStyle w:val="ListBullet"/>
-      </w:pPr>
-      <w:r>
-        <w:t>Large file success: `600157742.pdf`</w:t>
-      </w:r>
-    </w:p>
-    <w:p>
-      <w:pPr>
-        <w:pStyle w:val="ListBullet"/>
-      </w:pPr>
-      <w:r>
-        <w:t>Large file success: `600157748.pdf`</w:t>
-      </w:r>
-    </w:p>
-    <w:p>
-      <w:pPr>
-        <w:pStyle w:val="ListBullet"/>
-      </w:pPr>
-      <w:r>
-        <w:t>Wildcard batch success: `6*` matched 4 files and completed with one consolidated Excel output.</w:t>
-      </w:r>
-    </w:p>
-    <w:p/>
-    <w:p>
-      <w:pPr>
-        <w:pStyle w:val="Heading2"/>
-      </w:pPr>
-      <w:r>
-        <w:t>Remaining gap</w:t>
-      </w:r>
-    </w:p>
-    <w:p/>
-    <w:p>
-      <w:r>
-        <w:t>Duplicate split outputs in repeated packets are still emitted with numeric suffixes (for example `(2)`, `(3)`).</w:t>
+        <w:t>Consumption vs. Dedicated workload profiles</w:t>
       </w:r>
     </w:p>
     <w:p>
       <w:r>
-        <w:t>A hash-based deduplication stage remains the next enhancement.</w:t>
+        <w:t>The critical difference: Consumption charges only for active execution seconds. Dedicated profiles charge by the hour, continuously, whether or not a job is running.</w:t>
+      </w:r>
+    </w:p>
+    <w:tbl>
+      <w:tblPr>
+        <w:tblStyle w:val="TableGrid"/>
+        <w:tblW w:type="auto" w:w="0"/>
+        <w:tblLook w:firstColumn="1" w:firstRow="1" w:lastColumn="0" w:lastRow="0" w:noHBand="0" w:noVBand="1" w:val="04A0"/>
+      </w:tblPr>
+      <w:tblGrid>
+        <w:gridCol w:w="1728"/>
+        <w:gridCol w:w="1728"/>
+        <w:gridCol w:w="1728"/>
+        <w:gridCol w:w="1728"/>
+        <w:gridCol w:w="1728"/>
+      </w:tblGrid>
+      <w:tr>
+        <w:tc>
+          <w:tcPr>
+            <w:tcW w:type="dxa" w:w="1728"/>
+          </w:tcPr>
+          <w:p>
+            <w:r>
+              <w:rPr>
+                <w:b/>
+              </w:rPr>
+              <w:t>Plan</w:t>
+            </w:r>
+          </w:p>
+        </w:tc>
+        <w:tc>
+          <w:tcPr>
+            <w:tcW w:type="dxa" w:w="1728"/>
+          </w:tcPr>
+          <w:p>
+            <w:r>
+              <w:rPr>
+                <w:b/>
+              </w:rPr>
+              <w:t>vCPU</w:t>
+            </w:r>
+          </w:p>
+        </w:tc>
+        <w:tc>
+          <w:tcPr>
+            <w:tcW w:type="dxa" w:w="1728"/>
+          </w:tcPr>
+          <w:p>
+            <w:r>
+              <w:rPr>
+                <w:b/>
+              </w:rPr>
+              <w:t>RAM</w:t>
+            </w:r>
+          </w:p>
+        </w:tc>
+        <w:tc>
+          <w:tcPr>
+            <w:tcW w:type="dxa" w:w="1728"/>
+          </w:tcPr>
+          <w:p>
+            <w:r>
+              <w:rPr>
+                <w:b/>
+              </w:rPr>
+              <w:t>Approx. rate</w:t>
+            </w:r>
+          </w:p>
+        </w:tc>
+        <w:tc>
+          <w:tcPr>
+            <w:tcW w:type="dxa" w:w="1728"/>
+          </w:tcPr>
+          <w:p>
+            <w:r>
+              <w:rPr>
+                <w:b/>
+              </w:rPr>
+              <w:t>Effective daily cost</w:t>
+              <w:br/>
+              <w:t>(2 hrs/day active)</w:t>
+            </w:r>
+          </w:p>
+        </w:tc>
+      </w:tr>
+      <w:tr>
+        <w:tc>
+          <w:tcPr>
+            <w:tcW w:type="dxa" w:w="1728"/>
+          </w:tcPr>
+          <w:p>
+            <w:r>
+              <w:t>Consumption (current)</w:t>
+            </w:r>
+          </w:p>
+        </w:tc>
+        <w:tc>
+          <w:tcPr>
+            <w:tcW w:type="dxa" w:w="1728"/>
+          </w:tcPr>
+          <w:p>
+            <w:r>
+              <w:t>4</w:t>
+            </w:r>
+          </w:p>
+        </w:tc>
+        <w:tc>
+          <w:tcPr>
+            <w:tcW w:type="dxa" w:w="1728"/>
+          </w:tcPr>
+          <w:p>
+            <w:r>
+              <w:t>8 GiB</w:t>
+            </w:r>
+          </w:p>
+        </w:tc>
+        <w:tc>
+          <w:tcPr>
+            <w:tcW w:type="dxa" w:w="1728"/>
+          </w:tcPr>
+          <w:p>
+            <w:r>
+              <w:t>$0.44 / active hr</w:t>
+            </w:r>
+          </w:p>
+        </w:tc>
+        <w:tc>
+          <w:tcPr>
+            <w:tcW w:type="dxa" w:w="1728"/>
+          </w:tcPr>
+          <w:p>
+            <w:r>
+              <w:t>$0.88 / day</w:t>
+            </w:r>
+          </w:p>
+        </w:tc>
+      </w:tr>
+      <w:tr>
+        <w:tc>
+          <w:tcPr>
+            <w:tcW w:type="dxa" w:w="1728"/>
+          </w:tcPr>
+          <w:p>
+            <w:r>
+              <w:t>Dedicated D4</w:t>
+            </w:r>
+          </w:p>
+        </w:tc>
+        <w:tc>
+          <w:tcPr>
+            <w:tcW w:type="dxa" w:w="1728"/>
+          </w:tcPr>
+          <w:p>
+            <w:r>
+              <w:t>4</w:t>
+            </w:r>
+          </w:p>
+        </w:tc>
+        <w:tc>
+          <w:tcPr>
+            <w:tcW w:type="dxa" w:w="1728"/>
+          </w:tcPr>
+          <w:p>
+            <w:r>
+              <w:t>16 GiB</w:t>
+            </w:r>
+          </w:p>
+        </w:tc>
+        <w:tc>
+          <w:tcPr>
+            <w:tcW w:type="dxa" w:w="1728"/>
+          </w:tcPr>
+          <w:p>
+            <w:r>
+              <w:t>~$0.55 / always-on</w:t>
+            </w:r>
+          </w:p>
+        </w:tc>
+        <w:tc>
+          <w:tcPr>
+            <w:tcW w:type="dxa" w:w="1728"/>
+          </w:tcPr>
+          <w:p>
+            <w:r>
+              <w:t>~$13.20 / day</w:t>
+            </w:r>
+          </w:p>
+        </w:tc>
+      </w:tr>
+      <w:tr>
+        <w:tc>
+          <w:tcPr>
+            <w:tcW w:type="dxa" w:w="1728"/>
+          </w:tcPr>
+          <w:p>
+            <w:r>
+              <w:t>Dedicated D8</w:t>
+            </w:r>
+          </w:p>
+        </w:tc>
+        <w:tc>
+          <w:tcPr>
+            <w:tcW w:type="dxa" w:w="1728"/>
+          </w:tcPr>
+          <w:p>
+            <w:r>
+              <w:t>8</w:t>
+            </w:r>
+          </w:p>
+        </w:tc>
+        <w:tc>
+          <w:tcPr>
+            <w:tcW w:type="dxa" w:w="1728"/>
+          </w:tcPr>
+          <w:p>
+            <w:r>
+              <w:t>32 GiB</w:t>
+            </w:r>
+          </w:p>
+        </w:tc>
+        <w:tc>
+          <w:tcPr>
+            <w:tcW w:type="dxa" w:w="1728"/>
+          </w:tcPr>
+          <w:p>
+            <w:r>
+              <w:t>~$1.10 / always-on</w:t>
+            </w:r>
+          </w:p>
+        </w:tc>
+        <w:tc>
+          <w:tcPr>
+            <w:tcW w:type="dxa" w:w="1728"/>
+          </w:tcPr>
+          <w:p>
+            <w:r>
+              <w:t>~$26.40 / day</w:t>
+            </w:r>
+          </w:p>
+        </w:tc>
+      </w:tr>
+      <w:tr>
+        <w:tc>
+          <w:tcPr>
+            <w:tcW w:type="dxa" w:w="1728"/>
+          </w:tcPr>
+          <w:p>
+            <w:r>
+              <w:t>Dedicated D16</w:t>
+            </w:r>
+          </w:p>
+        </w:tc>
+        <w:tc>
+          <w:tcPr>
+            <w:tcW w:type="dxa" w:w="1728"/>
+          </w:tcPr>
+          <w:p>
+            <w:r>
+              <w:t>16</w:t>
+            </w:r>
+          </w:p>
+        </w:tc>
+        <w:tc>
+          <w:tcPr>
+            <w:tcW w:type="dxa" w:w="1728"/>
+          </w:tcPr>
+          <w:p>
+            <w:r>
+              <w:t>64 GiB</w:t>
+            </w:r>
+          </w:p>
+        </w:tc>
+        <w:tc>
+          <w:tcPr>
+            <w:tcW w:type="dxa" w:w="1728"/>
+          </w:tcPr>
+          <w:p>
+            <w:r>
+              <w:t>~$2.20 / always-on</w:t>
+            </w:r>
+          </w:p>
+        </w:tc>
+        <w:tc>
+          <w:tcPr>
+            <w:tcW w:type="dxa" w:w="1728"/>
+          </w:tcPr>
+          <w:p>
+            <w:r>
+              <w:t>~$52.80 / day</w:t>
+            </w:r>
+          </w:p>
+        </w:tc>
+      </w:tr>
+    </w:tbl>
+    <w:p>
+      <w:r>
+        <w:t>Conclusion: the Consumption plan at 4 vCPU / 8 GiB is the cost-optimal choice for this workload. The 8 GiB ceiling is sufficient for typical deal jacket files without any model configuration changes, and pay-per-use billing eliminates idle cost entirely. For files that exceed the memory ceiling, pre-splitting the source PDF is the recommended solution before considering a dedicated plan upgrade.</w:t>
       </w:r>
     </w:p>
     <w:sectPr>

</xml_diff>

<commit_message>
docs: update cost tables to 10-hour daily runtime
</commit_message>
<xml_diff>
--- a/PDF_split_and_Mine.docx
+++ b/PDF_split_and_Mine.docx
@@ -2229,12 +2229,7 @@
           </w:tcPr>
           <w:p>
             <w:r>
-              <w:rPr>
-                <w:b/>
-              </w:rPr>
-              <w:t>Daily cost</w:t>
-              <w:br/>
-              <w:t>(2 hrs active)</w:t>
+              <w:t>Daily cost | (10 hrs active)</w:t>
             </w:r>
           </w:p>
         </w:tc>
@@ -2306,7 +2301,7 @@
           </w:tcPr>
           <w:p>
             <w:r>
-              <w:t>~$0.88</w:t>
+              <w:t>~$4.40</w:t>
             </w:r>
           </w:p>
         </w:tc>
@@ -2378,7 +2373,7 @@
           </w:tcPr>
           <w:p>
             <w:r>
-              <w:t>~$0.56</w:t>
+              <w:t>~$2.80</w:t>
             </w:r>
           </w:p>
         </w:tc>
@@ -2450,7 +2445,7 @@
           </w:tcPr>
           <w:p>
             <w:r>
-              <w:t>~$1.10</w:t>
+              <w:t>~$5.50</w:t>
             </w:r>
           </w:p>
         </w:tc>
@@ -2522,7 +2517,7 @@
           </w:tcPr>
           <w:p>
             <w:r>
-              <w:t>~$2.20</w:t>
+              <w:t>~$11.00</w:t>
             </w:r>
           </w:p>
         </w:tc>
@@ -2594,7 +2589,7 @@
           </w:tcPr>
           <w:p>
             <w:r>
-              <w:t>~$4.40</w:t>
+              <w:t>~$22.00</w:t>
             </w:r>
           </w:p>
         </w:tc>
@@ -2667,12 +2662,7 @@
           </w:tcPr>
           <w:p>
             <w:r>
-              <w:rPr>
-                <w:b/>
-              </w:rPr>
-              <w:t>Days</w:t>
-              <w:br/>
-              <w:t>(2 hrs/day)</w:t>
+              <w:t>Days | (10 hrs/day)</w:t>
             </w:r>
           </w:p>
         </w:tc>
@@ -2697,12 +2687,7 @@
           </w:tcPr>
           <w:p>
             <w:r>
-              <w:rPr>
-                <w:b/>
-              </w:rPr>
-              <w:t>Idle cost</w:t>
-              <w:br/>
-              <w:t>(22 hrs/day × days)</w:t>
+              <w:t>Idle cost | (14 hrs/day × days)</w:t>
             </w:r>
           </w:p>
         </w:tc>
@@ -2749,7 +2734,7 @@
           </w:tcPr>
           <w:p>
             <w:r>
-              <w:t>~6,850 days</w:t>
+              <w:t>~1,370 days</w:t>
             </w:r>
           </w:p>
         </w:tc>
@@ -2811,7 +2796,7 @@
           </w:tcPr>
           <w:p>
             <w:r>
-              <w:t>~6,850 days</w:t>
+              <w:t>~1,370 days</w:t>
             </w:r>
           </w:p>
         </w:tc>
@@ -2831,7 +2816,7 @@
           </w:tcPr>
           <w:p>
             <w:r>
-              <w:t>~$83,000 idle</w:t>
+              <w:t>~$10,500 idle</w:t>
             </w:r>
           </w:p>
         </w:tc>
@@ -2841,7 +2826,7 @@
           </w:tcPr>
           <w:p>
             <w:r>
-              <w:t>~$90,000+</w:t>
+              <w:t>~$18,000+</w:t>
             </w:r>
           </w:p>
         </w:tc>
@@ -2873,7 +2858,7 @@
           </w:tcPr>
           <w:p>
             <w:r>
-              <w:t>~5,000 days</w:t>
+              <w:t>~1,000 days</w:t>
             </w:r>
           </w:p>
         </w:tc>
@@ -2893,7 +2878,7 @@
           </w:tcPr>
           <w:p>
             <w:r>
-              <w:t>~$121,000 idle</w:t>
+              <w:t>~$15,400 idle</w:t>
             </w:r>
           </w:p>
         </w:tc>
@@ -2903,7 +2888,7 @@
           </w:tcPr>
           <w:p>
             <w:r>
-              <w:t>~$132,000+</w:t>
+              <w:t>~$26,000+</w:t>
             </w:r>
           </w:p>
         </w:tc>
@@ -2916,7 +2901,7 @@
     </w:p>
     <w:p>
       <w:r>
-        <w:t>Conclusion: Dedicated plans are significantly more expensive for batch workloads that run only a few hours per day. The Consumption plan remains the most cost-effective option for this workload pattern. Dedicated plans should only be adopted if large-file failures become a consistent operational problem and cannot be resolved by splitting oversized source PDFs before upload.</w:t>
+        <w:t>Conclusion: Dedicated plans are significantly more expensive for batch workloads that run only a about 10 hours per day. The Consumption plan remains the most cost-effective option for this workload pattern. Dedicated plans should only be adopted if large-file failures become a consistent operational problem and cannot be resolved by splitting oversized source PDFs before upload.</w:t>
       </w:r>
     </w:p>
     <w:p>
@@ -3044,12 +3029,7 @@
           </w:tcPr>
           <w:p>
             <w:r>
-              <w:rPr>
-                <w:b/>
-              </w:rPr>
-              <w:t>Effective daily cost</w:t>
-              <w:br/>
-              <w:t>(2 hrs/day active)</w:t>
+              <w:t>Effective daily cost | (10 hrs/day active)</w:t>
             </w:r>
           </w:p>
         </w:tc>
@@ -3101,7 +3081,7 @@
           </w:tcPr>
           <w:p>
             <w:r>
-              <w:t>$0.88 / day</w:t>
+              <w:t>$4.40 / day</w:t>
             </w:r>
           </w:p>
         </w:tc>

</xml_diff>

<commit_message>
docs: update PDF_split_and_Mine.docx with pHash, sliding window, and cost corrections
- Section 3.3 (new): Large-File Processing — explains sliding-window chunking
  with ASCII diagram showing at most 2 chunks in RAM at any time
- Section 3.4 (new): Duplicate Detection — explains 3-layer dedup (byte hash,
  semantic, perceptual) with aHash step-by-step visual and Hamming distance example
- Section 7: updated hardware constraint text to reflect that windowed chunking
  eliminates the large-file memory ceiling; removed outdated manual pre-split
  recommendation; replaced with note that chunking is on by default in Docker image
- Section 6: corrected throughput estimate to include 602819077.pdf data point
  (3,900 pages / 27 docs / 1h42m) alongside the 220-page baseline

Generated with Claude Code
</commit_message>
<xml_diff>
--- a/PDF_split_and_Mine.docx
+++ b/PDF_split_and_Mine.docx
@@ -1487,6 +1487,268 @@
       </w:r>
     </w:p>
     <w:p>
+      <w:pPr/>
+    </w:p>
+    <w:p>
+      <w:pPr>
+        <w:pStyle w:val="Heading2"/>
+      </w:pPr>
+      <w:r>
+        <w:rPr>
+          <w:b w:val="0"/>
+        </w:rPr>
+        <w:t>3.3  Large-File Processing: Sliding Window</w:t>
+      </w:r>
+    </w:p>
+    <w:p>
+      <w:pPr/>
+      <w:r>
+        <w:rPr>
+          <w:b w:val="0"/>
+        </w:rPr>
+        <w:t>For very large PDFs (hundreds or thousands of pages) it is not feasible to load the entire source file into RAM on constrained cloud hardware. The tool divides the source into overlapping 20-page chunks written to disk, then analyses consecutive chunk pairs through a sliding window:</w:t>
+      </w:r>
+    </w:p>
+    <w:p>
+      <w:pPr/>
+      <w:r>
+        <w:rPr>
+          <w:rFonts w:ascii="Courier New" w:hAnsi="Courier New"/>
+          <w:b w:val="0"/>
+          <w:sz w:val="18"/>
+        </w:rPr>
+        <w:t>SOURCE PDF (e.g. 3,900 pages on disk — never fully loaded into RAM)</w:t>
+        <w:br/>
+        <w:br/>
+        <w:t xml:space="preserve">  pg:   1        20        30        40        50  ...</w:t>
+        <w:br/>
+        <w:t xml:space="preserve">        +---------+</w:t>
+        <w:br/>
+        <w:t xml:space="preserve">        | Chunk 1 |  &lt;- written to disk (20 pages)</w:t>
+        <w:br/>
+        <w:t xml:space="preserve">        +---------+</w:t>
+        <w:br/>
+        <w:t xml:space="preserve">                 +---------+</w:t>
+        <w:br/>
+        <w:t xml:space="preserve">                 | Chunk 2 |  &lt;- overlaps last 10 pages of Chunk 1</w:t>
+        <w:br/>
+        <w:t xml:space="preserve">                 +---------+</w:t>
+        <w:br/>
+        <w:t xml:space="preserve">                          +---------+</w:t>
+        <w:br/>
+        <w:t xml:space="preserve">                          | Chunk 3 |  &lt;- overlaps last 10 pages of Chunk 2</w:t>
+        <w:br/>
+        <w:t xml:space="preserve">                          +---------+  ...</w:t>
+        <w:br/>
+        <w:br/>
+        <w:t>ANALYSIS WINDOW  -&gt;  at most 2 chunks in RAM at any moment</w:t>
+        <w:br/>
+        <w:br/>
+        <w:t xml:space="preserve">  Window 1              Window 2              Window 3</w:t>
+        <w:br/>
+        <w:t xml:space="preserve">  +-------+-------+     +-------+-------+     +-------+-------+</w:t>
+        <w:br/>
+        <w:t xml:space="preserve">  |  C1   |  C2   | --&gt; |  C2   |  C3   | --&gt; |  C3   |  C4   |</w:t>
+        <w:br/>
+        <w:t xml:space="preserve">  | (RAM) | (RAM) |     | (RAM) | (RAM) |     | (RAM) | (RAM) |</w:t>
+        <w:br/>
+        <w:t xml:space="preserve">  +-------+-------+     +-------+-------+     +-------+-------+</w:t>
+        <w:br/>
+        <w:t xml:space="preserve">       |                     |                     |</w:t>
+        <w:br/>
+        <w:t xml:space="preserve">  Detect boundaries     Release C1            Release C2</w:t>
+        <w:br/>
+        <w:t xml:space="preserve">  Emit output PDFs      Load C3               Load C4</w:t>
+        <w:br/>
+        <w:t xml:space="preserve">  from left window</w:t>
+        <w:br/>
+        <w:br/>
+        <w:t>Memory in use at any moment:</w:t>
+        <w:br/>
+        <w:t xml:space="preserve">  ~2 x 20-page chunk  (~200-400 MB)</w:t>
+        <w:br/>
+        <w:t xml:space="preserve">  PaddleOCR models    (~2-3 GB)</w:t>
+        <w:br/>
+        <w:t xml:space="preserve">  ----------------------------------------</w:t>
+        <w:br/>
+        <w:t xml:space="preserve">  Total               (~2.5-3.5 GB of 8 GB available)</w:t>
+        <w:br/>
+        <w:br/>
+        <w:t xml:space="preserve">  The source file size does not matter -- only chunk size does.</w:t>
+      </w:r>
+    </w:p>
+    <w:p>
+      <w:pPr/>
+      <w:r>
+        <w:rPr>
+          <w:b w:val="0"/>
+        </w:rPr>
+        <w:t>Each chunk is a small PDF file written to a temporary _overlap_chunks/ sub-folder. The analysis window slides forward one chunk at a time, keeping at most two chunk files in RAM simultaneously. Once a window finishes, the earlier chunk is released. Because the source PDF is never fully decoded into RAM, files of any size can be processed as long as the hardware can hold two 20-page chunks.</w:t>
+      </w:r>
+    </w:p>
+    <w:p>
+      <w:pPr/>
+      <w:r>
+        <w:rPr>
+          <w:b w:val="0"/>
+        </w:rPr>
+        <w:t>The overlap between consecutive chunks is half the chunk size (10 pages). Any document whose pages straddle a chunk boundary appears in both chunks; the window logic recognises the shared pages and emits the document only once, correctly assembled.</w:t>
+      </w:r>
+    </w:p>
+    <w:p>
+      <w:pPr/>
+      <w:r>
+        <w:rPr>
+          <w:b w:val="0"/>
+        </w:rPr>
+        <w:t>Windowed chunking is controlled by the PDF_EXTRACTOR_OVERLAP_CHUNK_PAGES environment variable (set to 20 by default in the Docker image). To enable locally: $env:PDF_EXTRACTOR_OVERLAP_CHUNK_PAGES = "20"</w:t>
+      </w:r>
+    </w:p>
+    <w:p>
+      <w:pPr/>
+    </w:p>
+    <w:p>
+      <w:pPr>
+        <w:pStyle w:val="Heading2"/>
+      </w:pPr>
+      <w:r>
+        <w:rPr>
+          <w:b w:val="0"/>
+        </w:rPr>
+        <w:t>3.4  Duplicate Detection and Perceptual Hashing</w:t>
+      </w:r>
+    </w:p>
+    <w:p>
+      <w:pPr/>
+      <w:r>
+        <w:rPr>
+          <w:b w:val="0"/>
+        </w:rPr>
+        <w:t>After all pages have been split into documents, three deduplication passes run in priority order:</w:t>
+      </w:r>
+    </w:p>
+    <w:p>
+      <w:pPr>
+        <w:pStyle w:val="ListBullet"/>
+      </w:pPr>
+      <w:r>
+        <w:rPr>
+          <w:b w:val="0"/>
+        </w:rPr>
+        <w:t>1. Byte-hash (SHA-256): exact duplicate pages (identical compressed bytes) are dropped immediately. Catches cases where the same PDF page appears more than once in the source without any re-encoding.</w:t>
+      </w:r>
+    </w:p>
+    <w:p>
+      <w:pPr>
+        <w:pStyle w:val="ListBullet"/>
+      </w:pPr>
+      <w:r>
+        <w:rPr>
+          <w:b w:val="0"/>
+        </w:rPr>
+        <w:t>2. Semantic-title dedup: if two document groups share the same normalised title key and the same declared page count, the second group is discarded. Catches duplicate multi-page forms such as two copies of a 3-page credit application.</w:t>
+      </w:r>
+    </w:p>
+    <w:p>
+      <w:pPr>
+        <w:pStyle w:val="ListBullet"/>
+      </w:pPr>
+      <w:r>
+        <w:rPr>
+          <w:b w:val="0"/>
+        </w:rPr>
+        <w:t>3. Perceptual hash (aHash): the first page of each surviving document is fingerprinted visually. Pairs whose fingerprints are within a similarity threshold are flagged as suspected duplicates in suspected_duplicates.txt.</w:t>
+      </w:r>
+    </w:p>
+    <w:p>
+      <w:pPr/>
+      <w:r>
+        <w:rPr>
+          <w:b w:val="0"/>
+        </w:rPr>
+        <w:t>Why not just use SHA-256 for all three layers? A cryptographic hash changes completely if even one pixel differs — two scans of the same printed form will produce entirely different SHA-256 values because scan angle, brightness, and compression vary. Perceptual hashing (aHash) is designed to be visually similar rather than byte-identical:</w:t>
+      </w:r>
+    </w:p>
+    <w:p>
+      <w:pPr/>
+      <w:r>
+        <w:rPr>
+          <w:rFonts w:ascii="Courier New" w:hAnsi="Courier New"/>
+          <w:b w:val="0"/>
+          <w:sz w:val="18"/>
+        </w:rPr>
+        <w:t>Step 1 - Render the first page of each output document at 64 px wide</w:t>
+        <w:br/>
+        <w:t xml:space="preserve">         Full-size scan (e.g. 2,550 x 3,300 px)  -&gt;  64 x 49 px</w:t>
+        <w:br/>
+        <w:t xml:space="preserve">         Fine text is gone; layout structure (header block, body, signature</w:t>
+        <w:br/>
+        <w:t xml:space="preserve">         lines) survives.</w:t>
+        <w:br/>
+        <w:br/>
+        <w:t>Step 2 - Shrink to an 8x8 greyscale thumbnail  (64 pixels total)</w:t>
+        <w:br/>
+        <w:br/>
+        <w:t xml:space="preserve">         +----------+</w:t>
+        <w:br/>
+        <w:t xml:space="preserve">         | ##..#... |   # = pixel brighter than the page average</w:t>
+        <w:br/>
+        <w:t xml:space="preserve">         | ...#.#.. |   . = pixel darker  than the page average</w:t>
+        <w:br/>
+        <w:t xml:space="preserve">         | ........ |</w:t>
+        <w:br/>
+        <w:t xml:space="preserve">         | ..##.... |</w:t>
+        <w:br/>
+        <w:t xml:space="preserve">         | .....##. |</w:t>
+        <w:br/>
+        <w:t xml:space="preserve">         | .#...... |</w:t>
+        <w:br/>
+        <w:t xml:space="preserve">         | ....#..# |</w:t>
+        <w:br/>
+        <w:t xml:space="preserve">         | ........ |</w:t>
+        <w:br/>
+        <w:t xml:space="preserve">         +----------+</w:t>
+        <w:br/>
+        <w:br/>
+        <w:t>Step 3 - Encode: bright pixel  -&gt;  bit 1</w:t>
+        <w:br/>
+        <w:t xml:space="preserve">                 dark  pixel   -&gt;  bit 0</w:t>
+        <w:br/>
+        <w:t xml:space="preserve">         Result: a single 64-bit integer  (the perceptual hash / aHash)</w:t>
+        <w:br/>
+        <w:br/>
+        <w:t>Step 4 - Compare two hashes with Hamming distance</w:t>
+        <w:br/>
+        <w:t xml:space="preserve">         (count the bit positions that differ)</w:t>
+        <w:br/>
+        <w:br/>
+        <w:t xml:space="preserve">         Hash A: 1010110011101001...  (page from deal A)</w:t>
+        <w:br/>
+        <w:t xml:space="preserve">         Hash B: 1010110001101001...  (same page, slightly darker scan)</w:t>
+        <w:br/>
+        <w:t xml:space="preserve">                          ^</w:t>
+        <w:br/>
+        <w:t xml:space="preserve">                          2 bits differ  -&gt;  Hamming distance = 2</w:t>
+        <w:br/>
+        <w:br/>
+        <w:t xml:space="preserve">         Our threshold = 10 bits out of 64  (~84% visual similarity)</w:t>
+        <w:br/>
+        <w:br/>
+        <w:t xml:space="preserve">         distance  2 &lt;= 10  -&gt;  SUSPECTED DUPLICATE  (written to suspected_duplicates.txt)</w:t>
+        <w:br/>
+        <w:t xml:space="preserve">         distance 18 &gt;  10  -&gt;  different documents   (no flag)</w:t>
+      </w:r>
+    </w:p>
+    <w:p>
+      <w:pPr/>
+      <w:r>
+        <w:rPr>
+          <w:b w:val="0"/>
+        </w:rPr>
+        <w:t>Suspected duplicate pairs are flagged rather than automatically deleted so a human can verify the result. Two contracts of the same form type (e.g. two Blue Steel Protection agreements for different customers) will have similar hashes but represent distinct documents and should not be merged.</w:t>
+      </w:r>
+    </w:p>
+    <w:p>
       <w:pPr>
         <w:pStyle w:val="Heading1"/>
       </w:pPr>
@@ -1953,7 +2215,7 @@
     </w:p>
     <w:p>
       <w:r>
-        <w:t>A representative 220-page scanned batch (73 output documents) processes in approximately 1 hour. PaddleOCR is the bottleneck; it runs single-threaded on each page image.</w:t>
+        <w:t>A representative 220-page scanned deal jacket (73 output documents) processes in approximately 1 hour, giving a throughput rate of ~73 documents/hour. The 3,900-page batch file 602819077.pdf produced 27 documents in 1 h 42 min (~16 documents/hour) — a lower rate because large batch files contain fewer unique documents per page than smaller deal jackets. PaddleOCR is the throughput bottleneck and runs single-threaded.</w:t>
       </w:r>
     </w:p>
     <w:tbl>
@@ -2106,12 +2368,12 @@
     </w:p>
     <w:p>
       <w:r>
-        <w:t>The current Consumption plan allocates a fixed 8 GiB of RAM per execution. PaddleOCR loads its neural network models at startup (~2-3 GB), and PyMuPDF buffers rendered page images in memory during processing. For large or dense PDF files — particularly those with many high-resolution scanned pages — the container can exhaust available memory mid-run, causing the job to fail before all pages are processed.</w:t>
+        <w:t>The Consumption plan allocates 8 GiB of RAM per execution. PaddleOCR loads its neural network models at startup (~2-3 GB). Earlier versions of the tool held the entire source PDF decoded in memory during processing, which made files larger than ~200 pages unreliable on this hardware.</w:t>
       </w:r>
     </w:p>
     <w:p>
       <w:r>
-        <w:t>The Consumption plan's 8 GiB ceiling cannot be raised without moving to a Dedicated workload profile. If you need to process larger files reliably, upgrading to a Dedicated D2 or D4 profile is required.</w:t>
+        <w:t>The sliding-window chunking feature (Section 3.3) eliminates this constraint. Because only two 20-page chunk files are held in RAM at any time, the tool can now process files of any size on the standard 8 GiB Consumption plan. Validation: the 3,900-page batch file 602819077.pdf completed successfully in 1 h 42 min without any hardware upgrade.</w:t>
       </w:r>
     </w:p>
     <w:p>
@@ -2909,7 +3171,7 @@
         <w:pStyle w:val="Heading2"/>
       </w:pPr>
       <w:r>
-        <w:t>Recommended Approach for Oversized Files</w:t>
+        <w:t>Large Files: Resolved by Sliding-Window Chunking</w:t>
       </w:r>
     </w:p>
     <w:p>
@@ -2917,7 +3179,7 @@
         <w:pStyle w:val="ListBullet"/>
       </w:pPr>
       <w:r>
-        <w:t>Split the source PDF into smaller segments (e.g. 50-page chunks) before uploading to blob storage.</w:t>
+        <w:t>Sliding-window chunking is enabled by default in the Docker image (PDF_EXTRACTOR_OVERLAP_CHUNK_PAGES=20). No manual pre-splitting is needed.</w:t>
       </w:r>
     </w:p>
     <w:p>
@@ -2925,15 +3187,11 @@
         <w:pStyle w:val="ListBullet"/>
       </w:pPr>
       <w:r>
-        <w:t>Process each segment as a separate Azure job. The output is recombined in the pdfoutput container.</w:t>
-      </w:r>
-    </w:p>
-    <w:p>
-      <w:pPr>
-        <w:pStyle w:val="ListBullet"/>
-      </w:pPr>
-      <w:r>
-        <w:t>This keeps the Consumption plan viable for files of any size without incurring dedicated plan costs.</w:t>
+        <w:rPr>
+          <w:rFonts w:ascii="Courier New" w:hAnsi="Courier New"/>
+          <w:sz w:val="18"/>
+        </w:rPr>
+        <w:t>To enable windowed chunking locally: $env:PDF_EXTRACTOR_OVERLAP_CHUNK_PAGES = "20"</w:t>
       </w:r>
     </w:p>
     <w:p>

</xml_diff>

<commit_message>
docs: correct sliding-window diagram and description in docx
The diagram incorrectly showed chunks overlapping by 10 pages and the
description said 'overlaps last 10 pages of Chunk 1'. Code review of
overlap_splitter.py confirmed chunks are NON-overlapping (each covers
exactly 20 fresh pages); only the analysis windows overlap by sharing
one chunk between consecutive windows.

Updated Section 3.3 with:
- Correct ASCII diagram showing non-overlapping 20-page chunks and
  overlapping 40-page windows (Window 1 = C1+C2, Window 2 = C2+C3...)
- Accurate 'each chunk' explanation (two chunks loaded at once, left
  chunk released after window completes)
- Corrected overlap sentence: chunks don't overlap, windows do

Generated with Claude Code
</commit_message>
<xml_diff>
--- a/PDF_split_and_Mine.docx
+++ b/PDF_split_and_Mine.docx
@@ -1503,10 +1503,7 @@
     <w:p>
       <w:pPr/>
       <w:r>
-        <w:rPr>
-          <w:b w:val="0"/>
-        </w:rPr>
-        <w:t>For very large PDFs (hundreds or thousands of pages) it is not feasible to load the entire source file into RAM on constrained cloud hardware. The tool divides the source into overlapping 20-page chunks written to disk, then analyses consecutive chunk pairs through a sliding window:</w:t>
+        <w:t>For very large PDFs (hundreds or thousands of pages) it is not feasible to load the entire source file into RAM on constrained cloud hardware. The tool divides the source into fixed 20-page chunks written to disk, then analyses consecutive chunk pairs through a sliding window:</w:t>
       </w:r>
     </w:p>
     <w:p>
@@ -1514,85 +1511,68 @@
       <w:r>
         <w:rPr>
           <w:rFonts w:ascii="Courier New" w:hAnsi="Courier New"/>
-          <w:b w:val="0"/>
           <w:sz w:val="18"/>
         </w:rPr>
-        <w:t>SOURCE PDF (e.g. 3,900 pages on disk — never fully loaded into RAM)</w:t>
+        <w:t>CHUNKS  (written to disk, non-overlapping, 20 pages each)</w:t>
         <w:br/>
         <w:br/>
-        <w:t xml:space="preserve">  pg:   1        20        30        40        50  ...</w:t>
+        <w:t xml:space="preserve">  pg:  1          20  21         40  41         60  61         80</w:t>
         <w:br/>
-        <w:t xml:space="preserve">        +---------+</w:t>
+        <w:t xml:space="preserve">       +------------+  +------------+  +------------+  +------------+</w:t>
         <w:br/>
-        <w:t xml:space="preserve">        | Chunk 1 |  &lt;- written to disk (20 pages)</w:t>
+        <w:t xml:space="preserve">       |  Chunk 1   |  |  Chunk 2   |  |  Chunk 3   |  |  Chunk 4   |</w:t>
         <w:br/>
-        <w:t xml:space="preserve">        +---------+</w:t>
+        <w:t xml:space="preserve">       | (20 pages) |  | (20 pages) |  | (20 pages) |  | (20 pages) |</w:t>
         <w:br/>
-        <w:t xml:space="preserve">                 +---------+</w:t>
-        <w:br/>
-        <w:t xml:space="preserve">                 | Chunk 2 |  &lt;- overlaps last 10 pages of Chunk 1</w:t>
-        <w:br/>
-        <w:t xml:space="preserve">                 +---------+</w:t>
-        <w:br/>
-        <w:t xml:space="preserve">                          +---------+</w:t>
-        <w:br/>
-        <w:t xml:space="preserve">                          | Chunk 3 |  &lt;- overlaps last 10 pages of Chunk 2</w:t>
-        <w:br/>
-        <w:t xml:space="preserve">                          +---------+  ...</w:t>
+        <w:t xml:space="preserve">       +------------+  +------------+  +------------+  +------------+</w:t>
         <w:br/>
         <w:br/>
-        <w:t>ANALYSIS WINDOW  -&gt;  at most 2 chunks in RAM at any moment</w:t>
+        <w:t>ANALYSIS WINDOWS  (two chunks loaded at a time; window slides one chunk forward)</w:t>
         <w:br/>
         <w:br/>
-        <w:t xml:space="preserve">  Window 1              Window 2              Window 3</w:t>
+        <w:t xml:space="preserve">  Window 1 (pg 1-40)          Window 2 (pg 21-60)         Window 3 (pg 41-80)</w:t>
         <w:br/>
-        <w:t xml:space="preserve">  +-------+-------+     +-------+-------+     +-------+-------+</w:t>
+        <w:t xml:space="preserve">  +----------+----------+     +----------+----------+     +----------+----------+</w:t>
         <w:br/>
-        <w:t xml:space="preserve">  |  C1   |  C2   | --&gt; |  C2   |  C3   | --&gt; |  C3   |  C4   |</w:t>
+        <w:t xml:space="preserve">  | Chunk 1  | Chunk 2  | --&gt; | Chunk 2  | Chunk 3  | --&gt; | Chunk 3  | Chunk 4  |</w:t>
         <w:br/>
-        <w:t xml:space="preserve">  | (RAM) | (RAM) |     | (RAM) | (RAM) |     | (RAM) | (RAM) |</w:t>
+        <w:t xml:space="preserve">  |  in RAM  |  in RAM  |     |  in RAM  |  in RAM  |     |  in RAM  |  in RAM  |</w:t>
         <w:br/>
-        <w:t xml:space="preserve">  +-------+-------+     +-------+-------+     +-------+-------+</w:t>
+        <w:t xml:space="preserve">  +----------+----------+     +----------+----------+     +----------+----------+</w:t>
         <w:br/>
-        <w:t xml:space="preserve">       |                     |                     |</w:t>
+        <w:t xml:space="preserve">        |                           |                           |</w:t>
         <w:br/>
-        <w:t xml:space="preserve">  Detect boundaries     Release C1            Release C2</w:t>
+        <w:t xml:space="preserve">  Emit docs whose first       Emit docs whose first       Emit docs whose first</w:t>
         <w:br/>
-        <w:t xml:space="preserve">  Emit output PDFs      Load C3               Load C4</w:t>
+        <w:t xml:space="preserve">  page is in Chunk 1          page is in Chunk 2          page is in Chunk 3</w:t>
         <w:br/>
-        <w:t xml:space="preserve">  from left window</w:t>
+        <w:t xml:space="preserve">  (pages 1-20)                (pages 21-40)               (pages 41-60)</w:t>
+        <w:br/>
+        <w:br/>
+        <w:t xml:space="preserve">  Chunk 2 is shared between Window 1 and Window 2.</w:t>
+        <w:br/>
+        <w:t xml:space="preserve">  A document that starts on page 18 and ends on page 23 is seen whole</w:t>
+        <w:br/>
+        <w:t xml:space="preserve">  in Window 1 (pages 1-40) and emitted correctly as one file.</w:t>
         <w:br/>
         <w:br/>
         <w:t>Memory in use at any moment:</w:t>
         <w:br/>
-        <w:t xml:space="preserve">  ~2 x 20-page chunk  (~200-400 MB)</w:t>
+        <w:t xml:space="preserve">  Two 20-page chunk PDFs  +  PaddleOCR models (~2-3 GB)</w:t>
         <w:br/>
-        <w:t xml:space="preserve">  PaddleOCR models    (~2-3 GB)</w:t>
-        <w:br/>
-        <w:t xml:space="preserve">  ----------------------------------------</w:t>
-        <w:br/>
-        <w:t xml:space="preserve">  Total               (~2.5-3.5 GB of 8 GB available)</w:t>
-        <w:br/>
-        <w:br/>
-        <w:t xml:space="preserve">  The source file size does not matter -- only chunk size does.</w:t>
+        <w:t xml:space="preserve">  The source file size is irrelevant -- only chunk size matters.</w:t>
       </w:r>
     </w:p>
     <w:p>
       <w:pPr/>
       <w:r>
-        <w:rPr>
-          <w:b w:val="0"/>
-        </w:rPr>
-        <w:t>Each chunk is a small PDF file written to a temporary _overlap_chunks/ sub-folder. The analysis window slides forward one chunk at a time, keeping at most two chunk files in RAM simultaneously. Once a window finishes, the earlier chunk is released. Because the source PDF is never fully decoded into RAM, files of any size can be processed as long as the hardware can hold two 20-page chunks.</w:t>
+        <w:t>Each chunk is a small PDF written to a temporary _overlap_chunks/ sub-folder. The analysis window loads two consecutive chunks at once, so any document that straddles a chunk boundary is always seen whole within a single window and emitted correctly as one output file. Once a window finishes, the left chunk is released from memory and the right chunk becomes the new left, keeping RAM usage constant regardless of how large the source PDF is.</w:t>
       </w:r>
     </w:p>
     <w:p>
       <w:pPr/>
       <w:r>
-        <w:rPr>
-          <w:b w:val="0"/>
-        </w:rPr>
-        <w:t>The overlap between consecutive chunks is half the chunk size (10 pages). Any document whose pages straddle a chunk boundary appears in both chunks; the window logic recognises the shared pages and emits the document only once, correctly assembled.</w:t>
+        <w:t>The chunks themselves do not overlap — each chunk covers exactly 20 fresh pages. The windows overlap: Chunk 2 is loaded in both Window 1 and Window 2, which is what allows documents spanning the Chunk 1/Chunk 2 boundary to be detected correctly.</w:t>
       </w:r>
     </w:p>
     <w:p>

</xml_diff>

<commit_message>
docs: add Section 9 closing rationale for windowed chunking design
Explains why windowed chunking solves the constrained-hardware problem:
PaddleOCR's 2-3 GB model footprint leaves limited RAM for source PDFs,
so file size is decoupled from RAM by processing non-overlapping 20-page
chunks through a two-chunk sliding window. Includes the boundary-spanning
guarantee and the validated result: 3,900-page file in 1h42m on 8 GiB.

Generated with Claude Code
</commit_message>
<xml_diff>
--- a/PDF_split_and_Mine.docx
+++ b/PDF_split_and_Mine.docx
@@ -3486,6 +3486,30 @@
         <w:t>Conclusion: the Consumption plan at 4 vCPU / 8 GiB is the cost-optimal choice for this workload. The 8 GiB ceiling is sufficient for typical deal jacket files without any model configuration changes, and pay-per-use billing eliminates idle cost entirely. For files that exceed the memory ceiling, pre-splitting the source PDF is the recommended solution before considering a dedicated plan upgrade.</w:t>
       </w:r>
     </w:p>
+    <w:p>
+      <w:pPr/>
+      <w:r>
+        <w:rPr>
+          <w:b/>
+        </w:rPr>
+        <w:t>9.  Design Rationale: Why Windowed Chunking Works</w:t>
+      </w:r>
+    </w:p>
+    <w:p>
+      <w:pPr/>
+      <w:r>
+        <w:t>The windowed chunking approach is built around a specific hardware constraint: PaddleOCR loads its neural network models into RAM at startup and holds them for the duration of the run (approximately 2-3 GB). On an 8 GiB Azure Consumption instance this leaves only 5-6 GB for the source document itself. A naive implementation that decodes the entire source PDF into memory at once would exhaust RAM for any file larger than a few hundred pages -- making the tool impractical for the large deal jackets it was built to handle.</w:t>
+        <w:br/>
+        <w:br/>
+        <w:t>The solution decouples file size from RAM requirement entirely. The source PDF is divided into fixed, non-overlapping 20-page chunks written to disk. At any moment only two consecutive chunks are loaded into RAM -- a sliding window of 40 pages. Once a window finishes processing, the older chunk is released and the next chunk slides in. Peak memory consumption is therefore determined by chunk size, not by how large the source file is.</w:t>
+        <w:br/>
+        <w:br/>
+        <w:t>The two-chunk window also solves the boundary problem: a document whose pages straddle a chunk boundary is always seen whole within a single window and emitted as one correct output file. No document is silently split across the boundary.</w:t>
+        <w:br/>
+        <w:br/>
+        <w:t>The practical result: a 3,900-page scanned deal jacket (602819077.pdf) that would have failed immediately on 8 GiB hardware without windowed chunking completed in 1 hour 42 minutes on a 4 vCPU / 8 GiB Azure Consumption instance, producing 27 correctly split output documents. The source file size is now irrelevant -- only the chunk size (20 pages) determines how much RAM the tool uses at any moment.</w:t>
+      </w:r>
+    </w:p>
     <w:sectPr>
       <w:pgSz w:w="12240" w:h="15840"/>
       <w:pgMar w:top="1440" w:right="1800" w:bottom="1440" w:left="1800" w:header="720" w:footer="720" w:gutter="0"/>

</xml_diff>

<commit_message>
feat: fix Azure job input, add progress logging, fast ACR builds
- Dockerfile: switch to shell-form ENTRYPOINT reading \${PDF_INPUT_FILE}
  env var; remove CMD to eliminate job-template persistence bug
- run.ps1: pass input file via --env-vars (per-execution, not --args);
  add Invoke-ImageBuild that stages only src/ before az acr build,
  reducing upload from 835 MB to a few MB
- image_splitter.py, overlap_splitter.py: add structured progress
  logging ([START], [PAGE X/N], [CHUNKS], [OUTPUT N], [DONE], [DEDUP]);
  toggle off with PDF_EXTRACTOR_NO_PROGRESS_LOGS=No_Progress_Logs
- .dockerignore: add full exclusion list (venv, data, IDE, secrets, docs)
- trial_stats.md: add timed throughput trial tracking file

Generated with Claude Code
</commit_message>
<xml_diff>
--- a/PDF_split_and_Mine.docx
+++ b/PDF_split_and_Mine.docx
@@ -190,6 +190,11 @@
     <w:p>
       <w:pPr>
         <w:ind w:left="576"/>
+        <w:rPr>
+          <w:rFonts w:ascii="Courier New" w:hAnsi="Courier New"/>
+          <w:color w:val="1F507D"/>
+          <w:sz w:val="18"/>
+        </w:rPr>
       </w:pPr>
       <w:r>
         <w:rPr>
@@ -199,6 +204,11 @@
         </w:rPr>
         <w:t>src/pdf_extractor/Data/</w:t>
       </w:r>
+    </w:p>
+    <w:p>
+      <w:pPr>
+        <w:ind w:left="576"/>
+      </w:pPr>
     </w:p>
     <w:tbl>
       <w:tblPr>
@@ -1059,6 +1069,20 @@
       <w:pPr>
         <w:spacing w:after="0"/>
       </w:pPr>
+    </w:p>
+    <w:p>
+      <w:pPr>
+        <w:rPr>
+          <w:rFonts w:asciiTheme="majorHAnsi" w:eastAsiaTheme="majorEastAsia" w:hAnsiTheme="majorHAnsi" w:cstheme="majorBidi"/>
+          <w:b/>
+          <w:bCs/>
+          <w:color w:val="4F81BD" w:themeColor="accent1"/>
+          <w:szCs w:val="26"/>
+        </w:rPr>
+      </w:pPr>
+      <w:r>
+        <w:br w:type="page"/>
+      </w:r>
     </w:p>
     <w:p>
       <w:pPr>
@@ -1855,359 +1879,11 @@
     <w:p>
       <w:pPr>
         <w:pStyle w:val="Heading2"/>
+        <w:spacing w:line="240" w:lineRule="auto"/>
       </w:pPr>
       <w:r>
         <w:lastRenderedPageBreak/>
         <w:t>Pattern Matching Examples (Local Mode, Option 3)</w:t>
-      </w:r>
-    </w:p>
-    <w:tbl>
-      <w:tblPr>
-        <w:tblStyle w:val="TableGrid"/>
-        <w:tblW w:w="0" w:type="auto"/>
-        <w:tblLook w:val="04A0" w:firstRow="1" w:lastRow="0" w:firstColumn="1" w:lastColumn="0" w:noHBand="0" w:noVBand="1"/>
-      </w:tblPr>
-      <w:tblGrid>
-        <w:gridCol w:w="4320"/>
-        <w:gridCol w:w="4320"/>
-      </w:tblGrid>
-      <w:tr>
-        <w:trPr>
-          <w:cantSplit/>
-        </w:trPr>
-        <w:tc>
-          <w:tcPr>
-            <w:tcW w:w="4320" w:type="dxa"/>
-          </w:tcPr>
-          <w:p>
-            <w:pPr>
-              <w:rPr>
-                <w:sz w:val="20"/>
-                <w:szCs w:val="20"/>
-              </w:rPr>
-            </w:pPr>
-            <w:r>
-              <w:rPr>
-                <w:b/>
-                <w:sz w:val="20"/>
-              </w:rPr>
-              <w:t>Pattern</w:t>
-            </w:r>
-          </w:p>
-        </w:tc>
-        <w:tc>
-          <w:tcPr>
-            <w:tcW w:w="4320" w:type="dxa"/>
-          </w:tcPr>
-          <w:p>
-            <w:pPr>
-              <w:rPr>
-                <w:sz w:val="20"/>
-                <w:szCs w:val="20"/>
-              </w:rPr>
-            </w:pPr>
-            <w:r>
-              <w:rPr>
-                <w:b/>
-                <w:sz w:val="20"/>
-              </w:rPr>
-              <w:t>Matches</w:t>
-            </w:r>
-          </w:p>
-        </w:tc>
-      </w:tr>
-      <w:tr>
-        <w:trPr>
-          <w:cantSplit/>
-        </w:trPr>
-        <w:tc>
-          <w:tcPr>
-            <w:tcW w:w="4320" w:type="dxa"/>
-          </w:tcPr>
-          <w:p>
-            <w:pPr>
-              <w:rPr>
-                <w:sz w:val="20"/>
-                <w:szCs w:val="20"/>
-              </w:rPr>
-            </w:pPr>
-            <w:r>
-              <w:rPr>
-                <w:sz w:val="20"/>
-              </w:rPr>
-              <w:t>6*</w:t>
-            </w:r>
-          </w:p>
-        </w:tc>
-        <w:tc>
-          <w:tcPr>
-            <w:tcW w:w="4320" w:type="dxa"/>
-          </w:tcPr>
-          <w:p>
-            <w:pPr>
-              <w:rPr>
-                <w:sz w:val="20"/>
-                <w:szCs w:val="20"/>
-              </w:rPr>
-            </w:pPr>
-            <w:r>
-              <w:rPr>
-                <w:sz w:val="20"/>
-              </w:rPr>
-              <w:t>All files starting with "6" (e.g. 600156961.pdf, 600157748.pdf)</w:t>
-            </w:r>
-          </w:p>
-        </w:tc>
-      </w:tr>
-      <w:tr>
-        <w:trPr>
-          <w:cantSplit/>
-        </w:trPr>
-        <w:tc>
-          <w:tcPr>
-            <w:tcW w:w="4320" w:type="dxa"/>
-          </w:tcPr>
-          <w:p>
-            <w:pPr>
-              <w:rPr>
-                <w:sz w:val="20"/>
-                <w:szCs w:val="20"/>
-              </w:rPr>
-            </w:pPr>
-            <w:r>
-              <w:rPr>
-                <w:sz w:val="20"/>
-              </w:rPr>
-              <w:t>Sample-*</w:t>
-            </w:r>
-          </w:p>
-        </w:tc>
-        <w:tc>
-          <w:tcPr>
-            <w:tcW w:w="4320" w:type="dxa"/>
-          </w:tcPr>
-          <w:p>
-            <w:pPr>
-              <w:rPr>
-                <w:sz w:val="20"/>
-                <w:szCs w:val="20"/>
-              </w:rPr>
-            </w:pPr>
-            <w:r>
-              <w:rPr>
-                <w:sz w:val="20"/>
-              </w:rPr>
-              <w:t>All files starting with "Sample-" (e.g. Sample-1.pdf, Sample-2.pdf)</w:t>
-            </w:r>
-          </w:p>
-        </w:tc>
-      </w:tr>
-      <w:tr>
-        <w:trPr>
-          <w:cantSplit/>
-        </w:trPr>
-        <w:tc>
-          <w:tcPr>
-            <w:tcW w:w="4320" w:type="dxa"/>
-          </w:tcPr>
-          <w:p>
-            <w:pPr>
-              <w:rPr>
-                <w:sz w:val="20"/>
-                <w:szCs w:val="20"/>
-              </w:rPr>
-            </w:pPr>
-            <w:r>
-              <w:rPr>
-                <w:sz w:val="20"/>
-              </w:rPr>
-              <w:t>RouteOne*</w:t>
-            </w:r>
-          </w:p>
-        </w:tc>
-        <w:tc>
-          <w:tcPr>
-            <w:tcW w:w="4320" w:type="dxa"/>
-          </w:tcPr>
-          <w:p>
-            <w:pPr>
-              <w:rPr>
-                <w:sz w:val="20"/>
-                <w:szCs w:val="20"/>
-              </w:rPr>
-            </w:pPr>
-            <w:r>
-              <w:rPr>
-                <w:sz w:val="20"/>
-              </w:rPr>
-              <w:t>All files starting with "RouteOne" (e.g. RouteOne.pdf)</w:t>
-            </w:r>
-          </w:p>
-        </w:tc>
-      </w:tr>
-      <w:tr>
-        <w:trPr>
-          <w:cantSplit/>
-        </w:trPr>
-        <w:tc>
-          <w:tcPr>
-            <w:tcW w:w="4320" w:type="dxa"/>
-          </w:tcPr>
-          <w:p>
-            <w:pPr>
-              <w:rPr>
-                <w:sz w:val="20"/>
-                <w:szCs w:val="20"/>
-              </w:rPr>
-            </w:pPr>
-            <w:r>
-              <w:rPr>
-                <w:sz w:val="20"/>
-              </w:rPr>
-              <w:t>*.pdf</w:t>
-            </w:r>
-          </w:p>
-        </w:tc>
-        <w:tc>
-          <w:tcPr>
-            <w:tcW w:w="4320" w:type="dxa"/>
-          </w:tcPr>
-          <w:p>
-            <w:pPr>
-              <w:rPr>
-                <w:sz w:val="20"/>
-                <w:szCs w:val="20"/>
-              </w:rPr>
-            </w:pPr>
-            <w:r>
-              <w:rPr>
-                <w:sz w:val="20"/>
-              </w:rPr>
-              <w:t>All PDF files (equivalent to option 2: process all)</w:t>
-            </w:r>
-          </w:p>
-        </w:tc>
-      </w:tr>
-    </w:tbl>
-    <w:p>
-      <w:pPr>
-        <w:pStyle w:val="Heading2"/>
-      </w:pPr>
-      <w:r>
-        <w:t>Configuration (run-config.json)</w:t>
-      </w:r>
-    </w:p>
-    <w:p>
-      <w:r>
-        <w:t>Settings are saved to run-config.json in the repository root. This allows different machines or users to have different input/output paths without modifying the script. Select "Configure settings" (option 5 in Local mode) to change paths; they persist across sessions.</w:t>
-      </w:r>
-    </w:p>
-    <w:p>
-      <w:r>
-        <w:t>Example run-config.json:</w:t>
-      </w:r>
-    </w:p>
-    <w:p>
-      <w:pPr>
-        <w:ind w:left="576"/>
-      </w:pPr>
-      <w:r>
-        <w:rPr>
-          <w:rFonts w:ascii="Courier New" w:hAnsi="Courier New"/>
-          <w:color w:val="1F507D"/>
-          <w:sz w:val="18"/>
-        </w:rPr>
-        <w:t>{</w:t>
-      </w:r>
-      <w:r>
-        <w:rPr>
-          <w:rFonts w:ascii="Courier New" w:hAnsi="Courier New"/>
-          <w:color w:val="1F507D"/>
-          <w:sz w:val="18"/>
-        </w:rPr>
-        <w:br/>
-        <w:t xml:space="preserve">  "data_dir": "D:\\PDFs\\ToProcess",</w:t>
-      </w:r>
-      <w:r>
-        <w:rPr>
-          <w:rFonts w:ascii="Courier New" w:hAnsi="Courier New"/>
-          <w:color w:val="1F507D"/>
-          <w:sz w:val="18"/>
-        </w:rPr>
-        <w:br/>
-        <w:t xml:space="preserve">  "output_dir": "D:\\PDFs\\Results",</w:t>
-      </w:r>
-      <w:r>
-        <w:rPr>
-          <w:rFonts w:ascii="Courier New" w:hAnsi="Courier New"/>
-          <w:color w:val="1F507D"/>
-          <w:sz w:val="18"/>
-        </w:rPr>
-        <w:br/>
-        <w:t xml:space="preserve">  "log_dir": "D:\\PDFs\\Results\\job-logs",</w:t>
-      </w:r>
-      <w:r>
-        <w:rPr>
-          <w:rFonts w:ascii="Courier New" w:hAnsi="Courier New"/>
-          <w:color w:val="1F507D"/>
-          <w:sz w:val="18"/>
-        </w:rPr>
-        <w:br/>
-        <w:t xml:space="preserve">  "last_updated": "2026-05-12 14:30:00"</w:t>
-      </w:r>
-      <w:r>
-        <w:rPr>
-          <w:rFonts w:ascii="Courier New" w:hAnsi="Courier New"/>
-          <w:color w:val="1F507D"/>
-          <w:sz w:val="18"/>
-        </w:rPr>
-        <w:br/>
-        <w:t>}</w:t>
-      </w:r>
-    </w:p>
-    <w:p>
-      <w:pPr>
-        <w:pStyle w:val="Heading1"/>
-      </w:pPr>
-      <w:r>
-        <w:t>3. Code Architecture</w:t>
-      </w:r>
-    </w:p>
-    <w:p>
-      <w:pPr>
-        <w:pStyle w:val="Heading2"/>
-      </w:pPr>
-      <w:r>
-        <w:t>Splitting Pipeline  (image_splitter.py)</w:t>
-      </w:r>
-    </w:p>
-    <w:p>
-      <w:r>
-        <w:t>Every page passes through a unified analysis function regardless of content type:</w:t>
-      </w:r>
-    </w:p>
-    <w:p>
-      <w:pPr>
-        <w:pStyle w:val="ListBullet"/>
-      </w:pPr>
-      <w:r>
-        <w:t>Digital text pages: text is analyzed directly for structural signals.</w:t>
-      </w:r>
-    </w:p>
-    <w:p>
-      <w:pPr>
-        <w:pStyle w:val="ListBullet"/>
-      </w:pPr>
-      <w:r>
-        <w:t>Scanned image pages: First renders the page at 150 DPI, then PaddleOCR extracts text.</w:t>
-      </w:r>
-    </w:p>
-    <w:p>
-      <w:pPr>
-        <w:spacing w:after="0"/>
-      </w:pPr>
-      <w:r>
-        <w:t>Each page produces a PageSignal with one of three classifications:</w:t>
       </w:r>
     </w:p>
     <w:p/>
@@ -2241,7 +1917,7 @@
                 <w:b/>
                 <w:sz w:val="20"/>
               </w:rPr>
-              <w:t>Classification</w:t>
+              <w:t>Pattern</w:t>
             </w:r>
           </w:p>
         </w:tc>
@@ -2261,7 +1937,7 @@
                 <w:b/>
                 <w:sz w:val="20"/>
               </w:rPr>
-              <w:t>Trigger</w:t>
+              <w:t>Matches</w:t>
             </w:r>
           </w:p>
         </w:tc>
@@ -2285,7 +1961,7 @@
               <w:rPr>
                 <w:sz w:val="20"/>
               </w:rPr>
-              <w:t>NEW_DOC</w:t>
+              <w:t>6*</w:t>
             </w:r>
           </w:p>
         </w:tc>
@@ -2304,7 +1980,7 @@
               <w:rPr>
                 <w:sz w:val="20"/>
               </w:rPr>
-              <w:t>"Page 1 of N" footer, DOCUMENT N OF N marker, or a prominent ALL-CAPS title</w:t>
+              <w:t>All files starting with "6" (e.g. 600156961.pdf, 600157748.pdf)</w:t>
             </w:r>
           </w:p>
         </w:tc>
@@ -2328,7 +2004,7 @@
               <w:rPr>
                 <w:sz w:val="20"/>
               </w:rPr>
-              <w:t>CONTINUATION</w:t>
+              <w:t>Sample-*</w:t>
             </w:r>
           </w:p>
         </w:tc>
@@ -2347,7 +2023,7 @@
               <w:rPr>
                 <w:sz w:val="20"/>
               </w:rPr>
-              <w:t>"Page N of M" (N &gt; 1), or a page-total change between adjacent forms</w:t>
+              <w:t>All files starting with "Sample-" (e.g. Sample-1.pdf, Sample-2.pdf)</w:t>
             </w:r>
           </w:p>
         </w:tc>
@@ -2371,7 +2047,7 @@
               <w:rPr>
                 <w:sz w:val="20"/>
               </w:rPr>
-              <w:t>AMBIGUOUS</w:t>
+              <w:t>RouteOne*</w:t>
             </w:r>
           </w:p>
         </w:tc>
@@ -2390,30 +2066,378 @@
               <w:rPr>
                 <w:sz w:val="20"/>
               </w:rPr>
-              <w:t>No boundary detected — attached to the preceding document</w:t>
+              <w:t>All files starting with "RouteOne" (e.g. RouteOne.pdf)</w:t>
+            </w:r>
+          </w:p>
+        </w:tc>
+      </w:tr>
+      <w:tr>
+        <w:trPr>
+          <w:cantSplit/>
+        </w:trPr>
+        <w:tc>
+          <w:tcPr>
+            <w:tcW w:w="4320" w:type="dxa"/>
+          </w:tcPr>
+          <w:p>
+            <w:pPr>
+              <w:rPr>
+                <w:sz w:val="20"/>
+                <w:szCs w:val="20"/>
+              </w:rPr>
+            </w:pPr>
+            <w:r>
+              <w:rPr>
+                <w:sz w:val="20"/>
+              </w:rPr>
+              <w:t>*.pdf</w:t>
+            </w:r>
+          </w:p>
+        </w:tc>
+        <w:tc>
+          <w:tcPr>
+            <w:tcW w:w="4320" w:type="dxa"/>
+          </w:tcPr>
+          <w:p>
+            <w:pPr>
+              <w:rPr>
+                <w:sz w:val="20"/>
+                <w:szCs w:val="20"/>
+              </w:rPr>
+            </w:pPr>
+            <w:r>
+              <w:rPr>
+                <w:sz w:val="20"/>
+              </w:rPr>
+              <w:t>All PDF files (equivalent to option 2: process all)</w:t>
             </w:r>
           </w:p>
         </w:tc>
       </w:tr>
     </w:tbl>
     <w:p>
-      <w:r>
-        <w:t>The grouper collects consecutive pages into runs and writes one output PDF per run.</w:t>
-      </w:r>
+      <w:pPr>
+        <w:pStyle w:val="Heading2"/>
+      </w:pPr>
     </w:p>
     <w:p>
       <w:pPr>
+        <w:pStyle w:val="Heading2"/>
+      </w:pPr>
+      <w:r>
+        <w:t>Configuration (run-config.json)</w:t>
+      </w:r>
+    </w:p>
+    <w:p>
+      <w:r>
+        <w:t>Settings are saved to run-config.json in the repository root. This allows different machines or users to have different input/output paths without modifying the script. Select "Configure settings" (option 5 in Local mode) to change paths; they persist across sessions.</w:t>
+      </w:r>
+    </w:p>
+    <w:p>
+      <w:r>
+        <w:t>Example run-config.json:</w:t>
+      </w:r>
+    </w:p>
+    <w:p>
+      <w:pPr>
+        <w:ind w:left="576"/>
+      </w:pPr>
+      <w:r>
         <w:rPr>
-          <w:rFonts w:asciiTheme="majorHAnsi" w:eastAsiaTheme="majorEastAsia" w:hAnsiTheme="majorHAnsi" w:cstheme="majorBidi"/>
-          <w:b/>
-          <w:bCs/>
-          <w:color w:val="4F81BD" w:themeColor="accent1"/>
-          <w:sz w:val="26"/>
-          <w:szCs w:val="26"/>
+          <w:rFonts w:ascii="Courier New" w:hAnsi="Courier New"/>
+          <w:color w:val="1F507D"/>
+          <w:sz w:val="18"/>
         </w:rPr>
+        <w:t>{</w:t>
+      </w:r>
+      <w:r>
+        <w:rPr>
+          <w:rFonts w:ascii="Courier New" w:hAnsi="Courier New"/>
+          <w:color w:val="1F507D"/>
+          <w:sz w:val="18"/>
+        </w:rPr>
+        <w:br/>
+        <w:t xml:space="preserve">  "data_dir": "D:\\PDFs\\ToProcess",</w:t>
+      </w:r>
+      <w:r>
+        <w:rPr>
+          <w:rFonts w:ascii="Courier New" w:hAnsi="Courier New"/>
+          <w:color w:val="1F507D"/>
+          <w:sz w:val="18"/>
+        </w:rPr>
+        <w:br/>
+        <w:t xml:space="preserve">  "output_dir": "D:\\PDFs\\Results",</w:t>
+      </w:r>
+      <w:r>
+        <w:rPr>
+          <w:rFonts w:ascii="Courier New" w:hAnsi="Courier New"/>
+          <w:color w:val="1F507D"/>
+          <w:sz w:val="18"/>
+        </w:rPr>
+        <w:br/>
+      </w:r>
+      <w:r>
+        <w:rPr>
+          <w:rFonts w:ascii="Courier New" w:hAnsi="Courier New"/>
+          <w:color w:val="1F507D"/>
+          <w:sz w:val="18"/>
+        </w:rPr>
+        <w:t xml:space="preserve">  "log_dir": "D:\\PDFs\\Results\\job-logs",</w:t>
+      </w:r>
+      <w:r>
+        <w:rPr>
+          <w:rFonts w:ascii="Courier New" w:hAnsi="Courier New"/>
+          <w:color w:val="1F507D"/>
+          <w:sz w:val="18"/>
+        </w:rPr>
+        <w:br/>
+        <w:t xml:space="preserve">  "last_updated": "2026-05-12 14:30:00"</w:t>
+      </w:r>
+      <w:r>
+        <w:rPr>
+          <w:rFonts w:ascii="Courier New" w:hAnsi="Courier New"/>
+          <w:color w:val="1F507D"/>
+          <w:sz w:val="18"/>
+        </w:rPr>
+        <w:br/>
+        <w:t>}</w:t>
+      </w:r>
+    </w:p>
+    <w:p>
+      <w:pPr>
+        <w:pStyle w:val="Heading1"/>
       </w:pPr>
       <w:r>
-        <w:br w:type="page"/>
+        <w:t>3. Code Architecture</w:t>
+      </w:r>
+    </w:p>
+    <w:p>
+      <w:pPr>
+        <w:pStyle w:val="Heading2"/>
+      </w:pPr>
+      <w:r>
+        <w:t>Splitting Pipeline  (image_splitter.py)</w:t>
+      </w:r>
+    </w:p>
+    <w:p>
+      <w:r>
+        <w:t>Every page passes through a unified analysis function regardless of content type:</w:t>
+      </w:r>
+    </w:p>
+    <w:p>
+      <w:pPr>
+        <w:pStyle w:val="ListBullet"/>
+      </w:pPr>
+      <w:r>
+        <w:t>Digital text pages: text is analyzed directly for structural signals.</w:t>
+      </w:r>
+    </w:p>
+    <w:p>
+      <w:pPr>
+        <w:pStyle w:val="ListBullet"/>
+      </w:pPr>
+      <w:r>
+        <w:t>Scanned image pages: First renders the page at 150 DPI, then PaddleOCR extracts text.</w:t>
+      </w:r>
+    </w:p>
+    <w:p>
+      <w:pPr>
+        <w:spacing w:after="0"/>
+      </w:pPr>
+      <w:r>
+        <w:t>Each page produces a PageSignal with one of three classifications:</w:t>
+      </w:r>
+    </w:p>
+    <w:p/>
+    <w:tbl>
+      <w:tblPr>
+        <w:tblStyle w:val="TableGrid"/>
+        <w:tblW w:w="0" w:type="auto"/>
+        <w:tblLook w:val="04A0" w:firstRow="1" w:lastRow="0" w:firstColumn="1" w:lastColumn="0" w:noHBand="0" w:noVBand="1"/>
+      </w:tblPr>
+      <w:tblGrid>
+        <w:gridCol w:w="4320"/>
+        <w:gridCol w:w="4320"/>
+      </w:tblGrid>
+      <w:tr>
+        <w:trPr>
+          <w:cantSplit/>
+        </w:trPr>
+        <w:tc>
+          <w:tcPr>
+            <w:tcW w:w="4320" w:type="dxa"/>
+          </w:tcPr>
+          <w:p>
+            <w:pPr>
+              <w:rPr>
+                <w:sz w:val="20"/>
+                <w:szCs w:val="20"/>
+              </w:rPr>
+            </w:pPr>
+            <w:r>
+              <w:rPr>
+                <w:b/>
+                <w:sz w:val="20"/>
+              </w:rPr>
+              <w:t>Classification</w:t>
+            </w:r>
+          </w:p>
+        </w:tc>
+        <w:tc>
+          <w:tcPr>
+            <w:tcW w:w="4320" w:type="dxa"/>
+          </w:tcPr>
+          <w:p>
+            <w:pPr>
+              <w:rPr>
+                <w:sz w:val="20"/>
+                <w:szCs w:val="20"/>
+              </w:rPr>
+            </w:pPr>
+            <w:r>
+              <w:rPr>
+                <w:b/>
+                <w:sz w:val="20"/>
+              </w:rPr>
+              <w:t>Trigger</w:t>
+            </w:r>
+          </w:p>
+        </w:tc>
+      </w:tr>
+      <w:tr>
+        <w:trPr>
+          <w:cantSplit/>
+        </w:trPr>
+        <w:tc>
+          <w:tcPr>
+            <w:tcW w:w="4320" w:type="dxa"/>
+          </w:tcPr>
+          <w:p>
+            <w:pPr>
+              <w:rPr>
+                <w:sz w:val="20"/>
+                <w:szCs w:val="20"/>
+              </w:rPr>
+            </w:pPr>
+            <w:r>
+              <w:rPr>
+                <w:sz w:val="20"/>
+              </w:rPr>
+              <w:t>NEW_DOC</w:t>
+            </w:r>
+          </w:p>
+        </w:tc>
+        <w:tc>
+          <w:tcPr>
+            <w:tcW w:w="4320" w:type="dxa"/>
+          </w:tcPr>
+          <w:p>
+            <w:pPr>
+              <w:rPr>
+                <w:sz w:val="20"/>
+                <w:szCs w:val="20"/>
+              </w:rPr>
+            </w:pPr>
+            <w:r>
+              <w:rPr>
+                <w:sz w:val="20"/>
+              </w:rPr>
+              <w:t>"Page 1 of N" footer, DOCUMENT N OF N marker, or a prominent ALL-CAPS title</w:t>
+            </w:r>
+          </w:p>
+        </w:tc>
+      </w:tr>
+      <w:tr>
+        <w:trPr>
+          <w:cantSplit/>
+        </w:trPr>
+        <w:tc>
+          <w:tcPr>
+            <w:tcW w:w="4320" w:type="dxa"/>
+          </w:tcPr>
+          <w:p>
+            <w:pPr>
+              <w:rPr>
+                <w:sz w:val="20"/>
+                <w:szCs w:val="20"/>
+              </w:rPr>
+            </w:pPr>
+            <w:r>
+              <w:rPr>
+                <w:sz w:val="20"/>
+              </w:rPr>
+              <w:t>CONTINUATION</w:t>
+            </w:r>
+          </w:p>
+        </w:tc>
+        <w:tc>
+          <w:tcPr>
+            <w:tcW w:w="4320" w:type="dxa"/>
+          </w:tcPr>
+          <w:p>
+            <w:pPr>
+              <w:rPr>
+                <w:sz w:val="20"/>
+                <w:szCs w:val="20"/>
+              </w:rPr>
+            </w:pPr>
+            <w:r>
+              <w:rPr>
+                <w:sz w:val="20"/>
+              </w:rPr>
+              <w:t>"Page N of M" (N &gt; 1), or a page-total change between adjacent forms</w:t>
+            </w:r>
+          </w:p>
+        </w:tc>
+      </w:tr>
+      <w:tr>
+        <w:trPr>
+          <w:cantSplit/>
+        </w:trPr>
+        <w:tc>
+          <w:tcPr>
+            <w:tcW w:w="4320" w:type="dxa"/>
+          </w:tcPr>
+          <w:p>
+            <w:pPr>
+              <w:rPr>
+                <w:sz w:val="20"/>
+                <w:szCs w:val="20"/>
+              </w:rPr>
+            </w:pPr>
+            <w:r>
+              <w:rPr>
+                <w:sz w:val="20"/>
+              </w:rPr>
+              <w:t>AMBIGUOUS</w:t>
+            </w:r>
+          </w:p>
+        </w:tc>
+        <w:tc>
+          <w:tcPr>
+            <w:tcW w:w="4320" w:type="dxa"/>
+          </w:tcPr>
+          <w:p>
+            <w:pPr>
+              <w:rPr>
+                <w:sz w:val="20"/>
+                <w:szCs w:val="20"/>
+              </w:rPr>
+            </w:pPr>
+            <w:r>
+              <w:rPr>
+                <w:sz w:val="20"/>
+              </w:rPr>
+              <w:t>No boundary detected — attached to the preceding document</w:t>
+            </w:r>
+          </w:p>
+        </w:tc>
+      </w:tr>
+    </w:tbl>
+    <w:p/>
+    <w:p>
+      <w:r>
+        <w:t>The grouper collects consecutive pages into runs and writes one output PDF per run.</w:t>
       </w:r>
     </w:p>
     <w:p>
@@ -2671,7 +2695,14 @@
           <w:sz w:val="18"/>
         </w:rPr>
         <w:br/>
-        <w:t xml:space="preserve">  +----------+----------+     +----------+----------+     +----------+----------+</w:t>
+        <w:t xml:space="preserve">  +</w:t>
+      </w:r>
+      <w:r>
+        <w:rPr>
+          <w:rFonts w:ascii="Courier New" w:hAnsi="Courier New"/>
+          <w:sz w:val="18"/>
+        </w:rPr>
+        <w:t>----------+----------+     +----------+----------+     +----------+----------+</w:t>
       </w:r>
       <w:r>
         <w:rPr>
@@ -2719,7 +2750,14 @@
           <w:sz w:val="18"/>
         </w:rPr>
         <w:br/>
-        <w:t xml:space="preserve">  page is in Chunk 1          page is in Chunk 2          page is in Chunk 3</w:t>
+        <w:t xml:space="preserve">  page is in Chunk 1          page is in </w:t>
+      </w:r>
+      <w:r>
+        <w:rPr>
+          <w:rFonts w:ascii="Courier New" w:hAnsi="Courier New"/>
+          <w:sz w:val="18"/>
+        </w:rPr>
+        <w:t>Chunk 2          page is in Chunk 3</w:t>
       </w:r>
       <w:r>
         <w:rPr>
@@ -2978,7 +3016,14 @@
           <w:sz w:val="18"/>
         </w:rPr>
         <w:br/>
-        <w:t xml:space="preserve">         | ........ |</w:t>
+        <w:t xml:space="preserve">         | ......</w:t>
+      </w:r>
+      <w:r>
+        <w:rPr>
+          <w:rFonts w:ascii="Courier New" w:hAnsi="Courier New"/>
+          <w:sz w:val="18"/>
+        </w:rPr>
+        <w:t>.. |</w:t>
       </w:r>
       <w:r>
         <w:rPr>
@@ -3101,7 +3146,14 @@
           <w:sz w:val="18"/>
         </w:rPr>
         <w:br/>
-        <w:t xml:space="preserve">         Our threshold = 10 bits out of 64  (~84% visual similarity)</w:t>
+        <w:t xml:space="preserve">       </w:t>
+      </w:r>
+      <w:r>
+        <w:rPr>
+          <w:rFonts w:ascii="Courier New" w:hAnsi="Courier New"/>
+          <w:sz w:val="18"/>
+        </w:rPr>
+        <w:t xml:space="preserve">  Our threshold = 10 bits out of 64  (~84% visual similarity)</w:t>
       </w:r>
       <w:r>
         <w:rPr>
@@ -4199,7 +4251,6 @@
         <w:pStyle w:val="Heading1"/>
       </w:pPr>
       <w:r>
-        <w:lastRenderedPageBreak/>
         <w:t>7. Current Hardware Limitations and Upgrade Path</w:t>
       </w:r>
     </w:p>
@@ -4218,6 +4269,7 @@
     </w:p>
     <w:p>
       <w:r>
+        <w:lastRenderedPageBreak/>
         <w:t>The sliding-window chunking feature (Section 3.3) eliminates this constraint. Because only two 20-page chunk files are held in RAM at any time, the tool can now process files of any size on the standard 8 GiB Consumption plan. Validation: the 3,900-page batch file 602819077.pdf completed successfully in 1 h 42 min without any hardware upgrade.</w:t>
       </w:r>
     </w:p>
@@ -4387,6 +4439,13 @@
                 <w:szCs w:val="20"/>
               </w:rPr>
               <w:br/>
+            </w:r>
+            <w:r>
+              <w:rPr>
+                <w:b/>
+                <w:sz w:val="20"/>
+                <w:szCs w:val="20"/>
+              </w:rPr>
               <w:t>(24 hrs)</w:t>
             </w:r>
           </w:p>
@@ -4639,21 +4698,12 @@
                 <w:szCs w:val="20"/>
               </w:rPr>
             </w:pPr>
-            <w:proofErr w:type="gramStart"/>
-            <w:r>
-              <w:rPr>
-                <w:sz w:val="20"/>
-                <w:szCs w:val="20"/>
-              </w:rPr>
-              <w:t>Similar to</w:t>
-            </w:r>
-            <w:proofErr w:type="gramEnd"/>
-            <w:r>
-              <w:rPr>
-                <w:sz w:val="20"/>
-                <w:szCs w:val="20"/>
-              </w:rPr>
-              <w:t xml:space="preserve"> Consumption but reserved</w:t>
+            <w:r>
+              <w:rPr>
+                <w:sz w:val="20"/>
+                <w:szCs w:val="20"/>
+              </w:rPr>
+              <w:t>Similar to Consumption but reserved</w:t>
             </w:r>
           </w:p>
         </w:tc>
@@ -5180,15 +5230,7 @@
       </w:pPr>
       <w:r>
         <w:lastRenderedPageBreak/>
-        <w:t xml:space="preserve">Cost Comparison: 1 </w:t>
-      </w:r>
-      <w:proofErr w:type="gramStart"/>
-      <w:r>
-        <w:t>Million</w:t>
-      </w:r>
-      <w:proofErr w:type="gramEnd"/>
-      <w:r>
-        <w:t xml:space="preserve"> Output Documents Across Hardware Tiers</w:t>
+        <w:t>Cost Comparison: 1 Million Output Documents Across Hardware Tiers</w:t>
       </w:r>
     </w:p>
     <w:p>
@@ -5203,7 +5245,7 @@
         <w:tblLook w:val="04A0" w:firstRow="1" w:lastRow="0" w:firstColumn="1" w:lastColumn="0" w:noHBand="0" w:noVBand="1"/>
       </w:tblPr>
       <w:tblGrid>
-        <w:gridCol w:w="1476"/>
+        <w:gridCol w:w="1440"/>
         <w:gridCol w:w="1440"/>
         <w:gridCol w:w="1440"/>
         <w:gridCol w:w="1440"/>
@@ -6178,14 +6220,7 @@
               <w:rPr>
                 <w:sz w:val="20"/>
               </w:rPr>
-              <w:t xml:space="preserve">~$1.10 / </w:t>
-            </w:r>
-            <w:r>
-              <w:rPr>
-                <w:sz w:val="20"/>
-              </w:rPr>
-              <w:lastRenderedPageBreak/>
-              <w:t>always-on</w:t>
+              <w:t>~$1.10 / always-on</w:t>
             </w:r>
           </w:p>
         </w:tc>
@@ -6204,7 +6239,6 @@
               <w:rPr>
                 <w:sz w:val="20"/>
               </w:rPr>
-              <w:lastRenderedPageBreak/>
               <w:t>~$26.40 / day</w:t>
             </w:r>
           </w:p>
@@ -6313,7 +6347,11 @@
     </w:tbl>
     <w:p>
       <w:r>
-        <w:t>Conclusion: the Consumption plan at 4 vCPU / 8 GiB is the cost-optimal choice for this workload. The 8 GiB ceiling is sufficient for typical deal jacket files without any model configuration changes, and pay-per-use billing eliminates idle cost entirely. For files that exceed the memory ceiling, pre-splitting the source PDF is the recommended solution before considering a dedicated plan upgrade.</w:t>
+        <w:t xml:space="preserve">Conclusion: the Consumption plan at 4 vCPU / 8 GiB is the cost-optimal choice for this workload. The 8 GiB ceiling is sufficient for typical deal jacket files without any model </w:t>
+      </w:r>
+      <w:r>
+        <w:lastRenderedPageBreak/>
+        <w:t>configuration changes, and pay-per-use billing eliminates idle cost entirely. For files that exceed the memory ceiling, pre-splitting the source PDF is the recommended solution before considering a dedicated plan upgrade.</w:t>
       </w:r>
     </w:p>
     <w:p>
@@ -6329,7 +6367,10 @@
     </w:p>
     <w:p>
       <w:r>
-        <w:t>The windowed chunking approach is built around a specific hardware constraint: PaddleOCR loads its neural network models into RAM at startup and holds them for the duration of the run (approximately 2-3 GB). On an 8 GiB Azure Consumption instance this leaves only 5-6 GB for the source document itself. A naive implementation that decodes the entire source PDF into memory at once would exhaust RAM for any file larger than a few hundred pages -- making the tool impractical for the large deal jackets it was built to handle.</w:t>
+        <w:t>The windowed chunking approach is built around a specific hardware constraint: PaddleOCR loads its neural network models into RAM at startup and holds them for the duration of the run (approximately 2-3 GB). On an 8 GiB Azure Consumption instance this leaves only 5-6 GB for the source document itself. A naive implementation that decodes the entire source PDF into memory at once would exhaust RAM for any file larger than a few hundred pages -- making the tool impractical for the large deal jackets it was bui</w:t>
+      </w:r>
+      <w:r>
+        <w:t>lt to handle.</w:t>
       </w:r>
       <w:r>
         <w:br/>
@@ -6343,14 +6384,20 @@
       </w:r>
       <w:r>
         <w:br/>
-        <w:t>The two-chunk window also solves the boundary problem: a document whose pages straddle a chunk boundary is always seen whole within a single window and emitted as one correct output file. No document is silently split across the boundary.</w:t>
+        <w:t>The two-chunk window also solves the boundary problem: a d</w:t>
+      </w:r>
+      <w:r>
+        <w:t>ocument whose pages straddle a chunk boundary is always seen whole within a single window and emitted as one correct output file. No document is silently split across the boundary.</w:t>
       </w:r>
       <w:r>
         <w:br/>
       </w:r>
       <w:r>
         <w:br/>
-        <w:t>The practical result: a 3,900-page scanned deal jacket (602819077.pdf) that would have failed immediately on 8 GiB hardware without windowed chunking completed in 1 hour 42 minutes on a 4 vCPU / 8 GiB Azure Consumption instance, producing 27 correctly split output documents. The source file size is now irrelevant -- only the chunk size (20 pages) determines how much RAM the tool uses at any moment.</w:t>
+        <w:t>The practical result: a 3,900-page scanned deal jacket (602819077.pdf) that would have failed immediately on 8 GiB hardware without windowed chunking completed in 1 hour 42 minutes on a 4 vCPU / 8 GiB Azure Consumption instance, producing 27 correctly split output documents. The source file size is now irrelevant -- only the chu</w:t>
+      </w:r>
+      <w:r>
+        <w:t>nk size (20 pages) determines how much RAM the tool uses at any moment.</w:t>
       </w:r>
     </w:p>
     <w:sectPr>
@@ -7000,7 +7047,6 @@
       <w:b/>
       <w:bCs/>
       <w:color w:val="4F81BD" w:themeColor="accent1"/>
-      <w:sz w:val="22"/>
       <w:szCs w:val="26"/>
     </w:rPr>
   </w:style>

</xml_diff>

<commit_message>
docs: record validated throughput trials and update Section 6 cost baseline
- trial_stats.md: complete Job 1b (603110820.pdf, 457pp, 238 pp/hr, $0.847)
  and Job 3 (602954198.pdf, 152pp, 549 pp/hr, $0.122) with full stats
- PDF_split_and_Mine.docx Section 6: replace unvalidated 73 docs/hr estimate
  with validated cost-per-source-page baseline from three timed runs;
  update Table 8 metrics, Table 10 1M-doc estimate, Table 6 timeout row,
  and apply SFS formatting standards throughout

Generated with Claude Code
</commit_message>
<xml_diff>
--- a/PDF_split_and_Mine.docx
+++ b/PDF_split_and_Mine.docx
@@ -20,6 +20,9 @@
         <w:pStyle w:val="Heading1"/>
       </w:pPr>
       <w:r>
+        <w:rPr>
+          <w:sz w:val="24"/>
+        </w:rPr>
         <w:t>1. What It Does</w:t>
       </w:r>
     </w:p>
@@ -33,6 +36,9 @@
         <w:pStyle w:val="Heading1"/>
       </w:pPr>
       <w:r>
+        <w:rPr>
+          <w:sz w:val="24"/>
+        </w:rPr>
         <w:t>2. How to Use run.ps1</w:t>
       </w:r>
     </w:p>
@@ -46,6 +52,9 @@
         <w:pStyle w:val="Heading2"/>
       </w:pPr>
       <w:r>
+        <w:rPr>
+          <w:sz w:val="22"/>
+        </w:rPr>
         <w:t>Quick Start</w:t>
       </w:r>
     </w:p>
@@ -90,6 +99,9 @@
         <w:pStyle w:val="Heading2"/>
       </w:pPr>
       <w:r>
+        <w:rPr>
+          <w:sz w:val="22"/>
+        </w:rPr>
         <w:t>One-Time Setup</w:t>
       </w:r>
     </w:p>
@@ -179,6 +191,9 @@
         <w:pStyle w:val="Heading2"/>
       </w:pPr>
       <w:r>
+        <w:rPr>
+          <w:sz w:val="22"/>
+        </w:rPr>
         <w:t>Input and Output Locations</w:t>
       </w:r>
     </w:p>
@@ -224,6 +239,7 @@
       <w:tr>
         <w:trPr>
           <w:cantSplit/>
+          <w:cantSplit/>
         </w:trPr>
         <w:tc>
           <w:tcPr>
@@ -290,6 +306,7 @@
       <w:tr>
         <w:trPr>
           <w:cantSplit/>
+          <w:cantSplit/>
         </w:trPr>
         <w:tc>
           <w:tcPr>
@@ -352,6 +369,7 @@
       <w:tr>
         <w:trPr>
           <w:cantSplit/>
+          <w:cantSplit/>
         </w:trPr>
         <w:tc>
           <w:tcPr>
@@ -414,6 +432,7 @@
       <w:tr>
         <w:trPr>
           <w:cantSplit/>
+          <w:cantSplit/>
         </w:trPr>
         <w:tc>
           <w:tcPr>
@@ -475,6 +494,7 @@
       </w:tr>
       <w:tr>
         <w:trPr>
+          <w:cantSplit/>
           <w:cantSplit/>
         </w:trPr>
         <w:tc>
@@ -541,6 +561,9 @@
         <w:pStyle w:val="Heading2"/>
       </w:pPr>
       <w:r>
+        <w:rPr>
+          <w:sz w:val="22"/>
+        </w:rPr>
         <w:t>Local Mode Menu</w:t>
       </w:r>
     </w:p>
@@ -563,6 +586,7 @@
       <w:tr>
         <w:trPr>
           <w:cantSplit/>
+          <w:cantSplit/>
         </w:trPr>
         <w:tc>
           <w:tcPr>
@@ -628,6 +652,7 @@
       <w:tr>
         <w:trPr>
           <w:cantSplit/>
+          <w:cantSplit/>
         </w:trPr>
         <w:tc>
           <w:tcPr>
@@ -690,6 +715,7 @@
       <w:tr>
         <w:trPr>
           <w:cantSplit/>
+          <w:cantSplit/>
         </w:trPr>
         <w:tc>
           <w:tcPr>
@@ -752,6 +778,7 @@
       <w:tr>
         <w:trPr>
           <w:cantSplit/>
+          <w:cantSplit/>
         </w:trPr>
         <w:tc>
           <w:tcPr>
@@ -814,6 +841,7 @@
       <w:tr>
         <w:trPr>
           <w:cantSplit/>
+          <w:cantSplit/>
         </w:trPr>
         <w:tc>
           <w:tcPr>
@@ -876,6 +904,7 @@
       <w:tr>
         <w:trPr>
           <w:cantSplit/>
+          <w:cantSplit/>
         </w:trPr>
         <w:tc>
           <w:tcPr>
@@ -938,6 +967,7 @@
       <w:tr>
         <w:trPr>
           <w:cantSplit/>
+          <w:cantSplit/>
         </w:trPr>
         <w:tc>
           <w:tcPr>
@@ -999,6 +1029,7 @@
       </w:tr>
       <w:tr>
         <w:trPr>
+          <w:cantSplit/>
           <w:cantSplit/>
         </w:trPr>
         <w:tc>
@@ -1090,6 +1121,9 @@
         <w:spacing w:before="0"/>
       </w:pPr>
       <w:r>
+        <w:rPr>
+          <w:sz w:val="22"/>
+        </w:rPr>
         <w:lastRenderedPageBreak/>
         <w:t>Azure Mode Menu</w:t>
       </w:r>
@@ -1113,6 +1147,7 @@
       <w:tr>
         <w:trPr>
           <w:cantSplit/>
+          <w:cantSplit/>
         </w:trPr>
         <w:tc>
           <w:tcPr>
@@ -1178,6 +1213,7 @@
       <w:tr>
         <w:trPr>
           <w:cantSplit/>
+          <w:cantSplit/>
         </w:trPr>
         <w:tc>
           <w:tcPr>
@@ -1240,6 +1276,7 @@
       <w:tr>
         <w:trPr>
           <w:cantSplit/>
+          <w:cantSplit/>
         </w:trPr>
         <w:tc>
           <w:tcPr>
@@ -1302,6 +1339,7 @@
       <w:tr>
         <w:trPr>
           <w:cantSplit/>
+          <w:cantSplit/>
         </w:trPr>
         <w:tc>
           <w:tcPr>
@@ -1364,6 +1402,7 @@
       <w:tr>
         <w:trPr>
           <w:cantSplit/>
+          <w:cantSplit/>
         </w:trPr>
         <w:tc>
           <w:tcPr>
@@ -1426,6 +1465,7 @@
       <w:tr>
         <w:trPr>
           <w:cantSplit/>
+          <w:cantSplit/>
         </w:trPr>
         <w:tc>
           <w:tcPr>
@@ -1488,6 +1528,7 @@
       <w:tr>
         <w:trPr>
           <w:cantSplit/>
+          <w:cantSplit/>
         </w:trPr>
         <w:tc>
           <w:tcPr>
@@ -1549,6 +1590,7 @@
       </w:tr>
       <w:tr>
         <w:trPr>
+          <w:cantSplit/>
           <w:cantSplit/>
         </w:trPr>
         <w:tc>
@@ -1620,6 +1662,9 @@
         <w:pStyle w:val="Heading2"/>
       </w:pPr>
       <w:r>
+        <w:rPr>
+          <w:sz w:val="22"/>
+        </w:rPr>
         <w:t>Non-Interactive (Command-Line) Usage</w:t>
       </w:r>
     </w:p>
@@ -1641,6 +1686,7 @@
       <w:tr>
         <w:trPr>
           <w:cantSplit/>
+          <w:cantSplit/>
         </w:trPr>
         <w:tc>
           <w:tcPr>
@@ -1686,6 +1732,7 @@
       <w:tr>
         <w:trPr>
           <w:cantSplit/>
+          <w:cantSplit/>
         </w:trPr>
         <w:tc>
           <w:tcPr>
@@ -1729,6 +1776,7 @@
       <w:tr>
         <w:trPr>
           <w:cantSplit/>
+          <w:cantSplit/>
         </w:trPr>
         <w:tc>
           <w:tcPr>
@@ -1772,6 +1820,7 @@
       <w:tr>
         <w:trPr>
           <w:cantSplit/>
+          <w:cantSplit/>
         </w:trPr>
         <w:tc>
           <w:tcPr>
@@ -1814,6 +1863,7 @@
       </w:tr>
       <w:tr>
         <w:trPr>
+          <w:cantSplit/>
           <w:cantSplit/>
         </w:trPr>
         <w:tc>
@@ -1882,6 +1932,9 @@
         <w:spacing w:line="240" w:lineRule="auto"/>
       </w:pPr>
       <w:r>
+        <w:rPr>
+          <w:sz w:val="22"/>
+        </w:rPr>
         <w:lastRenderedPageBreak/>
         <w:t>Pattern Matching Examples (Local Mode, Option 3)</w:t>
       </w:r>
@@ -1900,6 +1953,7 @@
       <w:tr>
         <w:trPr>
           <w:cantSplit/>
+          <w:cantSplit/>
         </w:trPr>
         <w:tc>
           <w:tcPr>
@@ -1945,6 +1999,7 @@
       <w:tr>
         <w:trPr>
           <w:cantSplit/>
+          <w:cantSplit/>
         </w:trPr>
         <w:tc>
           <w:tcPr>
@@ -1988,6 +2043,7 @@
       <w:tr>
         <w:trPr>
           <w:cantSplit/>
+          <w:cantSplit/>
         </w:trPr>
         <w:tc>
           <w:tcPr>
@@ -2031,6 +2087,7 @@
       <w:tr>
         <w:trPr>
           <w:cantSplit/>
+          <w:cantSplit/>
         </w:trPr>
         <w:tc>
           <w:tcPr>
@@ -2073,6 +2130,7 @@
       </w:tr>
       <w:tr>
         <w:trPr>
+          <w:cantSplit/>
           <w:cantSplit/>
         </w:trPr>
         <w:tc>
@@ -2125,6 +2183,9 @@
         <w:pStyle w:val="Heading2"/>
       </w:pPr>
       <w:r>
+        <w:rPr>
+          <w:sz w:val="22"/>
+        </w:rPr>
         <w:t>Configuration (run-config.json)</w:t>
       </w:r>
     </w:p>
@@ -2208,6 +2269,9 @@
         <w:pStyle w:val="Heading1"/>
       </w:pPr>
       <w:r>
+        <w:rPr>
+          <w:sz w:val="24"/>
+        </w:rPr>
         <w:t>3. Code Architecture</w:t>
       </w:r>
     </w:p>
@@ -2216,6 +2280,9 @@
         <w:pStyle w:val="Heading2"/>
       </w:pPr>
       <w:r>
+        <w:rPr>
+          <w:sz w:val="22"/>
+        </w:rPr>
         <w:t>Splitting Pipeline  (image_splitter.py)</w:t>
       </w:r>
     </w:p>
@@ -2262,6 +2329,7 @@
       <w:tr>
         <w:trPr>
           <w:cantSplit/>
+          <w:cantSplit/>
         </w:trPr>
         <w:tc>
           <w:tcPr>
@@ -2307,6 +2375,7 @@
       <w:tr>
         <w:trPr>
           <w:cantSplit/>
+          <w:cantSplit/>
         </w:trPr>
         <w:tc>
           <w:tcPr>
@@ -2350,6 +2419,7 @@
       <w:tr>
         <w:trPr>
           <w:cantSplit/>
+          <w:cantSplit/>
         </w:trPr>
         <w:tc>
           <w:tcPr>
@@ -2392,6 +2462,7 @@
       </w:tr>
       <w:tr>
         <w:trPr>
+          <w:cantSplit/>
           <w:cantSplit/>
         </w:trPr>
         <w:tc>
@@ -2445,6 +2516,9 @@
         <w:pStyle w:val="Heading2"/>
       </w:pPr>
       <w:r>
+        <w:rPr>
+          <w:sz w:val="22"/>
+        </w:rPr>
         <w:lastRenderedPageBreak/>
         <w:t>Opt-In Extraction  (opt_in_extractor.py)</w:t>
       </w:r>
@@ -2594,6 +2668,7 @@
       <w:r>
         <w:rPr>
           <w:b w:val="0"/>
+          <w:sz w:val="22"/>
         </w:rPr>
         <w:lastRenderedPageBreak/>
         <w:t>3.3  Large-File Processing: Sliding Window</w:t>
@@ -2854,6 +2929,7 @@
       <w:r>
         <w:rPr>
           <w:b w:val="0"/>
+          <w:sz w:val="22"/>
         </w:rPr>
         <w:t>3.4  Duplicate Detection and Perceptual Hashing</w:t>
       </w:r>
@@ -3189,6 +3265,9 @@
         <w:pStyle w:val="Heading1"/>
       </w:pPr>
       <w:r>
+        <w:rPr>
+          <w:sz w:val="24"/>
+        </w:rPr>
         <w:t>4. Execution Flow (Azure Mode)</w:t>
       </w:r>
     </w:p>
@@ -3274,6 +3353,9 @@
         <w:pStyle w:val="Heading1"/>
       </w:pPr>
       <w:r>
+        <w:rPr>
+          <w:sz w:val="24"/>
+        </w:rPr>
         <w:lastRenderedPageBreak/>
         <w:t>5. Compute Configuration</w:t>
       </w:r>
@@ -3291,6 +3373,7 @@
       <w:tr>
         <w:trPr>
           <w:cantSplit/>
+          <w:cantSplit/>
         </w:trPr>
         <w:tc>
           <w:tcPr>
@@ -3336,6 +3419,7 @@
       <w:tr>
         <w:trPr>
           <w:cantSplit/>
+          <w:cantSplit/>
         </w:trPr>
         <w:tc>
           <w:tcPr>
@@ -3379,6 +3463,7 @@
       <w:tr>
         <w:trPr>
           <w:cantSplit/>
+          <w:cantSplit/>
         </w:trPr>
         <w:tc>
           <w:tcPr>
@@ -3422,6 +3507,7 @@
       <w:tr>
         <w:trPr>
           <w:cantSplit/>
+          <w:cantSplit/>
         </w:trPr>
         <w:tc>
           <w:tcPr>
@@ -3465,6 +3551,7 @@
       <w:tr>
         <w:trPr>
           <w:cantSplit/>
+          <w:cantSplit/>
         </w:trPr>
         <w:tc>
           <w:tcPr>
@@ -3508,6 +3595,7 @@
       <w:tr>
         <w:trPr>
           <w:cantSplit/>
+          <w:cantSplit/>
         </w:trPr>
         <w:tc>
           <w:tcPr>
@@ -3551,6 +3639,7 @@
       <w:tr>
         <w:trPr>
           <w:cantSplit/>
+          <w:cantSplit/>
         </w:trPr>
         <w:tc>
           <w:tcPr>
@@ -3594,6 +3683,7 @@
       <w:tr>
         <w:trPr>
           <w:cantSplit/>
+          <w:cantSplit/>
         </w:trPr>
         <w:tc>
           <w:tcPr>
@@ -3629,7 +3719,7 @@
               <w:rPr>
                 <w:sz w:val="20"/>
               </w:rPr>
-              <w:t>2 hours (7,200-second timeout)</w:t>
+              <w:t>24 hours (86,400-second timeout)</w:t>
             </w:r>
           </w:p>
         </w:tc>
@@ -3637,6 +3727,7 @@
       <w:tr>
         <w:trPr>
           <w:cantSplit/>
+          <w:cantSplit/>
         </w:trPr>
         <w:tc>
           <w:tcPr>
@@ -3679,6 +3770,7 @@
       </w:tr>
       <w:tr>
         <w:trPr>
+          <w:cantSplit/>
           <w:cantSplit/>
         </w:trPr>
         <w:tc>
@@ -3726,6 +3818,9 @@
         <w:pStyle w:val="Heading1"/>
       </w:pPr>
       <w:r>
+        <w:rPr>
+          <w:sz w:val="24"/>
+        </w:rPr>
         <w:t>6. Cost Estimate</w:t>
       </w:r>
     </w:p>
@@ -3734,6 +3829,9 @@
         <w:pStyle w:val="Heading2"/>
       </w:pPr>
       <w:r>
+        <w:rPr>
+          <w:sz w:val="22"/>
+        </w:rPr>
         <w:t>Per-run billing  (Consumption plan, Central US)</w:t>
       </w:r>
     </w:p>
@@ -3756,6 +3854,7 @@
       <w:tr>
         <w:trPr>
           <w:cantSplit/>
+          <w:cantSplit/>
         </w:trPr>
         <w:tc>
           <w:tcPr>
@@ -3821,6 +3920,7 @@
       <w:tr>
         <w:trPr>
           <w:cantSplit/>
+          <w:cantSplit/>
         </w:trPr>
         <w:tc>
           <w:tcPr>
@@ -3883,6 +3983,7 @@
       <w:tr>
         <w:trPr>
           <w:cantSplit/>
+          <w:cantSplit/>
         </w:trPr>
         <w:tc>
           <w:tcPr>
@@ -3944,6 +4045,7 @@
       </w:tr>
       <w:tr>
         <w:trPr>
+          <w:cantSplit/>
           <w:cantSplit/>
         </w:trPr>
         <w:tc>
@@ -4005,12 +4107,25 @@
         <w:spacing w:before="400"/>
       </w:pPr>
       <w:r>
-        <w:t>Per-million-document estimate  (current hardware: Consumption 4 vCPU / 8 GiB)</w:t>
+        <w:rPr>
+          <w:b/>
+          <w:sz w:val="22"/>
+        </w:rPr>
+        <w:t>Validated Cost Baseline  (2026-05-16 trial runs, Consumption 4 vCPU / 8 GiB)</w:t>
       </w:r>
     </w:p>
     <w:p>
       <w:r>
-        <w:t>A representative 220-page scanned deal jacket (73 output documents) processes in approximately 1 hour, giving a throughput rate of ~73 documents/hour. The 3,900-page batch file 602819077.pdf produced 27 documents in 1 h 42 min (~16 documents/hour) — a lower rate because large batch files contain fewer unique documents per page than smaller deal jackets. PaddleOCR is the throughput bottleneck and runs single-threaded.</w:t>
+        <w:t>Three deal jacket files were timed under production conditions on Azure Container Apps Consumption 4 vCPU / 8 GiB (2026-05-16). Throughput is reported in pages per hour (the stable unit) and cost per source page (the recommended planning unit, since output document count varies by file density).</w:t>
+        <w:br/>
+        <w:br/>
+        <w:t>All-scanned files (every page requires OCR): 238 pages/hour | $0.00185 per source page.  Validated against 603110820.pdf: 457 pages → 36 documents in 1 h 55 m ($0.85 total).</w:t>
+        <w:br/>
+        <w:br/>
+        <w:t>Mixed text+scanned files (typical): 465–549 pages/hour | $0.00080–$0.00094 per source page.  Validated against 601602726.pdf (35 pages → 15 docs in 4.5 min, $0.033) and 602954198.pdf (152 pages → 18 docs in 17 min, $0.12).</w:t>
+        <w:br/>
+        <w:br/>
+        <w:t>PaddleOCR is the throughput bottleneck and runs single-threaded. The all-scanned figure (238 pages/hr) represents the worst case; mixed files are 2–2.3× faster.</w:t>
       </w:r>
     </w:p>
     <w:tbl>
@@ -4026,6 +4141,7 @@
       <w:tr>
         <w:trPr>
           <w:cantSplit/>
+          <w:cantSplit/>
         </w:trPr>
         <w:tc>
           <w:tcPr>
@@ -4071,6 +4187,7 @@
       <w:tr>
         <w:trPr>
           <w:cantSplit/>
+          <w:cantSplit/>
         </w:trPr>
         <w:tc>
           <w:tcPr>
@@ -4087,7 +4204,7 @@
               <w:rPr>
                 <w:sz w:val="20"/>
               </w:rPr>
-              <w:t>Output documents per hour</w:t>
+              <w:t>Pages per hour  (all-scanned / mixed text+scan)</w:t>
             </w:r>
           </w:p>
         </w:tc>
@@ -4106,7 +4223,7 @@
               <w:rPr>
                 <w:sz w:val="20"/>
               </w:rPr>
-              <w:t>~73</w:t>
+              <w:t>~238 / 465–549</w:t>
             </w:r>
           </w:p>
         </w:tc>
@@ -4114,6 +4231,7 @@
       <w:tr>
         <w:trPr>
           <w:cantSplit/>
+          <w:cantSplit/>
         </w:trPr>
         <w:tc>
           <w:tcPr>
@@ -4130,7 +4248,7 @@
               <w:rPr>
                 <w:sz w:val="20"/>
               </w:rPr>
-              <w:t>Compute cost per output document</w:t>
+              <w:t>Cost per source page  (all-scanned / mixed)</w:t>
             </w:r>
           </w:p>
         </w:tc>
@@ -4149,7 +4267,7 @@
               <w:rPr>
                 <w:sz w:val="20"/>
               </w:rPr>
-              <w:t>~$0.006</w:t>
+              <w:t>$0.00185 / $0.00080–$0.00094</w:t>
             </w:r>
           </w:p>
         </w:tc>
@@ -4157,6 +4275,7 @@
       <w:tr>
         <w:trPr>
           <w:cantSplit/>
+          <w:cantSplit/>
         </w:trPr>
         <w:tc>
           <w:tcPr>
@@ -4173,7 +4292,7 @@
               <w:rPr>
                 <w:sz w:val="20"/>
               </w:rPr>
-              <w:t>GPT-4o-mini per credit app (~1.5% of documents)</w:t>
+              <w:t>GPT-4o-mini per credit app  (~1.5% of output docs)</w:t>
             </w:r>
           </w:p>
         </w:tc>
@@ -4200,6 +4319,7 @@
       <w:tr>
         <w:trPr>
           <w:cantSplit/>
+          <w:cantSplit/>
         </w:trPr>
         <w:tc>
           <w:tcPr>
@@ -4216,7 +4336,7 @@
               <w:rPr>
                 <w:sz w:val="20"/>
               </w:rPr>
-              <w:t>Estimated total per 1 million output documents</w:t>
+              <w:t>Estimated cost per 1,000 source pages  (typical mixed files)</w:t>
             </w:r>
           </w:p>
         </w:tc>
@@ -4235,7 +4355,7 @@
               <w:rPr>
                 <w:sz w:val="20"/>
               </w:rPr>
-              <w:t>~$6,500 – $7,000</w:t>
+              <w:t>~$0.80–$0.94</w:t>
             </w:r>
           </w:p>
         </w:tc>
@@ -4243,7 +4363,7 @@
     </w:tbl>
     <w:p>
       <w:r>
-        <w:t>AI token costs are negligible (less than $5 per million documents). The dominant cost is CPU time for OCR.</w:t>
+        <w:t>AI token costs are negligible (under $5 per million documents at the current 1.5% credit application rate). The dominant cost is CPU time for OCR.</w:t>
       </w:r>
     </w:p>
     <w:p>
@@ -4251,6 +4371,9 @@
         <w:pStyle w:val="Heading1"/>
       </w:pPr>
       <w:r>
+        <w:rPr>
+          <w:sz w:val="24"/>
+        </w:rPr>
         <w:t>7. Current Hardware Limitations and Upgrade Path</w:t>
       </w:r>
     </w:p>
@@ -4259,6 +4382,9 @@
         <w:pStyle w:val="Heading2"/>
       </w:pPr>
       <w:r>
+        <w:rPr>
+          <w:sz w:val="22"/>
+        </w:rPr>
         <w:t>The file-size constraint</w:t>
       </w:r>
     </w:p>
@@ -4278,6 +4404,9 @@
         <w:pStyle w:val="Heading2"/>
       </w:pPr>
       <w:r>
+        <w:rPr>
+          <w:sz w:val="22"/>
+        </w:rPr>
         <w:t>Dedicated Workload Profile Options</w:t>
       </w:r>
     </w:p>
@@ -4307,6 +4436,7 @@
       <w:tr>
         <w:trPr>
           <w:cantSplit/>
+          <w:cantSplit/>
         </w:trPr>
         <w:tc>
           <w:tcPr>
@@ -4474,11 +4604,13 @@
       <w:tr>
         <w:trPr>
           <w:cantSplit/>
+          <w:cantSplit/>
         </w:trPr>
         <w:tc>
           <w:tcPr>
             <w:tcW w:w="1234" w:type="dxa"/>
             <w:shd w:val="clear" w:color="auto" w:fill="FFF2CC"/>
+            <w:shd w:val="clear" w:color="auto" w:fill="FFF2CC"/>
           </w:tcPr>
           <w:p>
             <w:pPr>
@@ -4500,6 +4632,7 @@
           <w:tcPr>
             <w:tcW w:w="1234" w:type="dxa"/>
             <w:shd w:val="clear" w:color="auto" w:fill="FFF2CC"/>
+            <w:shd w:val="clear" w:color="auto" w:fill="FFF2CC"/>
           </w:tcPr>
           <w:p>
             <w:pPr>
@@ -4521,6 +4654,7 @@
           <w:tcPr>
             <w:tcW w:w="1234" w:type="dxa"/>
             <w:shd w:val="clear" w:color="auto" w:fill="FFF2CC"/>
+            <w:shd w:val="clear" w:color="auto" w:fill="FFF2CC"/>
           </w:tcPr>
           <w:p>
             <w:pPr>
@@ -4542,6 +4676,7 @@
           <w:tcPr>
             <w:tcW w:w="1234" w:type="dxa"/>
             <w:shd w:val="clear" w:color="auto" w:fill="FFF2CC"/>
+            <w:shd w:val="clear" w:color="auto" w:fill="FFF2CC"/>
           </w:tcPr>
           <w:p>
             <w:pPr>
@@ -4563,6 +4698,7 @@
           <w:tcPr>
             <w:tcW w:w="1234" w:type="dxa"/>
             <w:shd w:val="clear" w:color="auto" w:fill="FFF2CC"/>
+            <w:shd w:val="clear" w:color="auto" w:fill="FFF2CC"/>
           </w:tcPr>
           <w:p>
             <w:pPr>
@@ -4584,6 +4720,7 @@
           <w:tcPr>
             <w:tcW w:w="1234" w:type="dxa"/>
             <w:shd w:val="clear" w:color="auto" w:fill="FFF2CC"/>
+            <w:shd w:val="clear" w:color="auto" w:fill="FFF2CC"/>
           </w:tcPr>
           <w:p>
             <w:pPr>
@@ -4604,6 +4741,7 @@
         <w:tc>
           <w:tcPr>
             <w:tcW w:w="1234" w:type="dxa"/>
+            <w:shd w:val="clear" w:color="auto" w:fill="FFF2CC"/>
             <w:shd w:val="clear" w:color="auto" w:fill="FFF2CC"/>
           </w:tcPr>
           <w:p>
@@ -4626,6 +4764,7 @@
       <w:tr>
         <w:trPr>
           <w:cantSplit/>
+          <w:cantSplit/>
         </w:trPr>
         <w:tc>
           <w:tcPr>
@@ -4771,6 +4910,7 @@
       <w:tr>
         <w:trPr>
           <w:cantSplit/>
+          <w:cantSplit/>
         </w:trPr>
         <w:tc>
           <w:tcPr>
@@ -4916,6 +5056,7 @@
       <w:tr>
         <w:trPr>
           <w:cantSplit/>
+          <w:cantSplit/>
         </w:trPr>
         <w:tc>
           <w:tcPr>
@@ -5060,6 +5201,7 @@
       </w:tr>
       <w:tr>
         <w:trPr>
+          <w:cantSplit/>
           <w:cantSplit/>
         </w:trPr>
         <w:tc>
@@ -5229,13 +5371,16 @@
         <w:pStyle w:val="Heading2"/>
       </w:pPr>
       <w:r>
+        <w:rPr>
+          <w:sz w:val="22"/>
+        </w:rPr>
         <w:lastRenderedPageBreak/>
         <w:t>Cost Comparison: 1 Million Output Documents Across Hardware Tiers</w:t>
       </w:r>
     </w:p>
     <w:p>
       <w:r>
-        <w:t>The table below estimates total cost to produce 1 million split output documents, based on the throughput rate of ~73 documents/hour. Dedicated plans are costed assuming 2 active job hours per day (the rest of the day the environment is idle but still billed).</w:t>
+        <w:t>The table below estimates total cost to produce 1 million split output documents, based on the throughput rate of ~65 documents/hour (validated for typical scanned files; mixed text+scan files reach 199 docs/hr). Dedicated plans are costed assuming 2 active job hours per day (the rest of the day the environment is idle but still billed).</w:t>
       </w:r>
     </w:p>
     <w:tbl>
@@ -5255,6 +5400,7 @@
       <w:tr>
         <w:trPr>
           <w:cantSplit/>
+          <w:cantSplit/>
         </w:trPr>
         <w:tc>
           <w:tcPr>
@@ -5402,11 +5548,13 @@
       <w:tr>
         <w:trPr>
           <w:cantSplit/>
+          <w:cantSplit/>
         </w:trPr>
         <w:tc>
           <w:tcPr>
             <w:tcW w:w="1440" w:type="dxa"/>
             <w:shd w:val="clear" w:color="auto" w:fill="FFF2CC"/>
+            <w:shd w:val="clear" w:color="auto" w:fill="FFF2CC"/>
           </w:tcPr>
           <w:p>
             <w:pPr>
@@ -5427,19 +5575,20 @@
           <w:tcPr>
             <w:tcW w:w="1440" w:type="dxa"/>
             <w:shd w:val="clear" w:color="auto" w:fill="FFF2CC"/>
-          </w:tcPr>
-          <w:p>
-            <w:pPr>
-              <w:rPr>
-                <w:sz w:val="20"/>
-                <w:szCs w:val="20"/>
-              </w:rPr>
-            </w:pPr>
-            <w:r>
-              <w:rPr>
-                <w:sz w:val="20"/>
-              </w:rPr>
-              <w:t>~13,700 hrs</w:t>
+            <w:shd w:val="clear" w:color="auto" w:fill="FFF2CC"/>
+          </w:tcPr>
+          <w:p>
+            <w:pPr>
+              <w:rPr>
+                <w:sz w:val="20"/>
+                <w:szCs w:val="20"/>
+              </w:rPr>
+            </w:pPr>
+            <w:r>
+              <w:rPr>
+                <w:sz w:val="20"/>
+              </w:rPr>
+              <w:t>~15,400 hrs</w:t>
             </w:r>
           </w:p>
         </w:tc>
@@ -5447,19 +5596,20 @@
           <w:tcPr>
             <w:tcW w:w="1440" w:type="dxa"/>
             <w:shd w:val="clear" w:color="auto" w:fill="FFF2CC"/>
-          </w:tcPr>
-          <w:p>
-            <w:pPr>
-              <w:rPr>
-                <w:sz w:val="20"/>
-                <w:szCs w:val="20"/>
-              </w:rPr>
-            </w:pPr>
-            <w:r>
-              <w:rPr>
-                <w:sz w:val="20"/>
-              </w:rPr>
-              <w:t>~1,370 days</w:t>
+            <w:shd w:val="clear" w:color="auto" w:fill="FFF2CC"/>
+          </w:tcPr>
+          <w:p>
+            <w:pPr>
+              <w:rPr>
+                <w:sz w:val="20"/>
+                <w:szCs w:val="20"/>
+              </w:rPr>
+            </w:pPr>
+            <w:r>
+              <w:rPr>
+                <w:sz w:val="20"/>
+              </w:rPr>
+              <w:t>~1,540 days</w:t>
             </w:r>
           </w:p>
         </w:tc>
@@ -5467,19 +5617,20 @@
           <w:tcPr>
             <w:tcW w:w="1440" w:type="dxa"/>
             <w:shd w:val="clear" w:color="auto" w:fill="FFF2CC"/>
-          </w:tcPr>
-          <w:p>
-            <w:pPr>
-              <w:rPr>
-                <w:sz w:val="20"/>
-                <w:szCs w:val="20"/>
-              </w:rPr>
-            </w:pPr>
-            <w:r>
-              <w:rPr>
-                <w:sz w:val="20"/>
-              </w:rPr>
-              <w:t>~$6,028</w:t>
+            <w:shd w:val="clear" w:color="auto" w:fill="FFF2CC"/>
+          </w:tcPr>
+          <w:p>
+            <w:pPr>
+              <w:rPr>
+                <w:sz w:val="20"/>
+                <w:szCs w:val="20"/>
+              </w:rPr>
+            </w:pPr>
+            <w:r>
+              <w:rPr>
+                <w:sz w:val="20"/>
+              </w:rPr>
+              <w:t>~$6,776</w:t>
             </w:r>
           </w:p>
         </w:tc>
@@ -5487,6 +5638,7 @@
           <w:tcPr>
             <w:tcW w:w="1440" w:type="dxa"/>
             <w:shd w:val="clear" w:color="auto" w:fill="FFF2CC"/>
+            <w:shd w:val="clear" w:color="auto" w:fill="FFF2CC"/>
           </w:tcPr>
           <w:p>
             <w:pPr>
@@ -5507,19 +5659,20 @@
           <w:tcPr>
             <w:tcW w:w="1440" w:type="dxa"/>
             <w:shd w:val="clear" w:color="auto" w:fill="FFF2CC"/>
-          </w:tcPr>
-          <w:p>
-            <w:pPr>
-              <w:rPr>
-                <w:sz w:val="20"/>
-                <w:szCs w:val="20"/>
-              </w:rPr>
-            </w:pPr>
-            <w:r>
-              <w:rPr>
-                <w:sz w:val="20"/>
-              </w:rPr>
-              <w:t>~$6,000 – $7,000</w:t>
+            <w:shd w:val="clear" w:color="auto" w:fill="FFF2CC"/>
+          </w:tcPr>
+          <w:p>
+            <w:pPr>
+              <w:rPr>
+                <w:sz w:val="20"/>
+                <w:szCs w:val="20"/>
+              </w:rPr>
+            </w:pPr>
+            <w:r>
+              <w:rPr>
+                <w:sz w:val="20"/>
+              </w:rPr>
+              <w:t>~$6,500–$7,500</w:t>
             </w:r>
           </w:p>
         </w:tc>
@@ -5527,6 +5680,7 @@
       <w:tr>
         <w:trPr>
           <w:cantSplit/>
+          <w:cantSplit/>
         </w:trPr>
         <w:tc>
           <w:tcPr>
@@ -5645,6 +5799,7 @@
       </w:tr>
       <w:tr>
         <w:trPr>
+          <w:cantSplit/>
           <w:cantSplit/>
         </w:trPr>
         <w:tc>
@@ -5778,6 +5933,9 @@
         <w:pStyle w:val="Heading2"/>
       </w:pPr>
       <w:r>
+        <w:rPr>
+          <w:sz w:val="22"/>
+        </w:rPr>
         <w:t>Large Files: Resolved by Sliding-Window Chunking</w:t>
       </w:r>
     </w:p>
@@ -5806,6 +5964,9 @@
         <w:pStyle w:val="Heading1"/>
       </w:pPr>
       <w:r>
+        <w:rPr>
+          <w:sz w:val="24"/>
+        </w:rPr>
         <w:t>8. Why We Stayed on Consumption</w:t>
       </w:r>
     </w:p>
@@ -5814,6 +5975,9 @@
         <w:pStyle w:val="Heading2"/>
       </w:pPr>
       <w:r>
+        <w:rPr>
+          <w:sz w:val="22"/>
+        </w:rPr>
         <w:t>Consumption vs. Dedicated workload profiles</w:t>
       </w:r>
     </w:p>
@@ -5838,6 +6002,7 @@
       <w:tr>
         <w:trPr>
           <w:cantSplit/>
+          <w:cantSplit/>
         </w:trPr>
         <w:tc>
           <w:tcPr>
@@ -5942,11 +6107,13 @@
       <w:tr>
         <w:trPr>
           <w:cantSplit/>
+          <w:cantSplit/>
         </w:trPr>
         <w:tc>
           <w:tcPr>
             <w:tcW w:w="1728" w:type="dxa"/>
             <w:shd w:val="clear" w:color="auto" w:fill="FFF2CC"/>
+            <w:shd w:val="clear" w:color="auto" w:fill="FFF2CC"/>
           </w:tcPr>
           <w:p>
             <w:pPr>
@@ -5967,6 +6134,7 @@
           <w:tcPr>
             <w:tcW w:w="1728" w:type="dxa"/>
             <w:shd w:val="clear" w:color="auto" w:fill="FFF2CC"/>
+            <w:shd w:val="clear" w:color="auto" w:fill="FFF2CC"/>
           </w:tcPr>
           <w:p>
             <w:pPr>
@@ -5987,6 +6155,7 @@
           <w:tcPr>
             <w:tcW w:w="1728" w:type="dxa"/>
             <w:shd w:val="clear" w:color="auto" w:fill="FFF2CC"/>
+            <w:shd w:val="clear" w:color="auto" w:fill="FFF2CC"/>
           </w:tcPr>
           <w:p>
             <w:pPr>
@@ -6007,6 +6176,7 @@
           <w:tcPr>
             <w:tcW w:w="1728" w:type="dxa"/>
             <w:shd w:val="clear" w:color="auto" w:fill="FFF2CC"/>
+            <w:shd w:val="clear" w:color="auto" w:fill="FFF2CC"/>
           </w:tcPr>
           <w:p>
             <w:pPr>
@@ -6026,6 +6196,7 @@
         <w:tc>
           <w:tcPr>
             <w:tcW w:w="1728" w:type="dxa"/>
+            <w:shd w:val="clear" w:color="auto" w:fill="FFF2CC"/>
             <w:shd w:val="clear" w:color="auto" w:fill="FFF2CC"/>
           </w:tcPr>
           <w:p>
@@ -6047,6 +6218,7 @@
       <w:tr>
         <w:trPr>
           <w:cantSplit/>
+          <w:cantSplit/>
         </w:trPr>
         <w:tc>
           <w:tcPr>
@@ -6147,6 +6319,7 @@
       <w:tr>
         <w:trPr>
           <w:cantSplit/>
+          <w:cantSplit/>
         </w:trPr>
         <w:tc>
           <w:tcPr>
@@ -6246,6 +6419,7 @@
       </w:tr>
       <w:tr>
         <w:trPr>
+          <w:cantSplit/>
           <w:cantSplit/>
         </w:trPr>
         <w:tc>

</xml_diff>

<commit_message>
fix: correct 602819077.pdf page count (3,900 -> 220) and recalculate derived figures
602819077.pdf is 220 pages, not 3,900. Fix all references:
- Para 90 (Section 7): validation sentence now says 220-page all-scanned file;
  adds note that 1h42m was pre-optimisation settings, current rate is 238-549 pp/hr
- Para 107 (Section 9 design rationale): conclusion rewritten — file was "just above
  the ~200-page reliable ceiling", not a 3,900-page file; same throughput note added
- Table 10 rows 2-3: D4 and D8 cost estimates recalculated from 65 docs/hr baseline
  (was 73 docs/hr); D4 ~$20,000+, D8 ~$32,000+ for 1M output documents
- README.md and CHANGELOG.md: 3,900+ -> 220 pages

Generated with Claude Code
</commit_message>
<xml_diff>
--- a/PDF_split_and_Mine.docx
+++ b/PDF_split_and_Mine.docx
@@ -20,9 +20,6 @@
         <w:pStyle w:val="Heading1"/>
       </w:pPr>
       <w:r>
-        <w:rPr>
-          <w:sz w:val="24"/>
-        </w:rPr>
         <w:t>1. What It Does</w:t>
       </w:r>
     </w:p>
@@ -36,9 +33,6 @@
         <w:pStyle w:val="Heading1"/>
       </w:pPr>
       <w:r>
-        <w:rPr>
-          <w:sz w:val="24"/>
-        </w:rPr>
         <w:t>2. How to Use run.ps1</w:t>
       </w:r>
     </w:p>
@@ -52,9 +46,6 @@
         <w:pStyle w:val="Heading2"/>
       </w:pPr>
       <w:r>
-        <w:rPr>
-          <w:sz w:val="22"/>
-        </w:rPr>
         <w:t>Quick Start</w:t>
       </w:r>
     </w:p>
@@ -99,9 +90,6 @@
         <w:pStyle w:val="Heading2"/>
       </w:pPr>
       <w:r>
-        <w:rPr>
-          <w:sz w:val="22"/>
-        </w:rPr>
         <w:t>One-Time Setup</w:t>
       </w:r>
     </w:p>
@@ -114,14 +102,52 @@
       <w:pPr>
         <w:ind w:left="576"/>
       </w:pPr>
+      <w:proofErr w:type="spellStart"/>
       <w:r>
         <w:rPr>
           <w:rFonts w:ascii="Courier New" w:hAnsi="Courier New"/>
           <w:color w:val="1F507D"/>
           <w:sz w:val="18"/>
         </w:rPr>
-        <w:t>py -3.11 -m venv .venv</w:t>
-      </w:r>
+        <w:t>py</w:t>
+      </w:r>
+      <w:proofErr w:type="spellEnd"/>
+      <w:r>
+        <w:rPr>
+          <w:rFonts w:ascii="Courier New" w:hAnsi="Courier New"/>
+          <w:color w:val="1F507D"/>
+          <w:sz w:val="18"/>
+        </w:rPr>
+        <w:t xml:space="preserve"> -3.11 -m </w:t>
+      </w:r>
+      <w:proofErr w:type="spellStart"/>
+      <w:r>
+        <w:rPr>
+          <w:rFonts w:ascii="Courier New" w:hAnsi="Courier New"/>
+          <w:color w:val="1F507D"/>
+          <w:sz w:val="18"/>
+        </w:rPr>
+        <w:t>venv</w:t>
+      </w:r>
+      <w:proofErr w:type="spellEnd"/>
+      <w:r>
+        <w:rPr>
+          <w:rFonts w:ascii="Courier New" w:hAnsi="Courier New"/>
+          <w:color w:val="1F507D"/>
+          <w:sz w:val="18"/>
+        </w:rPr>
+        <w:t xml:space="preserve"> .</w:t>
+      </w:r>
+      <w:proofErr w:type="spellStart"/>
+      <w:r>
+        <w:rPr>
+          <w:rFonts w:ascii="Courier New" w:hAnsi="Courier New"/>
+          <w:color w:val="1F507D"/>
+          <w:sz w:val="18"/>
+        </w:rPr>
+        <w:t>venv</w:t>
+      </w:r>
+      <w:proofErr w:type="spellEnd"/>
       <w:r>
         <w:rPr>
           <w:rFonts w:ascii="Courier New" w:hAnsi="Courier New"/>
@@ -129,7 +155,25 @@
           <w:sz w:val="18"/>
         </w:rPr>
         <w:br/>
-        <w:t>.venv\Scripts\pip install -e ".[dev]"</w:t>
+        <w:t>.</w:t>
+      </w:r>
+      <w:proofErr w:type="spellStart"/>
+      <w:r>
+        <w:rPr>
+          <w:rFonts w:ascii="Courier New" w:hAnsi="Courier New"/>
+          <w:color w:val="1F507D"/>
+          <w:sz w:val="18"/>
+        </w:rPr>
+        <w:t>venv</w:t>
+      </w:r>
+      <w:proofErr w:type="spellEnd"/>
+      <w:r>
+        <w:rPr>
+          <w:rFonts w:ascii="Courier New" w:hAnsi="Courier New"/>
+          <w:color w:val="1F507D"/>
+          <w:sz w:val="18"/>
+        </w:rPr>
+        <w:t>\Scripts\pip install -e ".[dev]"</w:t>
       </w:r>
     </w:p>
     <w:p>
@@ -191,9 +235,6 @@
         <w:pStyle w:val="Heading2"/>
       </w:pPr>
       <w:r>
-        <w:rPr>
-          <w:sz w:val="22"/>
-        </w:rPr>
         <w:t>Input and Output Locations</w:t>
       </w:r>
     </w:p>
@@ -211,13 +252,41 @@
           <w:sz w:val="18"/>
         </w:rPr>
       </w:pPr>
+      <w:proofErr w:type="spellStart"/>
       <w:r>
         <w:rPr>
           <w:rFonts w:ascii="Courier New" w:hAnsi="Courier New"/>
           <w:color w:val="1F507D"/>
           <w:sz w:val="18"/>
         </w:rPr>
-        <w:t>src/pdf_extractor/Data/</w:t>
+        <w:t>src</w:t>
+      </w:r>
+      <w:proofErr w:type="spellEnd"/>
+      <w:r>
+        <w:rPr>
+          <w:rFonts w:ascii="Courier New" w:hAnsi="Courier New"/>
+          <w:color w:val="1F507D"/>
+          <w:sz w:val="18"/>
+        </w:rPr>
+        <w:t>/</w:t>
+      </w:r>
+      <w:proofErr w:type="spellStart"/>
+      <w:r>
+        <w:rPr>
+          <w:rFonts w:ascii="Courier New" w:hAnsi="Courier New"/>
+          <w:color w:val="1F507D"/>
+          <w:sz w:val="18"/>
+        </w:rPr>
+        <w:t>pdf_extractor</w:t>
+      </w:r>
+      <w:proofErr w:type="spellEnd"/>
+      <w:r>
+        <w:rPr>
+          <w:rFonts w:ascii="Courier New" w:hAnsi="Courier New"/>
+          <w:color w:val="1F507D"/>
+          <w:sz w:val="18"/>
+        </w:rPr>
+        <w:t>/Data/</w:t>
       </w:r>
     </w:p>
     <w:p>
@@ -239,7 +308,6 @@
       <w:tr>
         <w:trPr>
           <w:cantSplit/>
-          <w:cantSplit/>
         </w:trPr>
         <w:tc>
           <w:tcPr>
@@ -306,7 +374,6 @@
       <w:tr>
         <w:trPr>
           <w:cantSplit/>
-          <w:cantSplit/>
         </w:trPr>
         <w:tc>
           <w:tcPr>
@@ -369,7 +436,6 @@
       <w:tr>
         <w:trPr>
           <w:cantSplit/>
-          <w:cantSplit/>
         </w:trPr>
         <w:tc>
           <w:tcPr>
@@ -405,7 +471,21 @@
               <w:rPr>
                 <w:sz w:val="20"/>
               </w:rPr>
-              <w:t>output/opt_in_results-&lt;filename&gt;.xlsx</w:t>
+              <w:t>output/</w:t>
+            </w:r>
+            <w:proofErr w:type="spellStart"/>
+            <w:r>
+              <w:rPr>
+                <w:sz w:val="20"/>
+              </w:rPr>
+              <w:t>opt_in_results</w:t>
+            </w:r>
+            <w:proofErr w:type="spellEnd"/>
+            <w:r>
+              <w:rPr>
+                <w:sz w:val="20"/>
+              </w:rPr>
+              <w:t>-&lt;filename&gt;.xlsx</w:t>
             </w:r>
           </w:p>
         </w:tc>
@@ -432,7 +512,6 @@
       <w:tr>
         <w:trPr>
           <w:cantSplit/>
-          <w:cantSplit/>
         </w:trPr>
         <w:tc>
           <w:tcPr>
@@ -495,7 +574,6 @@
       <w:tr>
         <w:trPr>
           <w:cantSplit/>
-          <w:cantSplit/>
         </w:trPr>
         <w:tc>
           <w:tcPr>
@@ -527,12 +605,28 @@
                 <w:szCs w:val="20"/>
               </w:rPr>
             </w:pPr>
-            <w:r>
-              <w:rPr>
-                <w:sz w:val="20"/>
-              </w:rPr>
-              <w:t>run-config.json</w:t>
-            </w:r>
+            <w:proofErr w:type="gramStart"/>
+            <w:r>
+              <w:rPr>
+                <w:sz w:val="20"/>
+              </w:rPr>
+              <w:t>run-</w:t>
+            </w:r>
+            <w:proofErr w:type="spellStart"/>
+            <w:r>
+              <w:rPr>
+                <w:sz w:val="20"/>
+              </w:rPr>
+              <w:t>config</w:t>
+            </w:r>
+            <w:proofErr w:type="gramEnd"/>
+            <w:r>
+              <w:rPr>
+                <w:sz w:val="20"/>
+              </w:rPr>
+              <w:t>.json</w:t>
+            </w:r>
+            <w:proofErr w:type="spellEnd"/>
           </w:p>
         </w:tc>
         <w:tc>
@@ -561,9 +655,6 @@
         <w:pStyle w:val="Heading2"/>
       </w:pPr>
       <w:r>
-        <w:rPr>
-          <w:sz w:val="22"/>
-        </w:rPr>
         <w:t>Local Mode Menu</w:t>
       </w:r>
     </w:p>
@@ -586,7 +677,6 @@
       <w:tr>
         <w:trPr>
           <w:cantSplit/>
-          <w:cantSplit/>
         </w:trPr>
         <w:tc>
           <w:tcPr>
@@ -652,7 +742,6 @@
       <w:tr>
         <w:trPr>
           <w:cantSplit/>
-          <w:cantSplit/>
         </w:trPr>
         <w:tc>
           <w:tcPr>
@@ -715,7 +804,6 @@
       <w:tr>
         <w:trPr>
           <w:cantSplit/>
-          <w:cantSplit/>
         </w:trPr>
         <w:tc>
           <w:tcPr>
@@ -778,7 +866,6 @@
       <w:tr>
         <w:trPr>
           <w:cantSplit/>
-          <w:cantSplit/>
         </w:trPr>
         <w:tc>
           <w:tcPr>
@@ -841,7 +928,6 @@
       <w:tr>
         <w:trPr>
           <w:cantSplit/>
-          <w:cantSplit/>
         </w:trPr>
         <w:tc>
           <w:tcPr>
@@ -904,7 +990,6 @@
       <w:tr>
         <w:trPr>
           <w:cantSplit/>
-          <w:cantSplit/>
         </w:trPr>
         <w:tc>
           <w:tcPr>
@@ -955,11 +1040,47 @@
                 <w:szCs w:val="20"/>
               </w:rPr>
             </w:pPr>
-            <w:r>
-              <w:rPr>
-                <w:sz w:val="20"/>
-              </w:rPr>
-              <w:t>Customise the input PDF directory and output directory. Settings saved to run-config.json and persist across runs.</w:t>
+            <w:proofErr w:type="spellStart"/>
+            <w:r>
+              <w:rPr>
+                <w:sz w:val="20"/>
+              </w:rPr>
+              <w:t>Customise</w:t>
+            </w:r>
+            <w:proofErr w:type="spellEnd"/>
+            <w:r>
+              <w:rPr>
+                <w:sz w:val="20"/>
+              </w:rPr>
+              <w:t xml:space="preserve"> </w:t>
+            </w:r>
+            <w:proofErr w:type="gramStart"/>
+            <w:r>
+              <w:rPr>
+                <w:sz w:val="20"/>
+              </w:rPr>
+              <w:t>the input</w:t>
+            </w:r>
+            <w:proofErr w:type="gramEnd"/>
+            <w:r>
+              <w:rPr>
+                <w:sz w:val="20"/>
+              </w:rPr>
+              <w:t xml:space="preserve"> PDF directory and output directory. Settings saved to run-</w:t>
+            </w:r>
+            <w:proofErr w:type="spellStart"/>
+            <w:r>
+              <w:rPr>
+                <w:sz w:val="20"/>
+              </w:rPr>
+              <w:t>config.json</w:t>
+            </w:r>
+            <w:proofErr w:type="spellEnd"/>
+            <w:r>
+              <w:rPr>
+                <w:sz w:val="20"/>
+              </w:rPr>
+              <w:t xml:space="preserve"> and persist across runs.</w:t>
             </w:r>
           </w:p>
         </w:tc>
@@ -967,7 +1088,6 @@
       <w:tr>
         <w:trPr>
           <w:cantSplit/>
-          <w:cantSplit/>
         </w:trPr>
         <w:tc>
           <w:tcPr>
@@ -1022,14 +1142,27 @@
               <w:rPr>
                 <w:sz w:val="20"/>
               </w:rPr>
-              <w:t>Enters Azure mode (checks az CLI is installed first; shows error and stays in local menu if not).</w:t>
+              <w:t xml:space="preserve">Enters Azure mode (checks </w:t>
+            </w:r>
+            <w:proofErr w:type="spellStart"/>
+            <w:r>
+              <w:rPr>
+                <w:sz w:val="20"/>
+              </w:rPr>
+              <w:t>az</w:t>
+            </w:r>
+            <w:proofErr w:type="spellEnd"/>
+            <w:r>
+              <w:rPr>
+                <w:sz w:val="20"/>
+              </w:rPr>
+              <w:t xml:space="preserve"> CLI is installed first; shows error and stays in local menu if not).</w:t>
             </w:r>
           </w:p>
         </w:tc>
       </w:tr>
       <w:tr>
         <w:trPr>
-          <w:cantSplit/>
           <w:cantSplit/>
         </w:trPr>
         <w:tc>
@@ -1121,16 +1254,29 @@
         <w:spacing w:before="0"/>
       </w:pPr>
       <w:r>
-        <w:rPr>
-          <w:sz w:val="22"/>
-        </w:rPr>
         <w:lastRenderedPageBreak/>
         <w:t>Azure Mode Menu</w:t>
       </w:r>
     </w:p>
     <w:p>
       <w:r>
-        <w:t>Select option 2 at startup to enter Azure mode (requires az CLI and Contributor access to the nader-test-rag resource group).</w:t>
+        <w:t xml:space="preserve">Select option 2 at startup to enter Azure mode (requires </w:t>
+      </w:r>
+      <w:proofErr w:type="spellStart"/>
+      <w:r>
+        <w:t>az</w:t>
+      </w:r>
+      <w:proofErr w:type="spellEnd"/>
+      <w:r>
+        <w:t xml:space="preserve"> CLI and Contributor access to the </w:t>
+      </w:r>
+      <w:proofErr w:type="spellStart"/>
+      <w:r>
+        <w:t>nader</w:t>
+      </w:r>
+      <w:proofErr w:type="spellEnd"/>
+      <w:r>
+        <w:t>-test-rag resource group).</w:t>
       </w:r>
     </w:p>
     <w:tbl>
@@ -1147,7 +1293,6 @@
       <w:tr>
         <w:trPr>
           <w:cantSplit/>
-          <w:cantSplit/>
         </w:trPr>
         <w:tc>
           <w:tcPr>
@@ -1213,7 +1358,6 @@
       <w:tr>
         <w:trPr>
           <w:cantSplit/>
-          <w:cantSplit/>
         </w:trPr>
         <w:tc>
           <w:tcPr>
@@ -1276,7 +1420,6 @@
       <w:tr>
         <w:trPr>
           <w:cantSplit/>
-          <w:cantSplit/>
         </w:trPr>
         <w:tc>
           <w:tcPr>
@@ -1312,7 +1455,21 @@
               <w:rPr>
                 <w:sz w:val="20"/>
               </w:rPr>
-              <w:t>Pick different file and run</w:t>
+              <w:t xml:space="preserve">Pick different </w:t>
+            </w:r>
+            <w:proofErr w:type="gramStart"/>
+            <w:r>
+              <w:rPr>
+                <w:sz w:val="20"/>
+              </w:rPr>
+              <w:t>file</w:t>
+            </w:r>
+            <w:proofErr w:type="gramEnd"/>
+            <w:r>
+              <w:rPr>
+                <w:sz w:val="20"/>
+              </w:rPr>
+              <w:t xml:space="preserve"> and run</w:t>
             </w:r>
           </w:p>
         </w:tc>
@@ -1331,7 +1488,21 @@
               <w:rPr>
                 <w:sz w:val="20"/>
               </w:rPr>
-              <w:t>Lists blobs in the pdfinput container, lets user enter a filename, updates the job, and runs it.</w:t>
+              <w:t xml:space="preserve">Lists blobs in the </w:t>
+            </w:r>
+            <w:proofErr w:type="spellStart"/>
+            <w:r>
+              <w:rPr>
+                <w:sz w:val="20"/>
+              </w:rPr>
+              <w:t>pdfinput</w:t>
+            </w:r>
+            <w:proofErr w:type="spellEnd"/>
+            <w:r>
+              <w:rPr>
+                <w:sz w:val="20"/>
+              </w:rPr>
+              <w:t xml:space="preserve"> container, lets user enter a filename, updates the job, and runs it.</w:t>
             </w:r>
           </w:p>
         </w:tc>
@@ -1339,7 +1510,6 @@
       <w:tr>
         <w:trPr>
           <w:cantSplit/>
-          <w:cantSplit/>
         </w:trPr>
         <w:tc>
           <w:tcPr>
@@ -1402,7 +1572,6 @@
       <w:tr>
         <w:trPr>
           <w:cantSplit/>
-          <w:cantSplit/>
         </w:trPr>
         <w:tc>
           <w:tcPr>
@@ -1457,7 +1626,21 @@
               <w:rPr>
                 <w:sz w:val="20"/>
               </w:rPr>
-              <w:t>Lists all files in the pdfoutput blob container.</w:t>
+              <w:t xml:space="preserve">Lists all files in the </w:t>
+            </w:r>
+            <w:proofErr w:type="spellStart"/>
+            <w:r>
+              <w:rPr>
+                <w:sz w:val="20"/>
+              </w:rPr>
+              <w:t>pdfoutput</w:t>
+            </w:r>
+            <w:proofErr w:type="spellEnd"/>
+            <w:r>
+              <w:rPr>
+                <w:sz w:val="20"/>
+              </w:rPr>
+              <w:t xml:space="preserve"> blob container.</w:t>
             </w:r>
           </w:p>
         </w:tc>
@@ -1465,7 +1648,6 @@
       <w:tr>
         <w:trPr>
           <w:cantSplit/>
-          <w:cantSplit/>
         </w:trPr>
         <w:tc>
           <w:tcPr>
@@ -1520,7 +1702,35 @@
               <w:rPr>
                 <w:sz w:val="20"/>
               </w:rPr>
-              <w:t>Triggers az acr build to rebuild the container image in Azure Container Registry (~3-5 minutes).</w:t>
+              <w:t xml:space="preserve">Triggers </w:t>
+            </w:r>
+            <w:proofErr w:type="spellStart"/>
+            <w:r>
+              <w:rPr>
+                <w:sz w:val="20"/>
+              </w:rPr>
+              <w:t>az</w:t>
+            </w:r>
+            <w:proofErr w:type="spellEnd"/>
+            <w:r>
+              <w:rPr>
+                <w:sz w:val="20"/>
+              </w:rPr>
+              <w:t xml:space="preserve"> </w:t>
+            </w:r>
+            <w:proofErr w:type="spellStart"/>
+            <w:r>
+              <w:rPr>
+                <w:sz w:val="20"/>
+              </w:rPr>
+              <w:t>acr</w:t>
+            </w:r>
+            <w:proofErr w:type="spellEnd"/>
+            <w:r>
+              <w:rPr>
+                <w:sz w:val="20"/>
+              </w:rPr>
+              <w:t xml:space="preserve"> build to rebuild the container image in Azure Container Registry (~3-5 minutes).</w:t>
             </w:r>
           </w:p>
         </w:tc>
@@ -1528,7 +1738,6 @@
       <w:tr>
         <w:trPr>
           <w:cantSplit/>
-          <w:cantSplit/>
         </w:trPr>
         <w:tc>
           <w:tcPr>
@@ -1590,7 +1799,6 @@
       </w:tr>
       <w:tr>
         <w:trPr>
-          <w:cantSplit/>
           <w:cantSplit/>
         </w:trPr>
         <w:tc>
@@ -1662,9 +1870,6 @@
         <w:pStyle w:val="Heading2"/>
       </w:pPr>
       <w:r>
-        <w:rPr>
-          <w:sz w:val="22"/>
-        </w:rPr>
         <w:t>Non-Interactive (Command-Line) Usage</w:t>
       </w:r>
     </w:p>
@@ -1686,7 +1891,6 @@
       <w:tr>
         <w:trPr>
           <w:cantSplit/>
-          <w:cantSplit/>
         </w:trPr>
         <w:tc>
           <w:tcPr>
@@ -1732,7 +1936,6 @@
       <w:tr>
         <w:trPr>
           <w:cantSplit/>
-          <w:cantSplit/>
         </w:trPr>
         <w:tc>
           <w:tcPr>
@@ -1776,7 +1979,6 @@
       <w:tr>
         <w:trPr>
           <w:cantSplit/>
-          <w:cantSplit/>
         </w:trPr>
         <w:tc>
           <w:tcPr>
@@ -1793,8 +1995,16 @@
               <w:rPr>
                 <w:sz w:val="20"/>
               </w:rPr>
-              <w:t>.\run.ps1 -Mode local -File Sample-1.pdf -OptIn</w:t>
-            </w:r>
+              <w:t>.\run.ps1 -Mode local -File Sample-1.pdf -</w:t>
+            </w:r>
+            <w:proofErr w:type="spellStart"/>
+            <w:r>
+              <w:rPr>
+                <w:sz w:val="20"/>
+              </w:rPr>
+              <w:t>OptIn</w:t>
+            </w:r>
+            <w:proofErr w:type="spellEnd"/>
           </w:p>
         </w:tc>
         <w:tc>
@@ -1820,7 +2030,6 @@
       <w:tr>
         <w:trPr>
           <w:cantSplit/>
-          <w:cantSplit/>
         </w:trPr>
         <w:tc>
           <w:tcPr>
@@ -1863,7 +2072,6 @@
       </w:tr>
       <w:tr>
         <w:trPr>
-          <w:cantSplit/>
           <w:cantSplit/>
         </w:trPr>
         <w:tc>
@@ -1932,9 +2140,6 @@
         <w:spacing w:line="240" w:lineRule="auto"/>
       </w:pPr>
       <w:r>
-        <w:rPr>
-          <w:sz w:val="22"/>
-        </w:rPr>
         <w:lastRenderedPageBreak/>
         <w:t>Pattern Matching Examples (Local Mode, Option 3)</w:t>
       </w:r>
@@ -1953,7 +2158,6 @@
       <w:tr>
         <w:trPr>
           <w:cantSplit/>
-          <w:cantSplit/>
         </w:trPr>
         <w:tc>
           <w:tcPr>
@@ -1999,7 +2203,6 @@
       <w:tr>
         <w:trPr>
           <w:cantSplit/>
-          <w:cantSplit/>
         </w:trPr>
         <w:tc>
           <w:tcPr>
@@ -2043,7 +2246,6 @@
       <w:tr>
         <w:trPr>
           <w:cantSplit/>
-          <w:cantSplit/>
         </w:trPr>
         <w:tc>
           <w:tcPr>
@@ -2087,7 +2289,6 @@
       <w:tr>
         <w:trPr>
           <w:cantSplit/>
-          <w:cantSplit/>
         </w:trPr>
         <w:tc>
           <w:tcPr>
@@ -2130,7 +2331,6 @@
       </w:tr>
       <w:tr>
         <w:trPr>
-          <w:cantSplit/>
           <w:cantSplit/>
         </w:trPr>
         <w:tc>
@@ -2183,20 +2383,49 @@
         <w:pStyle w:val="Heading2"/>
       </w:pPr>
       <w:r>
-        <w:rPr>
-          <w:sz w:val="22"/>
-        </w:rPr>
-        <w:t>Configuration (run-config.json)</w:t>
+        <w:t>Configuration (run-</w:t>
+      </w:r>
+      <w:proofErr w:type="spellStart"/>
+      <w:r>
+        <w:t>config.json</w:t>
+      </w:r>
+      <w:proofErr w:type="spellEnd"/>
+      <w:r>
+        <w:t>)</w:t>
       </w:r>
     </w:p>
     <w:p>
       <w:r>
-        <w:t>Settings are saved to run-config.json in the repository root. This allows different machines or users to have different input/output paths without modifying the script. Select "Configure settings" (option 5 in Local mode) to change paths; they persist across sessions.</w:t>
+        <w:t>Settings are saved to run-</w:t>
+      </w:r>
+      <w:proofErr w:type="spellStart"/>
+      <w:r>
+        <w:t>config.json</w:t>
+      </w:r>
+      <w:proofErr w:type="spellEnd"/>
+      <w:r>
+        <w:t xml:space="preserve"> in the repository root. This allows different machines or users to have different input/output paths without modifying the script. Select "Configure settings" (option 5 in Local mode) to change paths; they persist across sessions.</w:t>
       </w:r>
     </w:p>
     <w:p>
       <w:r>
-        <w:t>Example run-config.json:</w:t>
+        <w:t xml:space="preserve">Example </w:t>
+      </w:r>
+      <w:proofErr w:type="gramStart"/>
+      <w:r>
+        <w:t>run-</w:t>
+      </w:r>
+      <w:proofErr w:type="spellStart"/>
+      <w:r>
+        <w:t>config</w:t>
+      </w:r>
+      <w:proofErr w:type="gramEnd"/>
+      <w:r>
+        <w:t>.json</w:t>
+      </w:r>
+      <w:proofErr w:type="spellEnd"/>
+      <w:r>
+        <w:t>:</w:t>
       </w:r>
     </w:p>
     <w:p>
@@ -2218,7 +2447,25 @@
           <w:sz w:val="18"/>
         </w:rPr>
         <w:br/>
-        <w:t xml:space="preserve">  "data_dir": "D:\\PDFs\\ToProcess",</w:t>
+        <w:t xml:space="preserve">  "</w:t>
+      </w:r>
+      <w:proofErr w:type="spellStart"/>
+      <w:r>
+        <w:rPr>
+          <w:rFonts w:ascii="Courier New" w:hAnsi="Courier New"/>
+          <w:color w:val="1F507D"/>
+          <w:sz w:val="18"/>
+        </w:rPr>
+        <w:t>data_dir</w:t>
+      </w:r>
+      <w:proofErr w:type="spellEnd"/>
+      <w:r>
+        <w:rPr>
+          <w:rFonts w:ascii="Courier New" w:hAnsi="Courier New"/>
+          <w:color w:val="1F507D"/>
+          <w:sz w:val="18"/>
+        </w:rPr>
+        <w:t>": "D:\\PDFs\\ToProcess",</w:t>
       </w:r>
       <w:r>
         <w:rPr>
@@ -2227,7 +2474,25 @@
           <w:sz w:val="18"/>
         </w:rPr>
         <w:br/>
-        <w:t xml:space="preserve">  "output_dir": "D:\\PDFs\\Results",</w:t>
+        <w:t xml:space="preserve">  "</w:t>
+      </w:r>
+      <w:proofErr w:type="spellStart"/>
+      <w:r>
+        <w:rPr>
+          <w:rFonts w:ascii="Courier New" w:hAnsi="Courier New"/>
+          <w:color w:val="1F507D"/>
+          <w:sz w:val="18"/>
+        </w:rPr>
+        <w:t>output_dir</w:t>
+      </w:r>
+      <w:proofErr w:type="spellEnd"/>
+      <w:r>
+        <w:rPr>
+          <w:rFonts w:ascii="Courier New" w:hAnsi="Courier New"/>
+          <w:color w:val="1F507D"/>
+          <w:sz w:val="18"/>
+        </w:rPr>
+        <w:t>": "D:\\PDFs\\Results",</w:t>
       </w:r>
       <w:r>
         <w:rPr>
@@ -2236,14 +2501,25 @@
           <w:sz w:val="18"/>
         </w:rPr>
         <w:br/>
-      </w:r>
+        <w:t xml:space="preserve">  "</w:t>
+      </w:r>
+      <w:proofErr w:type="spellStart"/>
       <w:r>
         <w:rPr>
           <w:rFonts w:ascii="Courier New" w:hAnsi="Courier New"/>
           <w:color w:val="1F507D"/>
           <w:sz w:val="18"/>
         </w:rPr>
-        <w:t xml:space="preserve">  "log_dir": "D:\\PDFs\\Results\\job-logs",</w:t>
+        <w:t>log_dir</w:t>
+      </w:r>
+      <w:proofErr w:type="spellEnd"/>
+      <w:r>
+        <w:rPr>
+          <w:rFonts w:ascii="Courier New" w:hAnsi="Courier New"/>
+          <w:color w:val="1F507D"/>
+          <w:sz w:val="18"/>
+        </w:rPr>
+        <w:t>": "D:\\PDFs\\Results\\job-logs",</w:t>
       </w:r>
       <w:r>
         <w:rPr>
@@ -2252,7 +2528,25 @@
           <w:sz w:val="18"/>
         </w:rPr>
         <w:br/>
-        <w:t xml:space="preserve">  "last_updated": "2026-05-12 14:30:00"</w:t>
+        <w:t xml:space="preserve">  "</w:t>
+      </w:r>
+      <w:proofErr w:type="spellStart"/>
+      <w:r>
+        <w:rPr>
+          <w:rFonts w:ascii="Courier New" w:hAnsi="Courier New"/>
+          <w:color w:val="1F507D"/>
+          <w:sz w:val="18"/>
+        </w:rPr>
+        <w:t>last_updated</w:t>
+      </w:r>
+      <w:proofErr w:type="spellEnd"/>
+      <w:r>
+        <w:rPr>
+          <w:rFonts w:ascii="Courier New" w:hAnsi="Courier New"/>
+          <w:color w:val="1F507D"/>
+          <w:sz w:val="18"/>
+        </w:rPr>
+        <w:t>": "2026-05-12 14:30:00"</w:t>
       </w:r>
       <w:r>
         <w:rPr>
@@ -2269,9 +2563,6 @@
         <w:pStyle w:val="Heading1"/>
       </w:pPr>
       <w:r>
-        <w:rPr>
-          <w:sz w:val="24"/>
-        </w:rPr>
         <w:t>3. Code Architecture</w:t>
       </w:r>
     </w:p>
@@ -2280,9 +2571,6 @@
         <w:pStyle w:val="Heading2"/>
       </w:pPr>
       <w:r>
-        <w:rPr>
-          <w:sz w:val="22"/>
-        </w:rPr>
         <w:t>Splitting Pipeline  (image_splitter.py)</w:t>
       </w:r>
     </w:p>
@@ -2304,7 +2592,15 @@
         <w:pStyle w:val="ListBullet"/>
       </w:pPr>
       <w:r>
-        <w:t>Scanned image pages: First renders the page at 150 DPI, then PaddleOCR extracts text.</w:t>
+        <w:t xml:space="preserve">Scanned image pages: First renders the page at 150 DPI, then </w:t>
+      </w:r>
+      <w:proofErr w:type="spellStart"/>
+      <w:r>
+        <w:t>PaddleOCR</w:t>
+      </w:r>
+      <w:proofErr w:type="spellEnd"/>
+      <w:r>
+        <w:t xml:space="preserve"> extracts text.</w:t>
       </w:r>
     </w:p>
     <w:p>
@@ -2312,7 +2608,15 @@
         <w:spacing w:after="0"/>
       </w:pPr>
       <w:r>
-        <w:t>Each page produces a PageSignal with one of three classifications:</w:t>
+        <w:t xml:space="preserve">Each page produces a </w:t>
+      </w:r>
+      <w:proofErr w:type="spellStart"/>
+      <w:r>
+        <w:t>PageSignal</w:t>
+      </w:r>
+      <w:proofErr w:type="spellEnd"/>
+      <w:r>
+        <w:t xml:space="preserve"> with one of three classifications:</w:t>
       </w:r>
     </w:p>
     <w:p/>
@@ -2329,7 +2633,6 @@
       <w:tr>
         <w:trPr>
           <w:cantSplit/>
-          <w:cantSplit/>
         </w:trPr>
         <w:tc>
           <w:tcPr>
@@ -2375,7 +2678,6 @@
       <w:tr>
         <w:trPr>
           <w:cantSplit/>
-          <w:cantSplit/>
         </w:trPr>
         <w:tc>
           <w:tcPr>
@@ -2419,7 +2721,6 @@
       <w:tr>
         <w:trPr>
           <w:cantSplit/>
-          <w:cantSplit/>
         </w:trPr>
         <w:tc>
           <w:tcPr>
@@ -2462,7 +2763,6 @@
       </w:tr>
       <w:tr>
         <w:trPr>
-          <w:cantSplit/>
           <w:cantSplit/>
         </w:trPr>
         <w:tc>
@@ -2516,9 +2816,6 @@
         <w:pStyle w:val="Heading2"/>
       </w:pPr>
       <w:r>
-        <w:rPr>
-          <w:sz w:val="22"/>
-        </w:rPr>
         <w:lastRenderedPageBreak/>
         <w:t>Opt-In Extraction  (opt_in_extractor.py)</w:t>
       </w:r>
@@ -2585,7 +2882,61 @@
           <w:sz w:val="18"/>
         </w:rPr>
         <w:br/>
-        <w:t xml:space="preserve">  "form_type": "routeone" | "dealertrack" | "unknown",</w:t>
+        <w:t xml:space="preserve">  "</w:t>
+      </w:r>
+      <w:proofErr w:type="spellStart"/>
+      <w:r>
+        <w:rPr>
+          <w:rFonts w:ascii="Courier New" w:hAnsi="Courier New"/>
+          <w:color w:val="1F507D"/>
+          <w:sz w:val="18"/>
+        </w:rPr>
+        <w:t>form_type</w:t>
+      </w:r>
+      <w:proofErr w:type="spellEnd"/>
+      <w:r>
+        <w:rPr>
+          <w:rFonts w:ascii="Courier New" w:hAnsi="Courier New"/>
+          <w:color w:val="1F507D"/>
+          <w:sz w:val="18"/>
+        </w:rPr>
+        <w:t>": "</w:t>
+      </w:r>
+      <w:proofErr w:type="spellStart"/>
+      <w:r>
+        <w:rPr>
+          <w:rFonts w:ascii="Courier New" w:hAnsi="Courier New"/>
+          <w:color w:val="1F507D"/>
+          <w:sz w:val="18"/>
+        </w:rPr>
+        <w:t>routeone</w:t>
+      </w:r>
+      <w:proofErr w:type="spellEnd"/>
+      <w:r>
+        <w:rPr>
+          <w:rFonts w:ascii="Courier New" w:hAnsi="Courier New"/>
+          <w:color w:val="1F507D"/>
+          <w:sz w:val="18"/>
+        </w:rPr>
+        <w:t>" | "</w:t>
+      </w:r>
+      <w:proofErr w:type="spellStart"/>
+      <w:r>
+        <w:rPr>
+          <w:rFonts w:ascii="Courier New" w:hAnsi="Courier New"/>
+          <w:color w:val="1F507D"/>
+          <w:sz w:val="18"/>
+        </w:rPr>
+        <w:t>dealertrack</w:t>
+      </w:r>
+      <w:proofErr w:type="spellEnd"/>
+      <w:r>
+        <w:rPr>
+          <w:rFonts w:ascii="Courier New" w:hAnsi="Courier New"/>
+          <w:color w:val="1F507D"/>
+          <w:sz w:val="18"/>
+        </w:rPr>
+        <w:t>" | "unknown",</w:t>
       </w:r>
       <w:r>
         <w:rPr>
@@ -2594,7 +2945,25 @@
           <w:sz w:val="18"/>
         </w:rPr>
         <w:br/>
-        <w:t xml:space="preserve">  "last_name": "&lt;string or null&gt;",</w:t>
+        <w:t xml:space="preserve">  "</w:t>
+      </w:r>
+      <w:proofErr w:type="spellStart"/>
+      <w:r>
+        <w:rPr>
+          <w:rFonts w:ascii="Courier New" w:hAnsi="Courier New"/>
+          <w:color w:val="1F507D"/>
+          <w:sz w:val="18"/>
+        </w:rPr>
+        <w:t>last_name</w:t>
+      </w:r>
+      <w:proofErr w:type="spellEnd"/>
+      <w:r>
+        <w:rPr>
+          <w:rFonts w:ascii="Courier New" w:hAnsi="Courier New"/>
+          <w:color w:val="1F507D"/>
+          <w:sz w:val="18"/>
+        </w:rPr>
+        <w:t>": "&lt;string or null&gt;",</w:t>
       </w:r>
       <w:r>
         <w:rPr>
@@ -2603,7 +2972,25 @@
           <w:sz w:val="18"/>
         </w:rPr>
         <w:br/>
-        <w:t xml:space="preserve">  "first_name": "&lt;string or null&gt;",</w:t>
+        <w:t xml:space="preserve">  "</w:t>
+      </w:r>
+      <w:proofErr w:type="spellStart"/>
+      <w:r>
+        <w:rPr>
+          <w:rFonts w:ascii="Courier New" w:hAnsi="Courier New"/>
+          <w:color w:val="1F507D"/>
+          <w:sz w:val="18"/>
+        </w:rPr>
+        <w:t>first_name</w:t>
+      </w:r>
+      <w:proofErr w:type="spellEnd"/>
+      <w:r>
+        <w:rPr>
+          <w:rFonts w:ascii="Courier New" w:hAnsi="Courier New"/>
+          <w:color w:val="1F507D"/>
+          <w:sz w:val="18"/>
+        </w:rPr>
+        <w:t>": "&lt;string or null&gt;",</w:t>
       </w:r>
       <w:r>
         <w:rPr>
@@ -2612,7 +2999,79 @@
           <w:sz w:val="18"/>
         </w:rPr>
         <w:br/>
-        <w:t xml:space="preserve">  "opt_in_status": "opted_in" | "opted_out" | "unclear" | "not_found",</w:t>
+        <w:t xml:space="preserve">  "</w:t>
+      </w:r>
+      <w:proofErr w:type="spellStart"/>
+      <w:r>
+        <w:rPr>
+          <w:rFonts w:ascii="Courier New" w:hAnsi="Courier New"/>
+          <w:color w:val="1F507D"/>
+          <w:sz w:val="18"/>
+        </w:rPr>
+        <w:t>opt_in_status</w:t>
+      </w:r>
+      <w:proofErr w:type="spellEnd"/>
+      <w:r>
+        <w:rPr>
+          <w:rFonts w:ascii="Courier New" w:hAnsi="Courier New"/>
+          <w:color w:val="1F507D"/>
+          <w:sz w:val="18"/>
+        </w:rPr>
+        <w:t>": "</w:t>
+      </w:r>
+      <w:proofErr w:type="spellStart"/>
+      <w:r>
+        <w:rPr>
+          <w:rFonts w:ascii="Courier New" w:hAnsi="Courier New"/>
+          <w:color w:val="1F507D"/>
+          <w:sz w:val="18"/>
+        </w:rPr>
+        <w:t>opted_in</w:t>
+      </w:r>
+      <w:proofErr w:type="spellEnd"/>
+      <w:r>
+        <w:rPr>
+          <w:rFonts w:ascii="Courier New" w:hAnsi="Courier New"/>
+          <w:color w:val="1F507D"/>
+          <w:sz w:val="18"/>
+        </w:rPr>
+        <w:t>" | "</w:t>
+      </w:r>
+      <w:proofErr w:type="spellStart"/>
+      <w:r>
+        <w:rPr>
+          <w:rFonts w:ascii="Courier New" w:hAnsi="Courier New"/>
+          <w:color w:val="1F507D"/>
+          <w:sz w:val="18"/>
+        </w:rPr>
+        <w:t>opted_out</w:t>
+      </w:r>
+      <w:proofErr w:type="spellEnd"/>
+      <w:r>
+        <w:rPr>
+          <w:rFonts w:ascii="Courier New" w:hAnsi="Courier New"/>
+          <w:color w:val="1F507D"/>
+          <w:sz w:val="18"/>
+        </w:rPr>
+        <w:t>" | "unclear" | "</w:t>
+      </w:r>
+      <w:proofErr w:type="spellStart"/>
+      <w:r>
+        <w:rPr>
+          <w:rFonts w:ascii="Courier New" w:hAnsi="Courier New"/>
+          <w:color w:val="1F507D"/>
+          <w:sz w:val="18"/>
+        </w:rPr>
+        <w:t>not_found</w:t>
+      </w:r>
+      <w:proofErr w:type="spellEnd"/>
+      <w:r>
+        <w:rPr>
+          <w:rFonts w:ascii="Courier New" w:hAnsi="Courier New"/>
+          <w:color w:val="1F507D"/>
+          <w:sz w:val="18"/>
+        </w:rPr>
+        <w:t>",</w:t>
       </w:r>
       <w:r>
         <w:rPr>
@@ -2621,7 +3080,25 @@
           <w:sz w:val="18"/>
         </w:rPr>
         <w:br/>
-        <w:t xml:space="preserve">  "telemarketing_phones": ["&lt;phone&gt;", ...],</w:t>
+        <w:t xml:space="preserve">  "</w:t>
+      </w:r>
+      <w:proofErr w:type="spellStart"/>
+      <w:r>
+        <w:rPr>
+          <w:rFonts w:ascii="Courier New" w:hAnsi="Courier New"/>
+          <w:color w:val="1F507D"/>
+          <w:sz w:val="18"/>
+        </w:rPr>
+        <w:t>telemarketing_phones</w:t>
+      </w:r>
+      <w:proofErr w:type="spellEnd"/>
+      <w:r>
+        <w:rPr>
+          <w:rFonts w:ascii="Courier New" w:hAnsi="Courier New"/>
+          <w:color w:val="1F507D"/>
+          <w:sz w:val="18"/>
+        </w:rPr>
+        <w:t>": ["&lt;phone&gt;", ...],</w:t>
       </w:r>
       <w:r>
         <w:rPr>
@@ -2668,7 +3145,6 @@
       <w:r>
         <w:rPr>
           <w:b w:val="0"/>
-          <w:sz w:val="22"/>
         </w:rPr>
         <w:lastRenderedPageBreak/>
         <w:t>3.3  Large-File Processing: Sliding Window</w:t>
@@ -2700,7 +3176,23 @@
           <w:sz w:val="18"/>
         </w:rPr>
         <w:br/>
-        <w:t xml:space="preserve">  pg:  1          20  21         40  41         60  61         80</w:t>
+        <w:t xml:space="preserve">  </w:t>
+      </w:r>
+      <w:proofErr w:type="spellStart"/>
+      <w:r>
+        <w:rPr>
+          <w:rFonts w:ascii="Courier New" w:hAnsi="Courier New"/>
+          <w:sz w:val="18"/>
+        </w:rPr>
+        <w:t>pg</w:t>
+      </w:r>
+      <w:proofErr w:type="spellEnd"/>
+      <w:r>
+        <w:rPr>
+          <w:rFonts w:ascii="Courier New" w:hAnsi="Courier New"/>
+          <w:sz w:val="18"/>
+        </w:rPr>
+        <w:t>:  1          20  21         40  41         60  61         80</w:t>
       </w:r>
       <w:r>
         <w:rPr>
@@ -2762,7 +3254,55 @@
           <w:sz w:val="18"/>
         </w:rPr>
         <w:br/>
-        <w:t xml:space="preserve">  Window 1 (pg 1-40)          Window 2 (pg 21-60)         Window 3 (pg 41-80)</w:t>
+        <w:t xml:space="preserve">  Window 1 (</w:t>
+      </w:r>
+      <w:proofErr w:type="spellStart"/>
+      <w:r>
+        <w:rPr>
+          <w:rFonts w:ascii="Courier New" w:hAnsi="Courier New"/>
+          <w:sz w:val="18"/>
+        </w:rPr>
+        <w:t>pg</w:t>
+      </w:r>
+      <w:proofErr w:type="spellEnd"/>
+      <w:r>
+        <w:rPr>
+          <w:rFonts w:ascii="Courier New" w:hAnsi="Courier New"/>
+          <w:sz w:val="18"/>
+        </w:rPr>
+        <w:t xml:space="preserve"> 1-40)          Window 2 (</w:t>
+      </w:r>
+      <w:proofErr w:type="spellStart"/>
+      <w:r>
+        <w:rPr>
+          <w:rFonts w:ascii="Courier New" w:hAnsi="Courier New"/>
+          <w:sz w:val="18"/>
+        </w:rPr>
+        <w:t>pg</w:t>
+      </w:r>
+      <w:proofErr w:type="spellEnd"/>
+      <w:r>
+        <w:rPr>
+          <w:rFonts w:ascii="Courier New" w:hAnsi="Courier New"/>
+          <w:sz w:val="18"/>
+        </w:rPr>
+        <w:t xml:space="preserve"> 21-60)         Window 3 (</w:t>
+      </w:r>
+      <w:proofErr w:type="spellStart"/>
+      <w:r>
+        <w:rPr>
+          <w:rFonts w:ascii="Courier New" w:hAnsi="Courier New"/>
+          <w:sz w:val="18"/>
+        </w:rPr>
+        <w:t>pg</w:t>
+      </w:r>
+      <w:proofErr w:type="spellEnd"/>
+      <w:r>
+        <w:rPr>
+          <w:rFonts w:ascii="Courier New" w:hAnsi="Courier New"/>
+          <w:sz w:val="18"/>
+        </w:rPr>
+        <w:t xml:space="preserve"> 41-80)</w:t>
       </w:r>
       <w:r>
         <w:rPr>
@@ -2770,14 +3310,7 @@
           <w:sz w:val="18"/>
         </w:rPr>
         <w:br/>
-        <w:t xml:space="preserve">  +</w:t>
-      </w:r>
-      <w:r>
-        <w:rPr>
-          <w:rFonts w:ascii="Courier New" w:hAnsi="Courier New"/>
-          <w:sz w:val="18"/>
-        </w:rPr>
-        <w:t>----------+----------+     +----------+----------+     +----------+----------+</w:t>
+        <w:t xml:space="preserve">  +----------+----------+     +----------+----------+     +----------+----------+</w:t>
       </w:r>
       <w:r>
         <w:rPr>
@@ -2825,14 +3358,7 @@
           <w:sz w:val="18"/>
         </w:rPr>
         <w:br/>
-        <w:t xml:space="preserve">  page is in Chunk 1          page is in </w:t>
-      </w:r>
-      <w:r>
-        <w:rPr>
-          <w:rFonts w:ascii="Courier New" w:hAnsi="Courier New"/>
-          <w:sz w:val="18"/>
-        </w:rPr>
-        <w:t>Chunk 2          page is in Chunk 3</w:t>
+        <w:t xml:space="preserve">  page is in Chunk 1          page is in Chunk 2          page is in Chunk 3</w:t>
       </w:r>
       <w:r>
         <w:rPr>
@@ -2894,7 +3420,23 @@
           <w:sz w:val="18"/>
         </w:rPr>
         <w:br/>
-        <w:t xml:space="preserve">  Two 20-page chunk PDFs  +  PaddleOCR models (~2-3 GB)</w:t>
+        <w:t xml:space="preserve">  Two 20-page chunk PDFs  +  </w:t>
+      </w:r>
+      <w:proofErr w:type="spellStart"/>
+      <w:r>
+        <w:rPr>
+          <w:rFonts w:ascii="Courier New" w:hAnsi="Courier New"/>
+          <w:sz w:val="18"/>
+        </w:rPr>
+        <w:t>PaddleOCR</w:t>
+      </w:r>
+      <w:proofErr w:type="spellEnd"/>
+      <w:r>
+        <w:rPr>
+          <w:rFonts w:ascii="Courier New" w:hAnsi="Courier New"/>
+          <w:sz w:val="18"/>
+        </w:rPr>
+        <w:t xml:space="preserve"> models (~2-3 GB)</w:t>
       </w:r>
       <w:r>
         <w:rPr>
@@ -2907,7 +3449,23 @@
     </w:p>
     <w:p>
       <w:r>
-        <w:t>Each chunk is a small PDF written to a temporary _overlap_chunks/ sub-folder. The analysis window loads two consecutive chunks at once, so any document that straddles a chunk boundary is always seen whole within a single window and emitted correctly as one output file. Once a window finishes, the left chunk is released from memory and the right chunk becomes the new left, keeping RAM usage constant regardless of how large the source PDF is.</w:t>
+        <w:t xml:space="preserve">Each chunk is a small PDF written </w:t>
+      </w:r>
+      <w:proofErr w:type="gramStart"/>
+      <w:r>
+        <w:t>to</w:t>
+      </w:r>
+      <w:proofErr w:type="gramEnd"/>
+      <w:r>
+        <w:t xml:space="preserve"> a temporary _</w:t>
+      </w:r>
+      <w:proofErr w:type="spellStart"/>
+      <w:r>
+        <w:t>overlap_chunks</w:t>
+      </w:r>
+      <w:proofErr w:type="spellEnd"/>
+      <w:r>
+        <w:t>/ sub-folder. The analysis window loads two consecutive chunks at once, so any document that straddles a chunk boundary is always seen whole within a single window and emitted correctly as one output file. Once a window finishes, the left chunk is released from memory and the right chunk becomes the new left, keeping RAM usage constant regardless of how large the source PDF is.</w:t>
       </w:r>
     </w:p>
     <w:p>
@@ -2918,7 +3476,59 @@
     <w:p>
       <w:r>
         <w:lastRenderedPageBreak/>
-        <w:t>Windowed chunking is controlled by the PDF_EXTRACTOR_OVERLAP_CHUNK_PAGES environment variable (set to 20 by default in the Docker image). To enable locally: $env:PDF_EXTRACTOR_OVERLAP_CHUNK_PAGES = "20"</w:t>
+        <w:t xml:space="preserve">Windowed chunking is controlled by the </w:t>
+      </w:r>
+      <w:r>
+        <w:rPr>
+          <w:rFonts w:ascii="Courier New" w:hAnsi="Courier New" w:cs="Courier New"/>
+          <w:color w:val="984806" w:themeColor="accent6" w:themeShade="80"/>
+          <w:sz w:val="20"/>
+          <w:szCs w:val="20"/>
+        </w:rPr>
+        <w:t>PDF_EXTRACTOR_OVERLAP_CHUNK_PAGES</w:t>
+      </w:r>
+      <w:r>
+        <w:rPr>
+          <w:color w:val="984806" w:themeColor="accent6" w:themeShade="80"/>
+        </w:rPr>
+        <w:t xml:space="preserve"> </w:t>
+      </w:r>
+      <w:r>
+        <w:t xml:space="preserve">environment variable (set to 20 by default in the Docker image). </w:t>
+      </w:r>
+    </w:p>
+    <w:p>
+      <w:r>
+        <w:t xml:space="preserve">To enable locally: </w:t>
+      </w:r>
+      <w:r>
+        <w:rPr>
+          <w:rFonts w:ascii="Courier New" w:hAnsi="Courier New" w:cs="Courier New"/>
+          <w:color w:val="984806" w:themeColor="accent6" w:themeShade="80"/>
+          <w:sz w:val="20"/>
+          <w:szCs w:val="20"/>
+        </w:rPr>
+        <w:t>$</w:t>
+      </w:r>
+      <w:proofErr w:type="spellStart"/>
+      <w:r>
+        <w:rPr>
+          <w:rFonts w:ascii="Courier New" w:hAnsi="Courier New" w:cs="Courier New"/>
+          <w:color w:val="984806" w:themeColor="accent6" w:themeShade="80"/>
+          <w:sz w:val="20"/>
+          <w:szCs w:val="20"/>
+        </w:rPr>
+        <w:t>env:PDF_EXTRACTOR_OVERLAP_CHUNK_PAGES</w:t>
+      </w:r>
+      <w:proofErr w:type="spellEnd"/>
+      <w:r>
+        <w:rPr>
+          <w:rFonts w:ascii="Courier New" w:hAnsi="Courier New" w:cs="Courier New"/>
+          <w:color w:val="984806" w:themeColor="accent6" w:themeShade="80"/>
+          <w:sz w:val="20"/>
+          <w:szCs w:val="20"/>
+        </w:rPr>
+        <w:t xml:space="preserve"> = "20"</w:t>
       </w:r>
     </w:p>
     <w:p/>
@@ -2929,7 +3539,6 @@
       <w:r>
         <w:rPr>
           <w:b w:val="0"/>
-          <w:sz w:val="22"/>
         </w:rPr>
         <w:t>3.4  Duplicate Detection and Perceptual Hashing</w:t>
       </w:r>
@@ -2951,8 +3560,29 @@
       <w:pPr>
         <w:pStyle w:val="ListNumber"/>
       </w:pPr>
-      <w:r>
-        <w:t>Semantic-title dedup: if two document groups share the same normalised title key and the same declared page count, the second group is discarded. Catches duplicate multi-page forms such as two copies of a 3-page credit application.</w:t>
+      <w:proofErr w:type="gramStart"/>
+      <w:r>
+        <w:t>Semantic-title</w:t>
+      </w:r>
+      <w:proofErr w:type="gramEnd"/>
+      <w:r>
+        <w:t xml:space="preserve"> </w:t>
+      </w:r>
+      <w:proofErr w:type="spellStart"/>
+      <w:r>
+        <w:t>dedup</w:t>
+      </w:r>
+      <w:proofErr w:type="spellEnd"/>
+      <w:r>
+        <w:t xml:space="preserve">: if two document groups share the same </w:t>
+      </w:r>
+      <w:proofErr w:type="spellStart"/>
+      <w:r>
+        <w:t>normalised</w:t>
+      </w:r>
+      <w:proofErr w:type="spellEnd"/>
+      <w:r>
+        <w:t xml:space="preserve"> title key and the same declared page count, the second group is discarded. Catches duplicate multi-page forms such as two copies of a 3-page credit application.</w:t>
       </w:r>
     </w:p>
     <w:p>
@@ -2960,12 +3590,28 @@
         <w:pStyle w:val="ListNumber"/>
       </w:pPr>
       <w:r>
-        <w:t>Perceptual hash (aHash): the first page of each surviving document is fingerprinted visually. Pairs whose fingerprints are within a similarity threshold are flagged as suspected duplicates in suspected_duplicates.txt.</w:t>
+        <w:t>Perceptual hash (</w:t>
+      </w:r>
+      <w:proofErr w:type="spellStart"/>
+      <w:r>
+        <w:t>aHash</w:t>
+      </w:r>
+      <w:proofErr w:type="spellEnd"/>
+      <w:r>
+        <w:t>): the first page of each surviving document is fingerprinted visually. Pairs whose fingerprints are within a similarity threshold are flagged as suspected duplicates in suspected_duplicates.txt.</w:t>
       </w:r>
     </w:p>
     <w:p>
       <w:r>
-        <w:t>Why not just use SHA-256 for all three layers? A cryptographic hash changes completely if even one pixel differs — two scans of the same printed form will produce entirely different SHA-256 values because scan angle, brightness, and compression vary. Perceptual hashing (aHash) is designed to be visually similar rather than byte-identical:</w:t>
+        <w:t>Why not just use SHA-256 for all three layers? A cryptographic hash changes completely if even one pixel differs — two scans of the same printed form will produce entirely different SHA-256 values because scan angle, brightness, and compression vary. Perceptual hashing (</w:t>
+      </w:r>
+      <w:proofErr w:type="spellStart"/>
+      <w:r>
+        <w:t>aHash</w:t>
+      </w:r>
+      <w:proofErr w:type="spellEnd"/>
+      <w:r>
+        <w:t>) is designed to be visually similar rather than byte-identical:</w:t>
       </w:r>
     </w:p>
     <w:p>
@@ -2974,7 +3620,23 @@
           <w:rFonts w:ascii="Courier New" w:hAnsi="Courier New"/>
           <w:sz w:val="18"/>
         </w:rPr>
-        <w:t>Step 1 - Render the first page of each output document at 64 px wide</w:t>
+        <w:t xml:space="preserve">Step 1 - Render the first page of each output document at 64 </w:t>
+      </w:r>
+      <w:proofErr w:type="spellStart"/>
+      <w:r>
+        <w:rPr>
+          <w:rFonts w:ascii="Courier New" w:hAnsi="Courier New"/>
+          <w:sz w:val="18"/>
+        </w:rPr>
+        <w:t>px</w:t>
+      </w:r>
+      <w:proofErr w:type="spellEnd"/>
+      <w:r>
+        <w:rPr>
+          <w:rFonts w:ascii="Courier New" w:hAnsi="Courier New"/>
+          <w:sz w:val="18"/>
+        </w:rPr>
+        <w:t xml:space="preserve"> wide</w:t>
       </w:r>
       <w:r>
         <w:rPr>
@@ -2982,8 +3644,33 @@
           <w:sz w:val="18"/>
         </w:rPr>
         <w:br/>
-        <w:t xml:space="preserve">         Full-size scan (e.g. 2,550 x 3,300 px)  -&gt;  64 x 49 px</w:t>
-      </w:r>
+        <w:t xml:space="preserve">         Full-size scan (e.g. 2,550 x 3,300 </w:t>
+      </w:r>
+      <w:proofErr w:type="spellStart"/>
+      <w:r>
+        <w:rPr>
+          <w:rFonts w:ascii="Courier New" w:hAnsi="Courier New"/>
+          <w:sz w:val="18"/>
+        </w:rPr>
+        <w:t>px</w:t>
+      </w:r>
+      <w:proofErr w:type="spellEnd"/>
+      <w:r>
+        <w:rPr>
+          <w:rFonts w:ascii="Courier New" w:hAnsi="Courier New"/>
+          <w:sz w:val="18"/>
+        </w:rPr>
+        <w:t xml:space="preserve">)  -&gt;  64 x 49 </w:t>
+      </w:r>
+      <w:proofErr w:type="spellStart"/>
+      <w:r>
+        <w:rPr>
+          <w:rFonts w:ascii="Courier New" w:hAnsi="Courier New"/>
+          <w:sz w:val="18"/>
+        </w:rPr>
+        <w:t>px</w:t>
+      </w:r>
+      <w:proofErr w:type="spellEnd"/>
       <w:r>
         <w:rPr>
           <w:rFonts w:ascii="Courier New" w:hAnsi="Courier New"/>
@@ -3092,14 +3779,7 @@
           <w:sz w:val="18"/>
         </w:rPr>
         <w:br/>
-        <w:t xml:space="preserve">         | ......</w:t>
-      </w:r>
-      <w:r>
-        <w:rPr>
-          <w:rFonts w:ascii="Courier New" w:hAnsi="Courier New"/>
-          <w:sz w:val="18"/>
-        </w:rPr>
-        <w:t>.. |</w:t>
+        <w:t xml:space="preserve">         | ........ |</w:t>
       </w:r>
       <w:r>
         <w:rPr>
@@ -3138,7 +3818,23 @@
           <w:sz w:val="18"/>
         </w:rPr>
         <w:br/>
-        <w:t xml:space="preserve">         Result: a single 64-bit integer  (the perceptual hash / aHash)</w:t>
+        <w:t xml:space="preserve">         Result: a single 64-bit integer  (the perceptual hash / </w:t>
+      </w:r>
+      <w:proofErr w:type="spellStart"/>
+      <w:r>
+        <w:rPr>
+          <w:rFonts w:ascii="Courier New" w:hAnsi="Courier New"/>
+          <w:sz w:val="18"/>
+        </w:rPr>
+        <w:t>aHash</w:t>
+      </w:r>
+      <w:proofErr w:type="spellEnd"/>
+      <w:r>
+        <w:rPr>
+          <w:rFonts w:ascii="Courier New" w:hAnsi="Courier New"/>
+          <w:sz w:val="18"/>
+        </w:rPr>
+        <w:t>)</w:t>
       </w:r>
       <w:r>
         <w:rPr>
@@ -3175,14 +3871,8 @@
           <w:rFonts w:ascii="Courier New" w:hAnsi="Courier New"/>
           <w:sz w:val="18"/>
         </w:rPr>
+        <w:lastRenderedPageBreak/>
         <w:br/>
-      </w:r>
-      <w:r>
-        <w:rPr>
-          <w:rFonts w:ascii="Courier New" w:hAnsi="Courier New"/>
-          <w:sz w:val="18"/>
-        </w:rPr>
-        <w:lastRenderedPageBreak/>
         <w:t xml:space="preserve">         Hash A: 1010110011101001...  (page from deal A)</w:t>
       </w:r>
       <w:r>
@@ -3222,14 +3912,7 @@
           <w:sz w:val="18"/>
         </w:rPr>
         <w:br/>
-        <w:t xml:space="preserve">       </w:t>
-      </w:r>
-      <w:r>
-        <w:rPr>
-          <w:rFonts w:ascii="Courier New" w:hAnsi="Courier New"/>
-          <w:sz w:val="18"/>
-        </w:rPr>
-        <w:t xml:space="preserve">  Our threshold = 10 bits out of 64  (~84% visual similarity)</w:t>
+        <w:t xml:space="preserve">         Our threshold = 10 bits out of 64  (~84% visual similarity)</w:t>
       </w:r>
       <w:r>
         <w:rPr>
@@ -3257,7 +3940,15 @@
     </w:p>
     <w:p>
       <w:r>
-        <w:t>Suspected duplicate pairs are flagged rather than automatically deleted so a human can verify the result. Two contracts of the same form type (e.g. two Blue Steel Protection agreements for different customers) will have similar hashes but represent distinct documents and should not be merged.</w:t>
+        <w:t xml:space="preserve">Suspected duplicate pairs are flagged rather than automatically deleted so a human can verify the result. Two contracts of the same </w:t>
+      </w:r>
+      <w:proofErr w:type="gramStart"/>
+      <w:r>
+        <w:t>form type</w:t>
+      </w:r>
+      <w:proofErr w:type="gramEnd"/>
+      <w:r>
+        <w:t xml:space="preserve"> (e.g. two Blue Steel Protection agreements for different customers) will have similar hashes but represent distinct documents and should not be merged.</w:t>
       </w:r>
     </w:p>
     <w:p>
@@ -3265,15 +3956,28 @@
         <w:pStyle w:val="Heading1"/>
       </w:pPr>
       <w:r>
-        <w:rPr>
-          <w:sz w:val="24"/>
-        </w:rPr>
         <w:t>4. Execution Flow (Azure Mode)</w:t>
       </w:r>
     </w:p>
     <w:p>
       <w:r>
-        <w:t>Manual trigger  (az containerapp job start)</w:t>
+        <w:t>Manual trigger  (</w:t>
+      </w:r>
+      <w:proofErr w:type="spellStart"/>
+      <w:r>
+        <w:t>az</w:t>
+      </w:r>
+      <w:proofErr w:type="spellEnd"/>
+      <w:r>
+        <w:t xml:space="preserve"> </w:t>
+      </w:r>
+      <w:proofErr w:type="spellStart"/>
+      <w:r>
+        <w:t>containerapp</w:t>
+      </w:r>
+      <w:proofErr w:type="spellEnd"/>
+      <w:r>
+        <w:t xml:space="preserve"> job start)</w:t>
       </w:r>
       <w:r>
         <w:br/>
@@ -3281,7 +3985,15 @@
       </w:r>
       <w:r>
         <w:br/>
-        <w:t xml:space="preserve"> +-- Download input PDF from Azure Blob Storage  (pdfinput container)</w:t>
+        <w:t xml:space="preserve"> +-- Download input PDF from Azure Blob Storage  (</w:t>
+      </w:r>
+      <w:proofErr w:type="spellStart"/>
+      <w:r>
+        <w:t>pdfinput</w:t>
+      </w:r>
+      <w:proofErr w:type="spellEnd"/>
+      <w:r>
+        <w:t xml:space="preserve"> container)</w:t>
       </w:r>
       <w:r>
         <w:br/>
@@ -3293,11 +4005,27 @@
       </w:r>
       <w:r>
         <w:br/>
-        <w:t xml:space="preserve"> |     +-- pypdf text extraction  (fast, digital pages)</w:t>
+        <w:t xml:space="preserve"> |     +-- </w:t>
+      </w:r>
+      <w:proofErr w:type="spellStart"/>
+      <w:r>
+        <w:t>pypdf</w:t>
+      </w:r>
+      <w:proofErr w:type="spellEnd"/>
+      <w:r>
+        <w:t xml:space="preserve"> text extraction  (fast, digital pages)</w:t>
       </w:r>
       <w:r>
         <w:br/>
-        <w:t xml:space="preserve"> |     +-- PaddleOCR              (slower, scanned pages)</w:t>
+        <w:t xml:space="preserve"> |     +-- </w:t>
+      </w:r>
+      <w:proofErr w:type="spellStart"/>
+      <w:r>
+        <w:t>PaddleOCR</w:t>
+      </w:r>
+      <w:proofErr w:type="spellEnd"/>
+      <w:r>
+        <w:t xml:space="preserve">              (slower, scanned pages)</w:t>
       </w:r>
       <w:r>
         <w:br/>
@@ -3305,7 +4033,23 @@
       </w:r>
       <w:r>
         <w:br/>
-        <w:t xml:space="preserve"> +-- Upload split PDFs  -&gt;  pdfoutput/{source_filename}/ subfolder</w:t>
+        <w:t xml:space="preserve"> +-- Upload split PDFs  -&gt;  </w:t>
+      </w:r>
+      <w:proofErr w:type="spellStart"/>
+      <w:r>
+        <w:t>pdfoutput</w:t>
+      </w:r>
+      <w:proofErr w:type="spellEnd"/>
+      <w:r>
+        <w:t>/{</w:t>
+      </w:r>
+      <w:proofErr w:type="spellStart"/>
+      <w:r>
+        <w:t>source_filename</w:t>
+      </w:r>
+      <w:proofErr w:type="spellEnd"/>
+      <w:r>
+        <w:t>}/ subfolder</w:t>
       </w:r>
       <w:r>
         <w:br/>
@@ -3330,7 +4074,31 @@
     </w:p>
     <w:p>
       <w:r>
-        <w:t>Credentials (storage connection string, OpenAI API key) are stored as Container Apps secrets and injected as environment variables at runtime. The container image is built in Azure Container Registry (NaderContainerRegistry) and tagged :latest on each code push.</w:t>
+        <w:t xml:space="preserve">Credentials (storage connection string, </w:t>
+      </w:r>
+      <w:r>
+        <w:rPr>
+          <w:rFonts w:ascii="Courier New" w:hAnsi="Courier New" w:cs="Courier New"/>
+          <w:color w:val="984806" w:themeColor="accent6" w:themeShade="80"/>
+          <w:sz w:val="20"/>
+          <w:szCs w:val="20"/>
+        </w:rPr>
+        <w:t>OpenAI API key</w:t>
+      </w:r>
+      <w:r>
+        <w:t>) are stored as Container Apps secrets and injected as environment variables at runtime. The container image is built in Azure Container Registry (</w:t>
+      </w:r>
+      <w:r>
+        <w:rPr>
+          <w:rFonts w:ascii="Courier New" w:hAnsi="Courier New" w:cs="Courier New"/>
+          <w:color w:val="984806" w:themeColor="accent6" w:themeShade="80"/>
+          <w:sz w:val="20"/>
+          <w:szCs w:val="20"/>
+        </w:rPr>
+        <w:t>NaderContainerRegistry</w:t>
+      </w:r>
+      <w:r>
+        <w:t>) and tagged :latest on each code push.</w:t>
       </w:r>
     </w:p>
     <w:p>
@@ -3353,9 +4121,6 @@
         <w:pStyle w:val="Heading1"/>
       </w:pPr>
       <w:r>
-        <w:rPr>
-          <w:sz w:val="24"/>
-        </w:rPr>
         <w:lastRenderedPageBreak/>
         <w:t>5. Compute Configuration</w:t>
       </w:r>
@@ -3373,7 +4138,6 @@
       <w:tr>
         <w:trPr>
           <w:cantSplit/>
-          <w:cantSplit/>
         </w:trPr>
         <w:tc>
           <w:tcPr>
@@ -3419,7 +4183,6 @@
       <w:tr>
         <w:trPr>
           <w:cantSplit/>
-          <w:cantSplit/>
         </w:trPr>
         <w:tc>
           <w:tcPr>
@@ -3463,7 +4226,6 @@
       <w:tr>
         <w:trPr>
           <w:cantSplit/>
-          <w:cantSplit/>
         </w:trPr>
         <w:tc>
           <w:tcPr>
@@ -3507,7 +4269,6 @@
       <w:tr>
         <w:trPr>
           <w:cantSplit/>
-          <w:cantSplit/>
         </w:trPr>
         <w:tc>
           <w:tcPr>
@@ -3551,7 +4312,6 @@
       <w:tr>
         <w:trPr>
           <w:cantSplit/>
-          <w:cantSplit/>
         </w:trPr>
         <w:tc>
           <w:tcPr>
@@ -3595,7 +4355,6 @@
       <w:tr>
         <w:trPr>
           <w:cantSplit/>
-          <w:cantSplit/>
         </w:trPr>
         <w:tc>
           <w:tcPr>
@@ -3639,7 +4398,6 @@
       <w:tr>
         <w:trPr>
           <w:cantSplit/>
-          <w:cantSplit/>
         </w:trPr>
         <w:tc>
           <w:tcPr>
@@ -3683,7 +4441,6 @@
       <w:tr>
         <w:trPr>
           <w:cantSplit/>
-          <w:cantSplit/>
         </w:trPr>
         <w:tc>
           <w:tcPr>
@@ -3727,7 +4484,6 @@
       <w:tr>
         <w:trPr>
           <w:cantSplit/>
-          <w:cantSplit/>
         </w:trPr>
         <w:tc>
           <w:tcPr>
@@ -3770,7 +4526,6 @@
       </w:tr>
       <w:tr>
         <w:trPr>
-          <w:cantSplit/>
           <w:cantSplit/>
         </w:trPr>
         <w:tc>
@@ -3818,9 +4573,6 @@
         <w:pStyle w:val="Heading1"/>
       </w:pPr>
       <w:r>
-        <w:rPr>
-          <w:sz w:val="24"/>
-        </w:rPr>
         <w:t>6. Cost Estimate</w:t>
       </w:r>
     </w:p>
@@ -3829,9 +4581,6 @@
         <w:pStyle w:val="Heading2"/>
       </w:pPr>
       <w:r>
-        <w:rPr>
-          <w:sz w:val="22"/>
-        </w:rPr>
         <w:t>Per-run billing  (Consumption plan, Central US)</w:t>
       </w:r>
     </w:p>
@@ -3854,7 +4603,6 @@
       <w:tr>
         <w:trPr>
           <w:cantSplit/>
-          <w:cantSplit/>
         </w:trPr>
         <w:tc>
           <w:tcPr>
@@ -3920,7 +4668,6 @@
       <w:tr>
         <w:trPr>
           <w:cantSplit/>
-          <w:cantSplit/>
         </w:trPr>
         <w:tc>
           <w:tcPr>
@@ -3983,7 +4730,6 @@
       <w:tr>
         <w:trPr>
           <w:cantSplit/>
-          <w:cantSplit/>
         </w:trPr>
         <w:tc>
           <w:tcPr>
@@ -4045,7 +4791,6 @@
       </w:tr>
       <w:tr>
         <w:trPr>
-          <w:cantSplit/>
           <w:cantSplit/>
         </w:trPr>
         <w:tc>
@@ -4107,25 +4852,78 @@
         <w:spacing w:before="400"/>
       </w:pPr>
       <w:r>
-        <w:rPr>
-          <w:b/>
-          <w:sz w:val="22"/>
-        </w:rPr>
         <w:t>Validated Cost Baseline  (2026-05-16 trial runs, Consumption 4 vCPU / 8 GiB)</w:t>
       </w:r>
     </w:p>
     <w:p>
       <w:r>
         <w:t>Three deal jacket files were timed under production conditions on Azure Container Apps Consumption 4 vCPU / 8 GiB (2026-05-16). Throughput is reported in pages per hour (the stable unit) and cost per source page (the recommended planning unit, since output document count varies by file density).</w:t>
+      </w:r>
+      <w:r>
         <w:br/>
+      </w:r>
+      <w:r>
         <w:br/>
-        <w:t>All-scanned files (every page requires OCR): 238 pages/hour | $0.00185 per source page.  Validated against 603110820.pdf: 457 pages → 36 documents in 1 h 55 m ($0.85 total).</w:t>
+      </w:r>
+      <w:r>
+        <w:rPr>
+          <w:color w:val="C00000"/>
+        </w:rPr>
+        <w:t xml:space="preserve">All-scanned files </w:t>
+      </w:r>
+      <w:r>
+        <w:t>(every page requires OCR): 238 pages/hour | $0.00185 per source page.  Validated against 603110820.pdf: 457 pages → 36 documents in 1 h 55 m ($0.85 total).</w:t>
+      </w:r>
+      <w:r>
         <w:br/>
+      </w:r>
+      <w:r>
         <w:br/>
-        <w:t>Mixed text+scanned files (typical): 465–549 pages/hour | $0.00080–$0.00094 per source page.  Validated against 601602726.pdf (35 pages → 15 docs in 4.5 min, $0.033) and 602954198.pdf (152 pages → 18 docs in 17 min, $0.12).</w:t>
+      </w:r>
+      <w:r>
+        <w:rPr>
+          <w:color w:val="C00000"/>
+        </w:rPr>
+        <w:t xml:space="preserve">Mixed </w:t>
+      </w:r>
+      <w:proofErr w:type="spellStart"/>
+      <w:r>
+        <w:rPr>
+          <w:color w:val="C00000"/>
+        </w:rPr>
+        <w:t>text+scanned</w:t>
+      </w:r>
+      <w:proofErr w:type="spellEnd"/>
+      <w:r>
+        <w:rPr>
+          <w:color w:val="C00000"/>
+        </w:rPr>
+        <w:t xml:space="preserve"> files </w:t>
+      </w:r>
+      <w:r>
+        <w:t>(typical): 465–549 pages/hour | $0.00080–$0.00094 per source page.  Validated against 601602726.pdf (35 pages → 15 docs in 4.5 min, $0.033) and 602954198.pdf (152 pages → 18 docs in 17 min, $0.12).</w:t>
+      </w:r>
+      <w:r>
         <w:br/>
+      </w:r>
+      <w:r>
         <w:br/>
-        <w:t>PaddleOCR is the throughput bottleneck and runs single-threaded. The all-scanned figure (238 pages/hr) represents the worst case; mixed files are 2–2.3× faster.</w:t>
+      </w:r>
+      <w:proofErr w:type="spellStart"/>
+      <w:r>
+        <w:t>PaddleOCR</w:t>
+      </w:r>
+      <w:proofErr w:type="spellEnd"/>
+      <w:r>
+        <w:t xml:space="preserve"> is the throughput bottleneck and runs single-threaded. The all-scanned figure (238 pages/</w:t>
+      </w:r>
+      <w:proofErr w:type="spellStart"/>
+      <w:r>
+        <w:t>hr</w:t>
+      </w:r>
+      <w:proofErr w:type="spellEnd"/>
+      <w:r>
+        <w:t>) represents the worst case; mixed files are 2–2.3× faster.</w:t>
       </w:r>
     </w:p>
     <w:tbl>
@@ -4141,7 +4939,6 @@
       <w:tr>
         <w:trPr>
           <w:cantSplit/>
-          <w:cantSplit/>
         </w:trPr>
         <w:tc>
           <w:tcPr>
@@ -4187,7 +4984,6 @@
       <w:tr>
         <w:trPr>
           <w:cantSplit/>
-          <w:cantSplit/>
         </w:trPr>
         <w:tc>
           <w:tcPr>
@@ -4204,7 +5000,21 @@
               <w:rPr>
                 <w:sz w:val="20"/>
               </w:rPr>
-              <w:t>Pages per hour  (all-scanned / mixed text+scan)</w:t>
+              <w:t xml:space="preserve">Pages per hour  (all-scanned / mixed </w:t>
+            </w:r>
+            <w:proofErr w:type="spellStart"/>
+            <w:r>
+              <w:rPr>
+                <w:sz w:val="20"/>
+              </w:rPr>
+              <w:t>text+scan</w:t>
+            </w:r>
+            <w:proofErr w:type="spellEnd"/>
+            <w:r>
+              <w:rPr>
+                <w:sz w:val="20"/>
+              </w:rPr>
+              <w:t>)</w:t>
             </w:r>
           </w:p>
         </w:tc>
@@ -4231,7 +5041,6 @@
       <w:tr>
         <w:trPr>
           <w:cantSplit/>
-          <w:cantSplit/>
         </w:trPr>
         <w:tc>
           <w:tcPr>
@@ -4275,7 +5084,6 @@
       <w:tr>
         <w:trPr>
           <w:cantSplit/>
-          <w:cantSplit/>
         </w:trPr>
         <w:tc>
           <w:tcPr>
@@ -4319,7 +5127,6 @@
       <w:tr>
         <w:trPr>
           <w:cantSplit/>
-          <w:cantSplit/>
         </w:trPr>
         <w:tc>
           <w:tcPr>
@@ -4363,6 +5170,7 @@
     </w:tbl>
     <w:p>
       <w:r>
+        <w:lastRenderedPageBreak/>
         <w:t>AI token costs are negligible (under $5 per million documents at the current 1.5% credit application rate). The dominant cost is CPU time for OCR.</w:t>
       </w:r>
     </w:p>
@@ -4371,9 +5179,6 @@
         <w:pStyle w:val="Heading1"/>
       </w:pPr>
       <w:r>
-        <w:rPr>
-          <w:sz w:val="24"/>
-        </w:rPr>
         <w:t>7. Current Hardware Limitations and Upgrade Path</w:t>
       </w:r>
     </w:p>
@@ -4382,21 +5187,25 @@
         <w:pStyle w:val="Heading2"/>
       </w:pPr>
       <w:r>
-        <w:rPr>
-          <w:sz w:val="22"/>
-        </w:rPr>
         <w:t>The file-size constraint</w:t>
       </w:r>
     </w:p>
     <w:p>
       <w:r>
-        <w:t>The Consumption plan allocates 8 GiB of RAM per execution. PaddleOCR loads its neural network models at startup (~2-3 GB). Earlier versions of the tool held the entire source PDF decoded in memory during processing, which made files larger than ~200 pages unreliable on this hardware.</w:t>
+        <w:t xml:space="preserve">The Consumption plan allocates 8 GiB of RAM per execution. </w:t>
+      </w:r>
+      <w:proofErr w:type="spellStart"/>
+      <w:r>
+        <w:t>PaddleOCR</w:t>
+      </w:r>
+      <w:proofErr w:type="spellEnd"/>
+      <w:r>
+        <w:t xml:space="preserve"> loads its neural network models at startup (~2-3 GB). Earlier versions of the tool held the entire source PDF decoded in memory during processing, which made files larger than ~200 pages unreliable on this hardware.</w:t>
       </w:r>
     </w:p>
     <w:p>
       <w:r>
-        <w:lastRenderedPageBreak/>
-        <w:t>The sliding-window chunking feature (Section 3.3) eliminates this constraint. Because only two 20-page chunk files are held in RAM at any time, the tool can now process files of any size on the standard 8 GiB Consumption plan. Validation: the 3,900-page batch file 602819077.pdf completed successfully in 1 h 42 min without any hardware upgrade.</w:t>
+        <w:t>The sliding-window chunking feature (Section 3.3) eliminates this constraint. Because only two 20-page chunk files are held in RAM at any time, the tool can now process files of any size on the standard 8 GiB Consumption plan. Validation: the 220-page all-scanned file 602819077.pdf completed successfully in 1 h 42 min without any hardware upgrade. (Note: that run used pre-optimisation OCR settings; current validated throughput is 238–549 pages/hr — see Section 6.)</w:t>
       </w:r>
     </w:p>
     <w:p>
@@ -4404,9 +5213,6 @@
         <w:pStyle w:val="Heading2"/>
       </w:pPr>
       <w:r>
-        <w:rPr>
-          <w:sz w:val="22"/>
-        </w:rPr>
         <w:t>Dedicated Workload Profile Options</w:t>
       </w:r>
     </w:p>
@@ -4436,7 +5242,6 @@
       <w:tr>
         <w:trPr>
           <w:cantSplit/>
-          <w:cantSplit/>
         </w:trPr>
         <w:tc>
           <w:tcPr>
@@ -4569,14 +5374,25 @@
                 <w:szCs w:val="20"/>
               </w:rPr>
               <w:br/>
-            </w:r>
+              <w:t xml:space="preserve">(24 </w:t>
+            </w:r>
+            <w:proofErr w:type="spellStart"/>
             <w:r>
               <w:rPr>
                 <w:b/>
                 <w:sz w:val="20"/>
                 <w:szCs w:val="20"/>
               </w:rPr>
-              <w:t>(24 hrs)</w:t>
+              <w:t>hrs</w:t>
+            </w:r>
+            <w:proofErr w:type="spellEnd"/>
+            <w:r>
+              <w:rPr>
+                <w:b/>
+                <w:sz w:val="20"/>
+                <w:szCs w:val="20"/>
+              </w:rPr>
+              <w:t>)</w:t>
             </w:r>
           </w:p>
         </w:tc>
@@ -4596,7 +5412,23 @@
                 <w:sz w:val="20"/>
                 <w:szCs w:val="20"/>
               </w:rPr>
-              <w:t>Daily cost | (10 hrs active)</w:t>
+              <w:t xml:space="preserve">Daily cost | (10 </w:t>
+            </w:r>
+            <w:proofErr w:type="spellStart"/>
+            <w:r>
+              <w:rPr>
+                <w:sz w:val="20"/>
+                <w:szCs w:val="20"/>
+              </w:rPr>
+              <w:t>hrs</w:t>
+            </w:r>
+            <w:proofErr w:type="spellEnd"/>
+            <w:r>
+              <w:rPr>
+                <w:sz w:val="20"/>
+                <w:szCs w:val="20"/>
+              </w:rPr>
+              <w:t xml:space="preserve"> active)</w:t>
             </w:r>
           </w:p>
         </w:tc>
@@ -4604,13 +5436,11 @@
       <w:tr>
         <w:trPr>
           <w:cantSplit/>
-          <w:cantSplit/>
         </w:trPr>
         <w:tc>
           <w:tcPr>
             <w:tcW w:w="1234" w:type="dxa"/>
             <w:shd w:val="clear" w:color="auto" w:fill="FFF2CC"/>
-            <w:shd w:val="clear" w:color="auto" w:fill="FFF2CC"/>
           </w:tcPr>
           <w:p>
             <w:pPr>
@@ -4632,7 +5462,6 @@
           <w:tcPr>
             <w:tcW w:w="1234" w:type="dxa"/>
             <w:shd w:val="clear" w:color="auto" w:fill="FFF2CC"/>
-            <w:shd w:val="clear" w:color="auto" w:fill="FFF2CC"/>
           </w:tcPr>
           <w:p>
             <w:pPr>
@@ -4654,7 +5483,6 @@
           <w:tcPr>
             <w:tcW w:w="1234" w:type="dxa"/>
             <w:shd w:val="clear" w:color="auto" w:fill="FFF2CC"/>
-            <w:shd w:val="clear" w:color="auto" w:fill="FFF2CC"/>
           </w:tcPr>
           <w:p>
             <w:pPr>
@@ -4676,7 +5504,6 @@
           <w:tcPr>
             <w:tcW w:w="1234" w:type="dxa"/>
             <w:shd w:val="clear" w:color="auto" w:fill="FFF2CC"/>
-            <w:shd w:val="clear" w:color="auto" w:fill="FFF2CC"/>
           </w:tcPr>
           <w:p>
             <w:pPr>
@@ -4698,29 +5525,36 @@
           <w:tcPr>
             <w:tcW w:w="1234" w:type="dxa"/>
             <w:shd w:val="clear" w:color="auto" w:fill="FFF2CC"/>
-            <w:shd w:val="clear" w:color="auto" w:fill="FFF2CC"/>
-          </w:tcPr>
-          <w:p>
-            <w:pPr>
-              <w:rPr>
-                <w:sz w:val="20"/>
-                <w:szCs w:val="20"/>
-              </w:rPr>
-            </w:pPr>
-            <w:r>
-              <w:rPr>
-                <w:sz w:val="20"/>
-                <w:szCs w:val="20"/>
-              </w:rPr>
-              <w:t>$0.44 / active hr</w:t>
-            </w:r>
+          </w:tcPr>
+          <w:p>
+            <w:pPr>
+              <w:rPr>
+                <w:sz w:val="20"/>
+                <w:szCs w:val="20"/>
+              </w:rPr>
+            </w:pPr>
+            <w:r>
+              <w:rPr>
+                <w:sz w:val="20"/>
+                <w:szCs w:val="20"/>
+              </w:rPr>
+              <w:t xml:space="preserve">$0.44 / active </w:t>
+            </w:r>
+            <w:proofErr w:type="spellStart"/>
+            <w:r>
+              <w:rPr>
+                <w:sz w:val="20"/>
+                <w:szCs w:val="20"/>
+              </w:rPr>
+              <w:t>hr</w:t>
+            </w:r>
+            <w:proofErr w:type="spellEnd"/>
           </w:p>
         </w:tc>
         <w:tc>
           <w:tcPr>
             <w:tcW w:w="1234" w:type="dxa"/>
             <w:shd w:val="clear" w:color="auto" w:fill="FFF2CC"/>
-            <w:shd w:val="clear" w:color="auto" w:fill="FFF2CC"/>
           </w:tcPr>
           <w:p>
             <w:pPr>
@@ -4741,7 +5575,6 @@
         <w:tc>
           <w:tcPr>
             <w:tcW w:w="1234" w:type="dxa"/>
-            <w:shd w:val="clear" w:color="auto" w:fill="FFF2CC"/>
             <w:shd w:val="clear" w:color="auto" w:fill="FFF2CC"/>
           </w:tcPr>
           <w:p>
@@ -4764,7 +5597,6 @@
       <w:tr>
         <w:trPr>
           <w:cantSplit/>
-          <w:cantSplit/>
         </w:trPr>
         <w:tc>
           <w:tcPr>
@@ -4837,12 +5669,21 @@
                 <w:szCs w:val="20"/>
               </w:rPr>
             </w:pPr>
-            <w:r>
-              <w:rPr>
-                <w:sz w:val="20"/>
-                <w:szCs w:val="20"/>
-              </w:rPr>
-              <w:t>Similar to Consumption but reserved</w:t>
+            <w:proofErr w:type="gramStart"/>
+            <w:r>
+              <w:rPr>
+                <w:sz w:val="20"/>
+                <w:szCs w:val="20"/>
+              </w:rPr>
+              <w:t>Similar to</w:t>
+            </w:r>
+            <w:proofErr w:type="gramEnd"/>
+            <w:r>
+              <w:rPr>
+                <w:sz w:val="20"/>
+                <w:szCs w:val="20"/>
+              </w:rPr>
+              <w:t xml:space="preserve"> Consumption but reserved</w:t>
             </w:r>
           </w:p>
         </w:tc>
@@ -4862,8 +5703,17 @@
                 <w:sz w:val="20"/>
                 <w:szCs w:val="20"/>
               </w:rPr>
-              <w:t>~$0.28 / hr</w:t>
-            </w:r>
+              <w:t xml:space="preserve">~$0.28 / </w:t>
+            </w:r>
+            <w:proofErr w:type="spellStart"/>
+            <w:r>
+              <w:rPr>
+                <w:sz w:val="20"/>
+                <w:szCs w:val="20"/>
+              </w:rPr>
+              <w:t>hr</w:t>
+            </w:r>
+            <w:proofErr w:type="spellEnd"/>
           </w:p>
         </w:tc>
         <w:tc>
@@ -4910,7 +5760,6 @@
       <w:tr>
         <w:trPr>
           <w:cantSplit/>
-          <w:cantSplit/>
         </w:trPr>
         <w:tc>
           <w:tcPr>
@@ -5008,8 +5857,17 @@
                 <w:sz w:val="20"/>
                 <w:szCs w:val="20"/>
               </w:rPr>
-              <w:t>~$0.55 / hr</w:t>
-            </w:r>
+              <w:t xml:space="preserve">~$0.55 / </w:t>
+            </w:r>
+            <w:proofErr w:type="spellStart"/>
+            <w:r>
+              <w:rPr>
+                <w:sz w:val="20"/>
+                <w:szCs w:val="20"/>
+              </w:rPr>
+              <w:t>hr</w:t>
+            </w:r>
+            <w:proofErr w:type="spellEnd"/>
           </w:p>
         </w:tc>
         <w:tc>
@@ -5056,7 +5914,6 @@
       <w:tr>
         <w:trPr>
           <w:cantSplit/>
-          <w:cantSplit/>
         </w:trPr>
         <w:tc>
           <w:tcPr>
@@ -5154,8 +6011,17 @@
                 <w:sz w:val="20"/>
                 <w:szCs w:val="20"/>
               </w:rPr>
-              <w:t>~$1.10 / hr</w:t>
-            </w:r>
+              <w:t xml:space="preserve">~$1.10 / </w:t>
+            </w:r>
+            <w:proofErr w:type="spellStart"/>
+            <w:r>
+              <w:rPr>
+                <w:sz w:val="20"/>
+                <w:szCs w:val="20"/>
+              </w:rPr>
+              <w:t>hr</w:t>
+            </w:r>
+            <w:proofErr w:type="spellEnd"/>
           </w:p>
         </w:tc>
         <w:tc>
@@ -5202,7 +6068,6 @@
       <w:tr>
         <w:trPr>
           <w:cantSplit/>
-          <w:cantSplit/>
         </w:trPr>
         <w:tc>
           <w:tcPr>
@@ -5300,8 +6165,17 @@
                 <w:sz w:val="20"/>
                 <w:szCs w:val="20"/>
               </w:rPr>
-              <w:t>~$2.20 / hr</w:t>
-            </w:r>
+              <w:t xml:space="preserve">~$2.20 / </w:t>
+            </w:r>
+            <w:proofErr w:type="spellStart"/>
+            <w:r>
+              <w:rPr>
+                <w:sz w:val="20"/>
+                <w:szCs w:val="20"/>
+              </w:rPr>
+              <w:t>hr</w:t>
+            </w:r>
+            <w:proofErr w:type="spellEnd"/>
           </w:p>
         </w:tc>
         <w:tc>
@@ -5371,16 +6245,53 @@
         <w:pStyle w:val="Heading2"/>
       </w:pPr>
       <w:r>
-        <w:rPr>
-          <w:sz w:val="22"/>
-        </w:rPr>
         <w:lastRenderedPageBreak/>
-        <w:t>Cost Comparison: 1 Million Output Documents Across Hardware Tiers</w:t>
+        <w:t xml:space="preserve">Cost Comparison: 1 </w:t>
+      </w:r>
+      <w:proofErr w:type="gramStart"/>
+      <w:r>
+        <w:t>Million</w:t>
+      </w:r>
+      <w:proofErr w:type="gramEnd"/>
+      <w:r>
+        <w:t xml:space="preserve"> Output Documents Across Hardware Tiers</w:t>
       </w:r>
     </w:p>
     <w:p>
       <w:r>
-        <w:t>The table below estimates total cost to produce 1 million split output documents, based on the throughput rate of ~65 documents/hour (validated for typical scanned files; mixed text+scan files reach 199 docs/hr). Dedicated plans are costed assuming 2 active job hours per day (the rest of the day the environment is idle but still billed).</w:t>
+        <w:t xml:space="preserve">The table below estimates total cost to produce 1 million split output documents, based on the throughput rate of ~65 documents/hour (validated for typical scanned files; mixed </w:t>
+      </w:r>
+      <w:proofErr w:type="spellStart"/>
+      <w:r>
+        <w:t>text+scan</w:t>
+      </w:r>
+      <w:proofErr w:type="spellEnd"/>
+      <w:r>
+        <w:t xml:space="preserve"> files reach 199 docs/</w:t>
+      </w:r>
+      <w:proofErr w:type="spellStart"/>
+      <w:r>
+        <w:t>hr</w:t>
+      </w:r>
+      <w:proofErr w:type="spellEnd"/>
+      <w:r>
+        <w:t xml:space="preserve">). Dedicated plans are </w:t>
+      </w:r>
+      <w:proofErr w:type="gramStart"/>
+      <w:r>
+        <w:t>costed assuming</w:t>
+      </w:r>
+      <w:proofErr w:type="gramEnd"/>
+      <w:r>
+        <w:t xml:space="preserve"> 2 </w:t>
+      </w:r>
+      <w:proofErr w:type="gramStart"/>
+      <w:r>
+        <w:t>active job</w:t>
+      </w:r>
+      <w:proofErr w:type="gramEnd"/>
+      <w:r>
+        <w:t xml:space="preserve"> hours per day (the rest of the day the environment is idle but still billed).</w:t>
       </w:r>
     </w:p>
     <w:tbl>
@@ -5400,7 +6311,6 @@
       <w:tr>
         <w:trPr>
           <w:cantSplit/>
-          <w:cantSplit/>
         </w:trPr>
         <w:tc>
           <w:tcPr>
@@ -5465,7 +6375,21 @@
               <w:rPr>
                 <w:sz w:val="20"/>
               </w:rPr>
-              <w:t>Days | (10 hrs/day)</w:t>
+              <w:t xml:space="preserve">Days | (10 </w:t>
+            </w:r>
+            <w:proofErr w:type="spellStart"/>
+            <w:r>
+              <w:rPr>
+                <w:sz w:val="20"/>
+              </w:rPr>
+              <w:t>hrs</w:t>
+            </w:r>
+            <w:proofErr w:type="spellEnd"/>
+            <w:r>
+              <w:rPr>
+                <w:sz w:val="20"/>
+              </w:rPr>
+              <w:t>/day)</w:t>
             </w:r>
           </w:p>
         </w:tc>
@@ -5512,7 +6436,21 @@
               <w:rPr>
                 <w:sz w:val="20"/>
               </w:rPr>
-              <w:t>Idle cost | (14 hrs/day × days)</w:t>
+              <w:t xml:space="preserve">Idle cost | (14 </w:t>
+            </w:r>
+            <w:proofErr w:type="spellStart"/>
+            <w:r>
+              <w:rPr>
+                <w:sz w:val="20"/>
+              </w:rPr>
+              <w:t>hrs</w:t>
+            </w:r>
+            <w:proofErr w:type="spellEnd"/>
+            <w:r>
+              <w:rPr>
+                <w:sz w:val="20"/>
+              </w:rPr>
+              <w:t>/day × days)</w:t>
             </w:r>
           </w:p>
         </w:tc>
@@ -5548,13 +6486,11 @@
       <w:tr>
         <w:trPr>
           <w:cantSplit/>
-          <w:cantSplit/>
         </w:trPr>
         <w:tc>
           <w:tcPr>
             <w:tcW w:w="1440" w:type="dxa"/>
             <w:shd w:val="clear" w:color="auto" w:fill="FFF2CC"/>
-            <w:shd w:val="clear" w:color="auto" w:fill="FFF2CC"/>
           </w:tcPr>
           <w:p>
             <w:pPr>
@@ -5575,28 +6511,34 @@
           <w:tcPr>
             <w:tcW w:w="1440" w:type="dxa"/>
             <w:shd w:val="clear" w:color="auto" w:fill="FFF2CC"/>
-            <w:shd w:val="clear" w:color="auto" w:fill="FFF2CC"/>
-          </w:tcPr>
-          <w:p>
-            <w:pPr>
-              <w:rPr>
-                <w:sz w:val="20"/>
-                <w:szCs w:val="20"/>
-              </w:rPr>
-            </w:pPr>
-            <w:r>
-              <w:rPr>
-                <w:sz w:val="20"/>
-              </w:rPr>
-              <w:t>~15,400 hrs</w:t>
-            </w:r>
+          </w:tcPr>
+          <w:p>
+            <w:pPr>
+              <w:rPr>
+                <w:sz w:val="20"/>
+                <w:szCs w:val="20"/>
+              </w:rPr>
+            </w:pPr>
+            <w:r>
+              <w:rPr>
+                <w:sz w:val="20"/>
+              </w:rPr>
+              <w:t xml:space="preserve">~15,400 </w:t>
+            </w:r>
+            <w:proofErr w:type="spellStart"/>
+            <w:r>
+              <w:rPr>
+                <w:sz w:val="20"/>
+              </w:rPr>
+              <w:t>hrs</w:t>
+            </w:r>
+            <w:proofErr w:type="spellEnd"/>
           </w:p>
         </w:tc>
         <w:tc>
           <w:tcPr>
             <w:tcW w:w="1440" w:type="dxa"/>
             <w:shd w:val="clear" w:color="auto" w:fill="FFF2CC"/>
-            <w:shd w:val="clear" w:color="auto" w:fill="FFF2CC"/>
           </w:tcPr>
           <w:p>
             <w:pPr>
@@ -5617,7 +6559,6 @@
           <w:tcPr>
             <w:tcW w:w="1440" w:type="dxa"/>
             <w:shd w:val="clear" w:color="auto" w:fill="FFF2CC"/>
-            <w:shd w:val="clear" w:color="auto" w:fill="FFF2CC"/>
           </w:tcPr>
           <w:p>
             <w:pPr>
@@ -5638,7 +6579,6 @@
           <w:tcPr>
             <w:tcW w:w="1440" w:type="dxa"/>
             <w:shd w:val="clear" w:color="auto" w:fill="FFF2CC"/>
-            <w:shd w:val="clear" w:color="auto" w:fill="FFF2CC"/>
           </w:tcPr>
           <w:p>
             <w:pPr>
@@ -5658,7 +6598,6 @@
         <w:tc>
           <w:tcPr>
             <w:tcW w:w="1440" w:type="dxa"/>
-            <w:shd w:val="clear" w:color="auto" w:fill="FFF2CC"/>
             <w:shd w:val="clear" w:color="auto" w:fill="FFF2CC"/>
           </w:tcPr>
           <w:p>
@@ -5680,7 +6619,6 @@
       <w:tr>
         <w:trPr>
           <w:cantSplit/>
-          <w:cantSplit/>
         </w:trPr>
         <w:tc>
           <w:tcPr>
@@ -5716,7 +6654,7 @@
               <w:rPr>
                 <w:sz w:val="20"/>
               </w:rPr>
-              <w:t>~13,700 hrs</w:t>
+              <w:t>~15,400 hrs</w:t>
             </w:r>
           </w:p>
         </w:tc>
@@ -5735,7 +6673,7 @@
               <w:rPr>
                 <w:sz w:val="20"/>
               </w:rPr>
-              <w:t>~1,370 days</w:t>
+              <w:t>~1,540 days</w:t>
             </w:r>
           </w:p>
         </w:tc>
@@ -5754,7 +6692,7 @@
               <w:rPr>
                 <w:sz w:val="20"/>
               </w:rPr>
-              <w:t>~$7,535</w:t>
+              <w:t>~$8,470</w:t>
             </w:r>
           </w:p>
         </w:tc>
@@ -5773,7 +6711,7 @@
               <w:rPr>
                 <w:sz w:val="20"/>
               </w:rPr>
-              <w:t>~$10,500 idle</w:t>
+              <w:t>~$11,900 idle</w:t>
             </w:r>
           </w:p>
         </w:tc>
@@ -5792,7 +6730,7 @@
               <w:rPr>
                 <w:sz w:val="20"/>
               </w:rPr>
-              <w:t>~$18,000+</w:t>
+              <w:t>~$20,000+</w:t>
             </w:r>
           </w:p>
         </w:tc>
@@ -5800,7 +6738,6 @@
       <w:tr>
         <w:trPr>
           <w:cantSplit/>
-          <w:cantSplit/>
         </w:trPr>
         <w:tc>
           <w:tcPr>
@@ -5836,7 +6773,7 @@
               <w:rPr>
                 <w:sz w:val="20"/>
               </w:rPr>
-              <w:t>~10,000 hrs*</w:t>
+              <w:t>~12,300 hrs*</w:t>
             </w:r>
           </w:p>
         </w:tc>
@@ -5855,7 +6792,7 @@
               <w:rPr>
                 <w:sz w:val="20"/>
               </w:rPr>
-              <w:t>~1,000 days</w:t>
+              <w:t>~1,230 days</w:t>
             </w:r>
           </w:p>
         </w:tc>
@@ -5874,7 +6811,7 @@
               <w:rPr>
                 <w:sz w:val="20"/>
               </w:rPr>
-              <w:t>~$11,000</w:t>
+              <w:t>~$13,500</w:t>
             </w:r>
           </w:p>
         </w:tc>
@@ -5893,7 +6830,7 @@
               <w:rPr>
                 <w:sz w:val="20"/>
               </w:rPr>
-              <w:t>~$15,400 idle</w:t>
+              <w:t>~$18,900 idle</w:t>
             </w:r>
           </w:p>
         </w:tc>
@@ -5912,7 +6849,7 @@
               <w:rPr>
                 <w:sz w:val="20"/>
               </w:rPr>
-              <w:t>~$26,000+</w:t>
+              <w:t>~$32,000+</w:t>
             </w:r>
           </w:p>
         </w:tc>
@@ -5920,12 +6857,44 @@
     </w:tbl>
     <w:p>
       <w:r>
-        <w:t>* D8 has 2x CPU cores, which may improve PaddleOCR throughput depending on parallelisation. A conservative 25% speed improvement is assumed above. Actual improvement requires benchmarking.</w:t>
+        <w:t xml:space="preserve">* D8 has 2x CPU cores, which may improve </w:t>
+      </w:r>
+      <w:proofErr w:type="spellStart"/>
+      <w:r>
+        <w:t>PaddleOCR</w:t>
+      </w:r>
+      <w:proofErr w:type="spellEnd"/>
+      <w:r>
+        <w:t xml:space="preserve"> throughput depending on </w:t>
+      </w:r>
+      <w:proofErr w:type="spellStart"/>
+      <w:r>
+        <w:t>parallelisation</w:t>
+      </w:r>
+      <w:proofErr w:type="spellEnd"/>
+      <w:r>
+        <w:t>. A conservative 25% speed improvement is assumed above. Actual improvement requires benchmarking.</w:t>
       </w:r>
     </w:p>
     <w:p>
       <w:r>
-        <w:t>Conclusion: Dedicated plans are significantly more expensive for batch workloads that run only a about 10 hours per day. The Consumption plan remains the most cost-effective option for this workload pattern. Dedicated plans should only be adopted if large-file failures become a consistent operational problem and cannot be resolved by splitting oversized source PDFs before upload.</w:t>
+        <w:t xml:space="preserve">Conclusion: Dedicated plans are significantly more expensive for batch workloads that run </w:t>
+      </w:r>
+      <w:proofErr w:type="gramStart"/>
+      <w:r>
+        <w:t>only a</w:t>
+      </w:r>
+      <w:proofErr w:type="gramEnd"/>
+      <w:r>
+        <w:t xml:space="preserve"> about 10 hours per day. The Consumption plan remains the most cost-effective option for this workload pattern. Dedicated plans should only be adopted if large-file failures become a consistent operational problem and cannot be resolved by splitting oversized source PDFs before </w:t>
+      </w:r>
+      <w:proofErr w:type="gramStart"/>
+      <w:r>
+        <w:t>upload</w:t>
+      </w:r>
+      <w:proofErr w:type="gramEnd"/>
+      <w:r>
+        <w:t>.</w:t>
       </w:r>
     </w:p>
     <w:p>
@@ -5933,9 +6902,6 @@
         <w:pStyle w:val="Heading2"/>
       </w:pPr>
       <w:r>
-        <w:rPr>
-          <w:sz w:val="22"/>
-        </w:rPr>
         <w:t>Large Files: Resolved by Sliding-Window Chunking</w:t>
       </w:r>
     </w:p>
@@ -5956,7 +6922,23 @@
           <w:rFonts w:ascii="Courier New" w:hAnsi="Courier New"/>
           <w:sz w:val="18"/>
         </w:rPr>
-        <w:t>To enable windowed chunking locally: $env:PDF_EXTRACTOR_OVERLAP_CHUNK_PAGES = "20"</w:t>
+        <w:t>To enable windowed chunking locally: $</w:t>
+      </w:r>
+      <w:proofErr w:type="spellStart"/>
+      <w:r>
+        <w:rPr>
+          <w:rFonts w:ascii="Courier New" w:hAnsi="Courier New"/>
+          <w:sz w:val="18"/>
+        </w:rPr>
+        <w:t>env:PDF_EXTRACTOR_OVERLAP_CHUNK_PAGES</w:t>
+      </w:r>
+      <w:proofErr w:type="spellEnd"/>
+      <w:r>
+        <w:rPr>
+          <w:rFonts w:ascii="Courier New" w:hAnsi="Courier New"/>
+          <w:sz w:val="18"/>
+        </w:rPr>
+        <w:t xml:space="preserve"> = "20"</w:t>
       </w:r>
     </w:p>
     <w:p>
@@ -5964,9 +6946,6 @@
         <w:pStyle w:val="Heading1"/>
       </w:pPr>
       <w:r>
-        <w:rPr>
-          <w:sz w:val="24"/>
-        </w:rPr>
         <w:t>8. Why We Stayed on Consumption</w:t>
       </w:r>
     </w:p>
@@ -5975,15 +6954,20 @@
         <w:pStyle w:val="Heading2"/>
       </w:pPr>
       <w:r>
-        <w:rPr>
-          <w:sz w:val="22"/>
-        </w:rPr>
         <w:t>Consumption vs. Dedicated workload profiles</w:t>
       </w:r>
     </w:p>
     <w:p>
       <w:r>
-        <w:t>The critical difference: Consumption charges only for active execution seconds. Dedicated profiles charge by the hour, continuously, whether or not a job is running.</w:t>
+        <w:t xml:space="preserve">The critical difference: Consumption charges only for active execution seconds. Dedicated profiles charge by the hour, continuously, </w:t>
+      </w:r>
+      <w:proofErr w:type="gramStart"/>
+      <w:r>
+        <w:t>whether or not</w:t>
+      </w:r>
+      <w:proofErr w:type="gramEnd"/>
+      <w:r>
+        <w:t xml:space="preserve"> a job is running.</w:t>
       </w:r>
     </w:p>
     <w:tbl>
@@ -6002,7 +6986,6 @@
       <w:tr>
         <w:trPr>
           <w:cantSplit/>
-          <w:cantSplit/>
         </w:trPr>
         <w:tc>
           <w:tcPr>
@@ -6099,7 +7082,21 @@
               <w:rPr>
                 <w:sz w:val="20"/>
               </w:rPr>
-              <w:t>Effective daily cost | (10 hrs/day active)</w:t>
+              <w:t xml:space="preserve">Effective daily cost | (10 </w:t>
+            </w:r>
+            <w:proofErr w:type="spellStart"/>
+            <w:r>
+              <w:rPr>
+                <w:sz w:val="20"/>
+              </w:rPr>
+              <w:t>hrs</w:t>
+            </w:r>
+            <w:proofErr w:type="spellEnd"/>
+            <w:r>
+              <w:rPr>
+                <w:sz w:val="20"/>
+              </w:rPr>
+              <w:t>/day active)</w:t>
             </w:r>
           </w:p>
         </w:tc>
@@ -6107,13 +7104,11 @@
       <w:tr>
         <w:trPr>
           <w:cantSplit/>
-          <w:cantSplit/>
         </w:trPr>
         <w:tc>
           <w:tcPr>
             <w:tcW w:w="1728" w:type="dxa"/>
             <w:shd w:val="clear" w:color="auto" w:fill="FFF2CC"/>
-            <w:shd w:val="clear" w:color="auto" w:fill="FFF2CC"/>
           </w:tcPr>
           <w:p>
             <w:pPr>
@@ -6134,7 +7129,6 @@
           <w:tcPr>
             <w:tcW w:w="1728" w:type="dxa"/>
             <w:shd w:val="clear" w:color="auto" w:fill="FFF2CC"/>
-            <w:shd w:val="clear" w:color="auto" w:fill="FFF2CC"/>
           </w:tcPr>
           <w:p>
             <w:pPr>
@@ -6155,7 +7149,6 @@
           <w:tcPr>
             <w:tcW w:w="1728" w:type="dxa"/>
             <w:shd w:val="clear" w:color="auto" w:fill="FFF2CC"/>
-            <w:shd w:val="clear" w:color="auto" w:fill="FFF2CC"/>
           </w:tcPr>
           <w:p>
             <w:pPr>
@@ -6176,27 +7169,33 @@
           <w:tcPr>
             <w:tcW w:w="1728" w:type="dxa"/>
             <w:shd w:val="clear" w:color="auto" w:fill="FFF2CC"/>
-            <w:shd w:val="clear" w:color="auto" w:fill="FFF2CC"/>
-          </w:tcPr>
-          <w:p>
-            <w:pPr>
-              <w:rPr>
-                <w:sz w:val="20"/>
-                <w:szCs w:val="20"/>
-              </w:rPr>
-            </w:pPr>
-            <w:r>
-              <w:rPr>
-                <w:sz w:val="20"/>
-              </w:rPr>
-              <w:t>$0.44 / active hr</w:t>
-            </w:r>
+          </w:tcPr>
+          <w:p>
+            <w:pPr>
+              <w:rPr>
+                <w:sz w:val="20"/>
+                <w:szCs w:val="20"/>
+              </w:rPr>
+            </w:pPr>
+            <w:r>
+              <w:rPr>
+                <w:sz w:val="20"/>
+              </w:rPr>
+              <w:t xml:space="preserve">$0.44 / active </w:t>
+            </w:r>
+            <w:proofErr w:type="spellStart"/>
+            <w:r>
+              <w:rPr>
+                <w:sz w:val="20"/>
+              </w:rPr>
+              <w:t>hr</w:t>
+            </w:r>
+            <w:proofErr w:type="spellEnd"/>
           </w:p>
         </w:tc>
         <w:tc>
           <w:tcPr>
             <w:tcW w:w="1728" w:type="dxa"/>
-            <w:shd w:val="clear" w:color="auto" w:fill="FFF2CC"/>
             <w:shd w:val="clear" w:color="auto" w:fill="FFF2CC"/>
           </w:tcPr>
           <w:p>
@@ -6218,7 +7217,6 @@
       <w:tr>
         <w:trPr>
           <w:cantSplit/>
-          <w:cantSplit/>
         </w:trPr>
         <w:tc>
           <w:tcPr>
@@ -6319,7 +7317,6 @@
       <w:tr>
         <w:trPr>
           <w:cantSplit/>
-          <w:cantSplit/>
         </w:trPr>
         <w:tc>
           <w:tcPr>
@@ -6420,7 +7417,6 @@
       <w:tr>
         <w:trPr>
           <w:cantSplit/>
-          <w:cantSplit/>
         </w:trPr>
         <w:tc>
           <w:tcPr>
@@ -6521,11 +7517,16 @@
     </w:tbl>
     <w:p>
       <w:r>
-        <w:t xml:space="preserve">Conclusion: the Consumption plan at 4 vCPU / 8 GiB is the cost-optimal choice for this workload. The 8 GiB ceiling is sufficient for typical deal jacket files without any model </w:t>
-      </w:r>
-      <w:r>
         <w:lastRenderedPageBreak/>
-        <w:t>configuration changes, and pay-per-use billing eliminates idle cost entirely. For files that exceed the memory ceiling, pre-splitting the source PDF is the recommended solution before considering a dedicated plan upgrade.</w:t>
+        <w:t xml:space="preserve">Conclusion: the Consumption plan at 4 vCPU / 8 GiB is the cost-optimal choice for this workload. The 8 GiB ceiling is sufficient for typical deal jacket files without any model configuration </w:t>
+      </w:r>
+      <w:proofErr w:type="gramStart"/>
+      <w:r>
+        <w:t>changes, and</w:t>
+      </w:r>
+      <w:proofErr w:type="gramEnd"/>
+      <w:r>
+        <w:t xml:space="preserve"> pay-per-use billing eliminates idle cost entirely. For files that exceed the memory ceiling, pre-splitting the source PDF is the recommended solution before considering a dedicated plan upgrade.</w:t>
       </w:r>
     </w:p>
     <w:p>
@@ -6541,37 +7542,44 @@
     </w:p>
     <w:p>
       <w:r>
-        <w:t>The windowed chunking approach is built around a specific hardware constraint: PaddleOCR loads its neural network models into RAM at startup and holds them for the duration of the run (approximately 2-3 GB). On an 8 GiB Azure Consumption instance this leaves only 5-6 GB for the source document itself. A naive implementation that decodes the entire source PDF into memory at once would exhaust RAM for any file larger than a few hundred pages -- making the tool impractical for the large deal jackets it was bui</w:t>
-      </w:r>
-      <w:r>
-        <w:t>lt to handle.</w:t>
+        <w:t xml:space="preserve">The windowed chunking approach is built around a specific hardware constraint: </w:t>
+      </w:r>
+      <w:proofErr w:type="spellStart"/>
+      <w:r>
+        <w:t>PaddleOCR</w:t>
+      </w:r>
+      <w:proofErr w:type="spellEnd"/>
+      <w:r>
+        <w:t xml:space="preserve"> loads its neural network models into RAM at startup and holds them for the duration of the run (approximately 2-3 GB). On an 8 GiB Azure Consumption instance this leaves only 5-6 GB for the source document itself. A naive implementation that decodes the entire source PDF into memory at once would exhaust RAM for any file larger than a few hundred pages -- making the tool impractical for the large deal jackets it was built to handle.</w:t>
       </w:r>
       <w:r>
         <w:br/>
       </w:r>
       <w:r>
         <w:br/>
-        <w:t>The solution decouples file size from RAM requirement entirely. The source PDF is divided into fixed, non-overlapping 20-page chunks written to disk. At any moment only two consecutive chunks are loaded into RAM -- a sliding window of 40 pages. Once a window finishes processing, the older chunk is released and the next chunk slides in. Peak memory consumption is therefore determined by chunk size, not by how large the source file is.</w:t>
+        <w:t xml:space="preserve">The solution decouples file size from RAM requirement entirely. The source PDF is divided into fixed, non-overlapping 20-page chunks written </w:t>
+      </w:r>
+      <w:proofErr w:type="gramStart"/>
+      <w:r>
+        <w:t>to</w:t>
+      </w:r>
+      <w:proofErr w:type="gramEnd"/>
+      <w:r>
+        <w:t xml:space="preserve"> disk. At any moment only two consecutive chunks are loaded into RAM -- a sliding window of 40 pages. Once a window finishes processing, the older chunk is released and the next chunk slides in. Peak memory consumption is therefore determined by chunk size, not by how large the source file is.</w:t>
       </w:r>
       <w:r>
         <w:br/>
       </w:r>
       <w:r>
         <w:br/>
-        <w:t>The two-chunk window also solves the boundary problem: a d</w:t>
-      </w:r>
-      <w:r>
-        <w:t>ocument whose pages straddle a chunk boundary is always seen whole within a single window and emitted as one correct output file. No document is silently split across the boundary.</w:t>
+        <w:t>The two-chunk window also solves the boundary problem: a document whose pages straddle a chunk boundary is always seen whole within a single window and emitted as one correct output file. No document is silently split across the boundary.</w:t>
       </w:r>
       <w:r>
         <w:br/>
       </w:r>
       <w:r>
         <w:br/>
-        <w:t>The practical result: a 3,900-page scanned deal jacket (602819077.pdf) that would have failed immediately on 8 GiB hardware without windowed chunking completed in 1 hour 42 minutes on a 4 vCPU / 8 GiB Azure Consumption instance, producing 27 correctly split output documents. The source file size is now irrelevant -- only the chu</w:t>
-      </w:r>
-      <w:r>
-        <w:t>nk size (20 pages) determines how much RAM the tool uses at any moment.</w:t>
+        <w:t>The practical result: a 220-page all-scanned deal jacket (602819077.pdf) — sitting just above the ~200-page reliable ceiling of the earlier, non-chunked implementation — completed in 1 hour 42 minutes on a 4 vCPU / 8 GiB Azure Consumption instance, producing 27 correctly split output documents. That run used pre-optimisation OCR settings; current validated throughput is 238–549 pages/hr depending on scan density (Section 6). The source file size is now irrelevant — only the chunk size (20 pages) determines peak RAM usage.</w:t>
       </w:r>
     </w:p>
     <w:sectPr>

</xml_diff>

<commit_message>
docs: replace 602819077.pdf validation refs with 603110820.pdf trial data
Para 90 and para 107 now reference the 457-page all-scanned 603110820.pdf
run (1h 55m, 36 documents) exclusively. The old 602819077.pdf figure (220 pages,
pre-optimisation settings) is removed to avoid confusing two different throughput
baselines.

Generated with Claude Code
</commit_message>
<xml_diff>
--- a/PDF_split_and_Mine.docx
+++ b/PDF_split_and_Mine.docx
@@ -2592,15 +2592,7 @@
         <w:pStyle w:val="ListBullet"/>
       </w:pPr>
       <w:r>
-        <w:t xml:space="preserve">Scanned image pages: First renders the page at 150 DPI, then </w:t>
-      </w:r>
-      <w:proofErr w:type="spellStart"/>
-      <w:r>
-        <w:t>PaddleOCR</w:t>
-      </w:r>
-      <w:proofErr w:type="spellEnd"/>
-      <w:r>
-        <w:t xml:space="preserve"> extracts text.</w:t>
+        <w:t>Scanned image pages: First renders the page at 150 DPI, then PaddleOCR extracts text.</w:t>
       </w:r>
     </w:p>
     <w:p>
@@ -3420,23 +3412,7 @@
           <w:sz w:val="18"/>
         </w:rPr>
         <w:br/>
-        <w:t xml:space="preserve">  Two 20-page chunk PDFs  +  </w:t>
-      </w:r>
-      <w:proofErr w:type="spellStart"/>
-      <w:r>
-        <w:rPr>
-          <w:rFonts w:ascii="Courier New" w:hAnsi="Courier New"/>
-          <w:sz w:val="18"/>
-        </w:rPr>
-        <w:t>PaddleOCR</w:t>
-      </w:r>
-      <w:proofErr w:type="spellEnd"/>
-      <w:r>
-        <w:rPr>
-          <w:rFonts w:ascii="Courier New" w:hAnsi="Courier New"/>
-          <w:sz w:val="18"/>
-        </w:rPr>
-        <w:t xml:space="preserve"> models (~2-3 GB)</w:t>
+        <w:t xml:space="preserve">  Two 20-page chunk PDFs  +  PaddleOCR models (~2-3 GB)</w:t>
       </w:r>
       <w:r>
         <w:rPr>
@@ -4017,15 +3993,7 @@
       </w:r>
       <w:r>
         <w:br/>
-        <w:t xml:space="preserve"> |     +-- </w:t>
-      </w:r>
-      <w:proofErr w:type="spellStart"/>
-      <w:r>
-        <w:t>PaddleOCR</w:t>
-      </w:r>
-      <w:proofErr w:type="spellEnd"/>
-      <w:r>
-        <w:t xml:space="preserve">              (slower, scanned pages)</w:t>
+        <w:t xml:space="preserve"> |     +-- PaddleOCR              (slower, scanned pages)</w:t>
       </w:r>
       <w:r>
         <w:br/>
@@ -4884,21 +4852,7 @@
         <w:rPr>
           <w:color w:val="C00000"/>
         </w:rPr>
-        <w:t xml:space="preserve">Mixed </w:t>
-      </w:r>
-      <w:proofErr w:type="spellStart"/>
-      <w:r>
-        <w:rPr>
-          <w:color w:val="C00000"/>
-        </w:rPr>
-        <w:t>text+scanned</w:t>
-      </w:r>
-      <w:proofErr w:type="spellEnd"/>
-      <w:r>
-        <w:rPr>
-          <w:color w:val="C00000"/>
-        </w:rPr>
-        <w:t xml:space="preserve"> files </w:t>
+        <w:t xml:space="preserve">Mixed text+scanned files </w:t>
       </w:r>
       <w:r>
         <w:t>(typical): 465–549 pages/hour | $0.00080–$0.00094 per source page.  Validated against 601602726.pdf (35 pages → 15 docs in 4.5 min, $0.033) and 602954198.pdf (152 pages → 18 docs in 17 min, $0.12).</w:t>
@@ -4908,14 +4862,7 @@
       </w:r>
       <w:r>
         <w:br/>
-      </w:r>
-      <w:proofErr w:type="spellStart"/>
-      <w:r>
-        <w:t>PaddleOCR</w:t>
-      </w:r>
-      <w:proofErr w:type="spellEnd"/>
-      <w:r>
-        <w:t xml:space="preserve"> is the throughput bottleneck and runs single-threaded. The all-scanned figure (238 pages/</w:t>
+        <w:t>PaddleOCR is the throughput bottleneck and runs single-threaded. The all-scanned figure (238 pages/</w:t>
       </w:r>
       <w:proofErr w:type="spellStart"/>
       <w:r>
@@ -5192,20 +5139,12 @@
     </w:p>
     <w:p>
       <w:r>
-        <w:t xml:space="preserve">The Consumption plan allocates 8 GiB of RAM per execution. </w:t>
-      </w:r>
-      <w:proofErr w:type="spellStart"/>
-      <w:r>
-        <w:t>PaddleOCR</w:t>
-      </w:r>
-      <w:proofErr w:type="spellEnd"/>
-      <w:r>
-        <w:t xml:space="preserve"> loads its neural network models at startup (~2-3 GB). Earlier versions of the tool held the entire source PDF decoded in memory during processing, which made files larger than ~200 pages unreliable on this hardware.</w:t>
+        <w:t>The Consumption plan allocates 8 GiB of RAM per execution. PaddleOCR loads its neural network models at startup (~2-3 GB). Earlier versions of the tool held the entire source PDF decoded in memory during processing, which made files larger than ~200 pages unreliable on this hardware.</w:t>
       </w:r>
     </w:p>
     <w:p>
       <w:r>
-        <w:t>The sliding-window chunking feature (Section 3.3) eliminates this constraint. Because only two 20-page chunk files are held in RAM at any time, the tool can now process files of any size on the standard 8 GiB Consumption plan. Validation: the 220-page all-scanned file 602819077.pdf completed successfully in 1 h 42 min without any hardware upgrade. (Note: that run used pre-optimisation OCR settings; current validated throughput is 238–549 pages/hr — see Section 6.)</w:t>
+        <w:t>The sliding-window chunking feature (Section 3.3) eliminates this constraint. Because only two 20-page chunk files are held in RAM at any time, the tool can now process files of any size on the standard 8 GiB Consumption plan. Validation: the 457-page all-scanned file 603110820.pdf completed successfully in 1 h 55 min, producing 36 split documents — well above the previous reliable ceiling for Consumption hardware — without any hardware upgrade.</w:t>
       </w:r>
     </w:p>
     <w:p>
@@ -6237,6 +6176,7 @@
         </w:rPr>
       </w:pPr>
       <w:r>
+        <w:lastRenderedPageBreak/>
         <w:br w:type="page"/>
       </w:r>
     </w:p>
@@ -6857,15 +6797,7 @@
     </w:tbl>
     <w:p>
       <w:r>
-        <w:t xml:space="preserve">* D8 has 2x CPU cores, which may improve </w:t>
-      </w:r>
-      <w:proofErr w:type="spellStart"/>
-      <w:r>
-        <w:t>PaddleOCR</w:t>
-      </w:r>
-      <w:proofErr w:type="spellEnd"/>
-      <w:r>
-        <w:t xml:space="preserve"> throughput depending on </w:t>
+        <w:t xml:space="preserve">* D8 has 2x CPU cores, which may improve PaddleOCR throughput depending on </w:t>
       </w:r>
       <w:proofErr w:type="spellStart"/>
       <w:r>
@@ -7542,15 +7474,7 @@
     </w:p>
     <w:p>
       <w:r>
-        <w:t xml:space="preserve">The windowed chunking approach is built around a specific hardware constraint: </w:t>
-      </w:r>
-      <w:proofErr w:type="spellStart"/>
-      <w:r>
-        <w:t>PaddleOCR</w:t>
-      </w:r>
-      <w:proofErr w:type="spellEnd"/>
-      <w:r>
-        <w:t xml:space="preserve"> loads its neural network models into RAM at startup and holds them for the duration of the run (approximately 2-3 GB). On an 8 GiB Azure Consumption instance this leaves only 5-6 GB for the source document itself. A naive implementation that decodes the entire source PDF into memory at once would exhaust RAM for any file larger than a few hundred pages -- making the tool impractical for the large deal jackets it was built to handle.</w:t>
+        <w:t>The windowed chunking approach is built around a specific hardware constraint: PaddleOCR loads its neural network models into RAM at startup and holds them for the duration of the run (approximately 2-3 GB). On an 8 GiB Azure Consumption instance this leaves only 5-6 GB for the source document itself. A naive implementation that decodes the entire source PDF into memory at once would exhaust RAM for any file larger than a few hundred pages -- making the tool impractical for the large deal jackets it was built to handle.</w:t>
       </w:r>
       <w:r>
         <w:br/>
@@ -7579,7 +7503,7 @@
       </w:r>
       <w:r>
         <w:br/>
-        <w:t>The practical result: a 220-page all-scanned deal jacket (602819077.pdf) — sitting just above the ~200-page reliable ceiling of the earlier, non-chunked implementation — completed in 1 hour 42 minutes on a 4 vCPU / 8 GiB Azure Consumption instance, producing 27 correctly split output documents. That run used pre-optimisation OCR settings; current validated throughput is 238–549 pages/hr depending on scan density (Section 6). The source file size is now irrelevant — only the chunk size (20 pages) determines peak RAM usage.</w:t>
+        <w:t>The practical result: a 457-page all-scanned deal jacket (603110820.pdf) completed in 1 hour 55 minutes on a 4 vCPU / 8 GiB Azure Consumption instance, producing 36 correctly split output documents. A file this size would have exceeded the reliable memory ceiling on Consumption hardware before windowed chunking was introduced. The source file size is now irrelevant — only the chunk size (20 pages) determines peak RAM usage.</w:t>
       </w:r>
     </w:p>
     <w:sectPr>

</xml_diff>

<commit_message>
docs: update docx — windowed chunking always enabled, not Docker-only
Paras 65, 66, 100, 101: replaced Enable locally instructions and
Docker-only defaults with always-enabled language. Env var still
controls chunk size; chunking can no longer be disabled.

Generated with Claude Code
</commit_message>
<xml_diff>
--- a/PDF_split_and_Mine.docx
+++ b/PDF_split_and_Mine.docx
@@ -3451,8 +3451,7 @@
     </w:p>
     <w:p>
       <w:r>
-        <w:lastRenderedPageBreak/>
-        <w:t xml:space="preserve">Windowed chunking is controlled by the </w:t>
+        <w:t>Windowed chunking is controlled by the PDF_EXTRACTOR_OVERLAP_CHUNK_PAGES environment variable. The default chunk size is 20 pages; chunking is always enabled in all modes (local and Azure).</w:t>
       </w:r>
       <w:r>
         <w:rPr>
@@ -3461,21 +3460,17 @@
           <w:sz w:val="20"/>
           <w:szCs w:val="20"/>
         </w:rPr>
-        <w:t>PDF_EXTRACTOR_OVERLAP_CHUNK_PAGES</w:t>
       </w:r>
       <w:r>
         <w:rPr>
           <w:color w:val="984806" w:themeColor="accent6" w:themeShade="80"/>
         </w:rPr>
-        <w:t xml:space="preserve"> </w:t>
-      </w:r>
-      <w:r>
-        <w:t xml:space="preserve">environment variable (set to 20 by default in the Docker image). </w:t>
-      </w:r>
+      </w:r>
+      <w:r/>
     </w:p>
     <w:p>
       <w:r>
-        <w:t xml:space="preserve">To enable locally: </w:t>
+        <w:t>To adjust chunk size: $env:PDF_EXTRACTOR_OVERLAP_CHUNK_PAGES = "20"</w:t>
       </w:r>
       <w:r>
         <w:rPr>
@@ -3484,27 +3479,6 @@
           <w:sz w:val="20"/>
           <w:szCs w:val="20"/>
         </w:rPr>
-        <w:t>$</w:t>
-      </w:r>
-      <w:proofErr w:type="spellStart"/>
-      <w:r>
-        <w:rPr>
-          <w:rFonts w:ascii="Courier New" w:hAnsi="Courier New" w:cs="Courier New"/>
-          <w:color w:val="984806" w:themeColor="accent6" w:themeShade="80"/>
-          <w:sz w:val="20"/>
-          <w:szCs w:val="20"/>
-        </w:rPr>
-        <w:t>env:PDF_EXTRACTOR_OVERLAP_CHUNK_PAGES</w:t>
-      </w:r>
-      <w:proofErr w:type="spellEnd"/>
-      <w:r>
-        <w:rPr>
-          <w:rFonts w:ascii="Courier New" w:hAnsi="Courier New" w:cs="Courier New"/>
-          <w:color w:val="984806" w:themeColor="accent6" w:themeShade="80"/>
-          <w:sz w:val="20"/>
-          <w:szCs w:val="20"/>
-        </w:rPr>
-        <w:t xml:space="preserve"> = "20"</w:t>
       </w:r>
     </w:p>
     <w:p/>
@@ -3529,7 +3503,13 @@
         <w:pStyle w:val="ListNumber"/>
       </w:pPr>
       <w:r>
-        <w:t>Byte-hash (SHA-256): exact duplicate pages (identical compressed bytes) are dropped immediately. Catches cases where the same PDF page appears more than once in the source without any re-encoding.</w:t>
+        <w:rPr>
+          <w:color w:val="EE0000"/>
+        </w:rPr>
+        <w:t xml:space="preserve">Byte-hash </w:t>
+      </w:r>
+      <w:r>
+        <w:t>(SHA-256): exact duplicate pages (identical compressed bytes) are dropped immediately. Catches cases where the same PDF page appears more than once in the source without any re-encoding.</w:t>
       </w:r>
     </w:p>
     <w:p>
@@ -3538,25 +3518,24 @@
       </w:pPr>
       <w:proofErr w:type="gramStart"/>
       <w:r>
+        <w:rPr>
+          <w:color w:val="EE0000"/>
+        </w:rPr>
         <w:t>Semantic-title</w:t>
       </w:r>
       <w:proofErr w:type="gramEnd"/>
       <w:r>
-        <w:t xml:space="preserve"> </w:t>
-      </w:r>
-      <w:proofErr w:type="spellStart"/>
-      <w:r>
-        <w:t>dedup</w:t>
-      </w:r>
-      <w:proofErr w:type="spellEnd"/>
+        <w:rPr>
+          <w:color w:val="EE0000"/>
+        </w:rPr>
+        <w:t xml:space="preserve"> dedup</w:t>
+      </w:r>
       <w:r>
         <w:t xml:space="preserve">: if two document groups share the same </w:t>
       </w:r>
-      <w:proofErr w:type="spellStart"/>
-      <w:r>
-        <w:t>normalised</w:t>
-      </w:r>
-      <w:proofErr w:type="spellEnd"/>
+      <w:r>
+        <w:t>normalized</w:t>
+      </w:r>
       <w:r>
         <w:t xml:space="preserve"> title key and the same declared page count, the second group is discarded. Catches duplicate multi-page forms such as two copies of a 3-page credit application.</w:t>
       </w:r>
@@ -3566,20 +3545,46 @@
         <w:pStyle w:val="ListNumber"/>
       </w:pPr>
       <w:r>
+        <w:rPr>
+          <w:color w:val="EE0000"/>
+        </w:rPr>
         <w:t>Perceptual hash (</w:t>
       </w:r>
       <w:proofErr w:type="spellStart"/>
       <w:r>
+        <w:rPr>
+          <w:color w:val="EE0000"/>
+        </w:rPr>
         <w:t>aHash</w:t>
       </w:r>
       <w:proofErr w:type="spellEnd"/>
       <w:r>
-        <w:t>): the first page of each surviving document is fingerprinted visually. Pairs whose fingerprints are within a similarity threshold are flagged as suspected duplicates in suspected_duplicates.txt.</w:t>
+        <w:rPr>
+          <w:color w:val="EE0000"/>
+        </w:rPr>
+        <w:t>):</w:t>
+      </w:r>
+      <w:r>
+        <w:t xml:space="preserve"> the first page of each surviving document is fingerprinted visually. Pairs whose fingerprints are within a similarity threshold are flagged as suspected duplicates in suspected_duplicates.txt.</w:t>
       </w:r>
     </w:p>
     <w:p>
       <w:r>
-        <w:t>Why not just use SHA-256 for all three layers? A cryptographic hash changes completely if even one pixel differs — two scans of the same printed form will produce entirely different SHA-256 values because scan angle, brightness, and compression vary. Perceptual hashing (</w:t>
+        <w:t xml:space="preserve">Why not just use SHA-256 for all three layers? </w:t>
+      </w:r>
+      <w:proofErr w:type="gramStart"/>
+      <w:r>
+        <w:t>A cryptographic</w:t>
+      </w:r>
+      <w:proofErr w:type="gramEnd"/>
+      <w:r>
+        <w:t xml:space="preserve"> hash changes completely if even one pixel differs</w:t>
+      </w:r>
+      <w:r>
+        <w:t xml:space="preserve">, </w:t>
+      </w:r>
+      <w:r>
+        <w:t>two scans of the same printed form will produce entirely different SHA-256 values because scan angle, brightness, and compression vary. Perceptual hashing (</w:t>
       </w:r>
       <w:proofErr w:type="spellStart"/>
       <w:r>
@@ -3924,7 +3929,16 @@
       </w:r>
       <w:proofErr w:type="gramEnd"/>
       <w:r>
-        <w:t xml:space="preserve"> (e.g. two Blue Steel Protection agreements for different customers) will have similar hashes but represent distinct documents and should not be merged.</w:t>
+        <w:t xml:space="preserve"> (e.g. two Blue Steel Protection agreements for </w:t>
+      </w:r>
+      <w:r>
+        <w:rPr>
+          <w:u w:val="single"/>
+        </w:rPr>
+        <w:t>different customers</w:t>
+      </w:r>
+      <w:r>
+        <w:t>) will have similar hashes but represent distinct documents and should not be merged.</w:t>
       </w:r>
     </w:p>
     <w:p>
@@ -4553,6 +4567,9 @@
       </w:r>
     </w:p>
     <w:p>
+      <w:pPr>
+        <w:spacing w:after="300" w:line="240" w:lineRule="auto"/>
+      </w:pPr>
       <w:r>
         <w:t>Billing stops the moment the container exits. There is no idle charge.</w:t>
       </w:r>
@@ -5144,7 +5161,19 @@
     </w:p>
     <w:p>
       <w:r>
-        <w:t>The sliding-window chunking feature (Section 3.3) eliminates this constraint. Because only two 20-page chunk files are held in RAM at any time, the tool can now process files of any size on the standard 8 GiB Consumption plan. Validation: the 457-page all-scanned file 603110820.pdf completed successfully in 1 h 55 min, producing 36 split documents — well above the previous reliable ceiling for Consumption hardware — without any hardware upgrade.</w:t>
+        <w:t>The sliding-window chunking feature (Section 3.3) eliminates this constraint. Because only two 20-page chunk files are held in RAM at any time, the tool can now process files of any size on the standard 8 GiB Consumption plan. Validation: the 457-page all-scanned file 603110820.pdf completed successfully in 1 h 55 min, producing 36 split documents</w:t>
+      </w:r>
+      <w:r>
+        <w:t>,</w:t>
+      </w:r>
+      <w:r>
+        <w:t xml:space="preserve"> well above the previous reliable ceiling for Consumption hardware</w:t>
+      </w:r>
+      <w:r>
+        <w:t xml:space="preserve">, </w:t>
+      </w:r>
+      <w:r>
+        <w:t>without any hardware upgrade.</w:t>
       </w:r>
     </w:p>
     <w:p>
@@ -6160,7 +6189,18 @@
       </w:tr>
     </w:tbl>
     <w:p>
-      <w:r>
+      <w:pPr>
+        <w:spacing w:before="100" w:line="240" w:lineRule="auto"/>
+        <w:rPr>
+          <w:sz w:val="20"/>
+          <w:szCs w:val="20"/>
+        </w:rPr>
+      </w:pPr>
+      <w:r>
+        <w:rPr>
+          <w:sz w:val="20"/>
+          <w:szCs w:val="20"/>
+        </w:rPr>
         <w:t>Note: D2 offers the same 8 GiB as Consumption but as a reserved allocation — meaning memory is guaranteed even under peak load and will not be preempted. It also allows future scaling without a plan migration. For files consistently exceeding the current failure threshold, D4 (16 GiB) is the recommended minimum upgrade.</w:t>
       </w:r>
     </w:p>
@@ -6176,7 +6216,6 @@
         </w:rPr>
       </w:pPr>
       <w:r>
-        <w:lastRenderedPageBreak/>
         <w:br w:type="page"/>
       </w:r>
     </w:p>
@@ -6796,21 +6835,45 @@
       </w:tr>
     </w:tbl>
     <w:p>
-      <w:r>
+      <w:pPr>
+        <w:spacing w:before="100" w:line="240" w:lineRule="auto"/>
+        <w:rPr>
+          <w:sz w:val="20"/>
+          <w:szCs w:val="20"/>
+        </w:rPr>
+      </w:pPr>
+      <w:r>
+        <w:rPr>
+          <w:sz w:val="20"/>
+          <w:szCs w:val="20"/>
+        </w:rPr>
         <w:t xml:space="preserve">* D8 has 2x CPU cores, which may improve PaddleOCR throughput depending on </w:t>
       </w:r>
-      <w:proofErr w:type="spellStart"/>
-      <w:r>
-        <w:t>parallelisation</w:t>
-      </w:r>
-      <w:proofErr w:type="spellEnd"/>
-      <w:r>
+      <w:r>
+        <w:rPr>
+          <w:sz w:val="20"/>
+          <w:szCs w:val="20"/>
+        </w:rPr>
+        <w:t>parallelization</w:t>
+      </w:r>
+      <w:r>
+        <w:rPr>
+          <w:sz w:val="20"/>
+          <w:szCs w:val="20"/>
+        </w:rPr>
         <w:t>. A conservative 25% speed improvement is assumed above. Actual improvement requires benchmarking.</w:t>
       </w:r>
     </w:p>
     <w:p>
       <w:r>
-        <w:t xml:space="preserve">Conclusion: Dedicated plans are significantly more expensive for batch workloads that run </w:t>
+        <w:rPr>
+          <w:color w:val="C00000"/>
+          <w:u w:val="single"/>
+        </w:rPr>
+        <w:t>Conclusion:</w:t>
+      </w:r>
+      <w:r>
+        <w:t xml:space="preserve"> Dedicated plans are significantly more expensive for batch workloads that run </w:t>
       </w:r>
       <w:proofErr w:type="gramStart"/>
       <w:r>
@@ -6842,8 +6905,17 @@
         <w:pStyle w:val="ListBullet"/>
       </w:pPr>
       <w:r>
-        <w:t>Sliding-window chunking is enabled by default in the Docker image (PDF_EXTRACTOR_OVERLAP_CHUNK_PAGES=20). No manual pre-splitting is needed.</w:t>
-      </w:r>
+        <w:t>Sliding-window chunking is always enabled in all modes — local and Azure — with a default chunk size of 20 pages (PDF_EXTRACTOR_OVERLAP_CHUNK_PAGES=20). No manual pre-splitting is needed.</w:t>
+      </w:r>
+      <w:r>
+        <w:rPr>
+          <w:rFonts w:ascii="Courier New" w:hAnsi="Courier New" w:cs="Courier New"/>
+          <w:color w:val="984806" w:themeColor="accent6" w:themeShade="80"/>
+          <w:sz w:val="20"/>
+          <w:szCs w:val="20"/>
+        </w:rPr>
+      </w:r>
+      <w:r/>
     </w:p>
     <w:p>
       <w:pPr>
@@ -6854,23 +6926,14 @@
           <w:rFonts w:ascii="Courier New" w:hAnsi="Courier New"/>
           <w:sz w:val="18"/>
         </w:rPr>
-        <w:t>To enable windowed chunking locally: $</w:t>
-      </w:r>
-      <w:proofErr w:type="spellStart"/>
+        <w:t>To adjust chunk size: $env:PDF_EXTRACTOR_OVERLAP_CHUNK_PAGES = "20"</w:t>
+      </w:r>
+      <w:r/>
       <w:r>
         <w:rPr>
           <w:rFonts w:ascii="Courier New" w:hAnsi="Courier New"/>
           <w:sz w:val="18"/>
         </w:rPr>
-        <w:t>env:PDF_EXTRACTOR_OVERLAP_CHUNK_PAGES</w:t>
-      </w:r>
-      <w:proofErr w:type="spellEnd"/>
-      <w:r>
-        <w:rPr>
-          <w:rFonts w:ascii="Courier New" w:hAnsi="Courier New"/>
-          <w:sz w:val="18"/>
-        </w:rPr>
-        <w:t xml:space="preserve"> = "20"</w:t>
       </w:r>
     </w:p>
     <w:p>

</xml_diff>

<commit_message>
docs: update cost comparison to 20 active hrs/day assumption
Replaced incorrect 2 hrs/day (para 96) and 10 hrs/day (para 98, tables)
with 20 active hrs/day throughout. Recalculated downstream figures:
- Days to 1M docs: 1,540 -> 770 (Consumption/D4), 1,230 -> 615 (D8)
- D4 idle cost: ~1,900 -> ~,700 (4 idle hrs/day vs 14)
- D8 idle cost: ~8,900 -> ~,700
- D4 total: ~0,000+ -> ~0,000+
- D8 total: ~2,000+ -> ~6,000+
- Daily active cost comparisons updated in Table 9 and Table 11

Generated with Claude Code
</commit_message>
<xml_diff>
--- a/PDF_split_and_Mine.docx
+++ b/PDF_split_and_Mine.docx
@@ -3451,34 +3451,13 @@
     </w:p>
     <w:p>
       <w:r>
+        <w:lastRenderedPageBreak/>
         <w:t>Windowed chunking is controlled by the PDF_EXTRACTOR_OVERLAP_CHUNK_PAGES environment variable. The default chunk size is 20 pages; chunking is always enabled in all modes (local and Azure).</w:t>
       </w:r>
-      <w:r>
-        <w:rPr>
-          <w:rFonts w:ascii="Courier New" w:hAnsi="Courier New" w:cs="Courier New"/>
-          <w:color w:val="984806" w:themeColor="accent6" w:themeShade="80"/>
-          <w:sz w:val="20"/>
-          <w:szCs w:val="20"/>
-        </w:rPr>
-      </w:r>
-      <w:r>
-        <w:rPr>
-          <w:color w:val="984806" w:themeColor="accent6" w:themeShade="80"/>
-        </w:rPr>
-      </w:r>
-      <w:r/>
     </w:p>
     <w:p>
       <w:r>
         <w:t>To adjust chunk size: $env:PDF_EXTRACTOR_OVERLAP_CHUNK_PAGES = "20"</w:t>
-      </w:r>
-      <w:r>
-        <w:rPr>
-          <w:rFonts w:ascii="Courier New" w:hAnsi="Courier New" w:cs="Courier New"/>
-          <w:color w:val="984806" w:themeColor="accent6" w:themeShade="80"/>
-          <w:sz w:val="20"/>
-          <w:szCs w:val="20"/>
-        </w:rPr>
       </w:r>
     </w:p>
     <w:p/>
@@ -3838,6 +3817,13 @@
           <w:sz w:val="18"/>
         </w:rPr>
         <w:br/>
+      </w:r>
+      <w:r>
+        <w:rPr>
+          <w:rFonts w:ascii="Courier New" w:hAnsi="Courier New"/>
+          <w:sz w:val="18"/>
+        </w:rPr>
+        <w:lastRenderedPageBreak/>
         <w:t xml:space="preserve">         (count the bit positions that differ)</w:t>
       </w:r>
       <w:r>
@@ -3852,7 +3838,6 @@
           <w:rFonts w:ascii="Courier New" w:hAnsi="Courier New"/>
           <w:sz w:val="18"/>
         </w:rPr>
-        <w:lastRenderedPageBreak/>
         <w:br/>
         <w:t xml:space="preserve">         Hash A: 1010110011101001...  (page from deal A)</w:t>
       </w:r>
@@ -5380,7 +5365,7 @@
                 <w:sz w:val="20"/>
                 <w:szCs w:val="20"/>
               </w:rPr>
-              <w:t xml:space="preserve">Daily cost | (10 </w:t>
+              <w:t>Daily cost | (20 hrs active)</w:t>
             </w:r>
             <w:proofErr w:type="spellStart"/>
             <w:r>
@@ -5388,7 +5373,6 @@
                 <w:sz w:val="20"/>
                 <w:szCs w:val="20"/>
               </w:rPr>
-              <w:t>hrs</w:t>
             </w:r>
             <w:proofErr w:type="spellEnd"/>
             <w:r>
@@ -5396,7 +5380,6 @@
                 <w:sz w:val="20"/>
                 <w:szCs w:val="20"/>
               </w:rPr>
-              <w:t xml:space="preserve"> active)</w:t>
             </w:r>
           </w:p>
         </w:tc>
@@ -5557,7 +5540,7 @@
                 <w:sz w:val="20"/>
                 <w:szCs w:val="20"/>
               </w:rPr>
-              <w:t>~$4.40</w:t>
+              <w:t>~$8.80</w:t>
             </w:r>
           </w:p>
         </w:tc>
@@ -5720,7 +5703,7 @@
                 <w:sz w:val="20"/>
                 <w:szCs w:val="20"/>
               </w:rPr>
-              <w:t>~$2.80</w:t>
+              <w:t>~$5.60</w:t>
             </w:r>
           </w:p>
         </w:tc>
@@ -5874,7 +5857,7 @@
                 <w:sz w:val="20"/>
                 <w:szCs w:val="20"/>
               </w:rPr>
-              <w:t>~$5.50</w:t>
+              <w:t>~$11.00</w:t>
             </w:r>
           </w:p>
         </w:tc>
@@ -6028,7 +6011,7 @@
                 <w:sz w:val="20"/>
                 <w:szCs w:val="20"/>
               </w:rPr>
-              <w:t>~$11.00</w:t>
+              <w:t>~$22.00</w:t>
             </w:r>
           </w:p>
         </w:tc>
@@ -6182,7 +6165,7 @@
                 <w:sz w:val="20"/>
                 <w:szCs w:val="20"/>
               </w:rPr>
-              <w:t>~$22.00</w:t>
+              <w:t>~$44.00</w:t>
             </w:r>
           </w:p>
         </w:tc>
@@ -6237,41 +6220,28 @@
       </w:r>
     </w:p>
     <w:p>
-      <w:r>
-        <w:t xml:space="preserve">The table below estimates total cost to produce 1 million split output documents, based on the throughput rate of ~65 documents/hour (validated for typical scanned files; mixed </w:t>
+      <w:pPr>
+        <w:spacing w:before="300" w:line="240" w:lineRule="auto"/>
+      </w:pPr>
+      <w:r>
+        <w:t>The table below estimates total cost to produce 1 million split output documents, based on the throughput rate of ~65 documents/hour (validated for typical scanned files; mixed text+scan files reach 199 docs/hr). Dedicated plans are costed assuming 20 active job hours per day (the remaining 4 hours the environment is idle but still billed).</w:t>
       </w:r>
       <w:proofErr w:type="spellStart"/>
-      <w:r>
-        <w:t>text+scan</w:t>
-      </w:r>
+      <w:r/>
       <w:proofErr w:type="spellEnd"/>
-      <w:r>
-        <w:t xml:space="preserve"> files reach 199 docs/</w:t>
-      </w:r>
+      <w:r/>
       <w:proofErr w:type="spellStart"/>
-      <w:r>
-        <w:t>hr</w:t>
-      </w:r>
+      <w:r/>
       <w:proofErr w:type="spellEnd"/>
-      <w:r>
-        <w:t xml:space="preserve">). Dedicated plans are </w:t>
-      </w:r>
+      <w:r/>
       <w:proofErr w:type="gramStart"/>
-      <w:r>
-        <w:t>costed assuming</w:t>
-      </w:r>
+      <w:r/>
       <w:proofErr w:type="gramEnd"/>
-      <w:r>
-        <w:t xml:space="preserve"> 2 </w:t>
-      </w:r>
+      <w:r/>
       <w:proofErr w:type="gramStart"/>
-      <w:r>
-        <w:t>active job</w:t>
-      </w:r>
+      <w:r/>
       <w:proofErr w:type="gramEnd"/>
-      <w:r>
-        <w:t xml:space="preserve"> hours per day (the rest of the day the environment is idle but still billed).</w:t>
-      </w:r>
+      <w:r/>
     </w:p>
     <w:tbl>
       <w:tblPr>
@@ -6354,21 +6324,19 @@
               <w:rPr>
                 <w:sz w:val="20"/>
               </w:rPr>
-              <w:t xml:space="preserve">Days | (10 </w:t>
+              <w:t>Days | (20 hrs/day)</w:t>
             </w:r>
             <w:proofErr w:type="spellStart"/>
             <w:r>
               <w:rPr>
                 <w:sz w:val="20"/>
               </w:rPr>
-              <w:t>hrs</w:t>
             </w:r>
             <w:proofErr w:type="spellEnd"/>
             <w:r>
               <w:rPr>
                 <w:sz w:val="20"/>
               </w:rPr>
-              <w:t>/day)</w:t>
             </w:r>
           </w:p>
         </w:tc>
@@ -6415,21 +6383,19 @@
               <w:rPr>
                 <w:sz w:val="20"/>
               </w:rPr>
-              <w:t xml:space="preserve">Idle cost | (14 </w:t>
+              <w:t>Idle cost | (4 hrs/day × days)</w:t>
             </w:r>
             <w:proofErr w:type="spellStart"/>
             <w:r>
               <w:rPr>
                 <w:sz w:val="20"/>
               </w:rPr>
-              <w:t>hrs</w:t>
             </w:r>
             <w:proofErr w:type="spellEnd"/>
             <w:r>
               <w:rPr>
                 <w:sz w:val="20"/>
               </w:rPr>
-              <w:t>/day × days)</w:t>
             </w:r>
           </w:p>
         </w:tc>
@@ -6465,6 +6431,7 @@
       <w:tr>
         <w:trPr>
           <w:cantSplit/>
+          <w:trHeight w:val="629"/>
         </w:trPr>
         <w:tc>
           <w:tcPr>
@@ -6530,7 +6497,7 @@
               <w:rPr>
                 <w:sz w:val="20"/>
               </w:rPr>
-              <w:t>~1,540 days</w:t>
+              <w:t>~770 days</w:t>
             </w:r>
           </w:p>
         </w:tc>
@@ -6598,6 +6565,7 @@
       <w:tr>
         <w:trPr>
           <w:cantSplit/>
+          <w:trHeight w:val="440"/>
         </w:trPr>
         <w:tc>
           <w:tcPr>
@@ -6652,7 +6620,7 @@
               <w:rPr>
                 <w:sz w:val="20"/>
               </w:rPr>
-              <w:t>~1,540 days</w:t>
+              <w:t>~770 days</w:t>
             </w:r>
           </w:p>
         </w:tc>
@@ -6690,7 +6658,7 @@
               <w:rPr>
                 <w:sz w:val="20"/>
               </w:rPr>
-              <w:t>~$11,900 idle</w:t>
+              <w:t>~$1,700 idle</w:t>
             </w:r>
           </w:p>
         </w:tc>
@@ -6709,7 +6677,7 @@
               <w:rPr>
                 <w:sz w:val="20"/>
               </w:rPr>
-              <w:t>~$20,000+</w:t>
+              <w:t>~$10,000+</w:t>
             </w:r>
           </w:p>
         </w:tc>
@@ -6717,6 +6685,7 @@
       <w:tr>
         <w:trPr>
           <w:cantSplit/>
+          <w:trHeight w:val="431"/>
         </w:trPr>
         <w:tc>
           <w:tcPr>
@@ -6771,7 +6740,7 @@
               <w:rPr>
                 <w:sz w:val="20"/>
               </w:rPr>
-              <w:t>~1,230 days</w:t>
+              <w:t>~615 days</w:t>
             </w:r>
           </w:p>
         </w:tc>
@@ -6809,7 +6778,7 @@
               <w:rPr>
                 <w:sz w:val="20"/>
               </w:rPr>
-              <w:t>~$18,900 idle</w:t>
+              <w:t>~$2,700 idle</w:t>
             </w:r>
           </w:p>
         </w:tc>
@@ -6828,7 +6797,7 @@
               <w:rPr>
                 <w:sz w:val="20"/>
               </w:rPr>
-              <w:t>~$32,000+</w:t>
+              <w:t>~$16,000+</w:t>
             </w:r>
           </w:p>
         </w:tc>
@@ -6870,27 +6839,17 @@
           <w:color w:val="C00000"/>
           <w:u w:val="single"/>
         </w:rPr>
-        <w:t>Conclusion:</w:t>
-      </w:r>
-      <w:r>
-        <w:t xml:space="preserve"> Dedicated plans are significantly more expensive for batch workloads that run </w:t>
-      </w:r>
+        <w:t>Conclusion: Dedicated plans are significantly more expensive for batch workloads that run 20 hours per day. The Consumption plan remains the most cost-effective option for this workload pattern. Dedicated plans should only be adopted if large-file failures become a consistent operational problem and cannot be resolved by splitting oversized source PDFs before upload.</w:t>
+      </w:r>
+      <w:r/>
       <w:proofErr w:type="gramStart"/>
-      <w:r>
-        <w:t>only a</w:t>
-      </w:r>
+      <w:r/>
       <w:proofErr w:type="gramEnd"/>
-      <w:r>
-        <w:t xml:space="preserve"> about 10 hours per day. The Consumption plan remains the most cost-effective option for this workload pattern. Dedicated plans should only be adopted if large-file failures become a consistent operational problem and cannot be resolved by splitting oversized source PDFs before </w:t>
-      </w:r>
+      <w:r/>
       <w:proofErr w:type="gramStart"/>
-      <w:r>
-        <w:t>upload</w:t>
-      </w:r>
+      <w:r/>
       <w:proofErr w:type="gramEnd"/>
-      <w:r>
-        <w:t>.</w:t>
-      </w:r>
+      <w:r/>
     </w:p>
     <w:p>
       <w:pPr>
@@ -6907,15 +6866,6 @@
       <w:r>
         <w:t>Sliding-window chunking is always enabled in all modes — local and Azure — with a default chunk size of 20 pages (PDF_EXTRACTOR_OVERLAP_CHUNK_PAGES=20). No manual pre-splitting is needed.</w:t>
       </w:r>
-      <w:r>
-        <w:rPr>
-          <w:rFonts w:ascii="Courier New" w:hAnsi="Courier New" w:cs="Courier New"/>
-          <w:color w:val="984806" w:themeColor="accent6" w:themeShade="80"/>
-          <w:sz w:val="20"/>
-          <w:szCs w:val="20"/>
-        </w:rPr>
-      </w:r>
-      <w:r/>
     </w:p>
     <w:p>
       <w:pPr>
@@ -6927,13 +6877,6 @@
           <w:sz w:val="18"/>
         </w:rPr>
         <w:t>To adjust chunk size: $env:PDF_EXTRACTOR_OVERLAP_CHUNK_PAGES = "20"</w:t>
-      </w:r>
-      <w:r/>
-      <w:r>
-        <w:rPr>
-          <w:rFonts w:ascii="Courier New" w:hAnsi="Courier New"/>
-          <w:sz w:val="18"/>
-        </w:rPr>
       </w:r>
     </w:p>
     <w:p>
@@ -7077,21 +7020,19 @@
               <w:rPr>
                 <w:sz w:val="20"/>
               </w:rPr>
-              <w:t xml:space="preserve">Effective daily cost | (10 </w:t>
+              <w:t>Effective daily cost | (20 hrs/day active)</w:t>
             </w:r>
             <w:proofErr w:type="spellStart"/>
             <w:r>
               <w:rPr>
                 <w:sz w:val="20"/>
               </w:rPr>
-              <w:t>hrs</w:t>
             </w:r>
             <w:proofErr w:type="spellEnd"/>
             <w:r>
               <w:rPr>
                 <w:sz w:val="20"/>
               </w:rPr>
-              <w:t>/day active)</w:t>
             </w:r>
           </w:p>
         </w:tc>
@@ -7204,7 +7145,7 @@
               <w:rPr>
                 <w:sz w:val="20"/>
               </w:rPr>
-              <w:t>$4.40 / day</w:t>
+              <w:t>$8.80 / day</w:t>
             </w:r>
           </w:p>
         </w:tc>
@@ -7428,6 +7369,7 @@
               <w:rPr>
                 <w:sz w:val="20"/>
               </w:rPr>
+              <w:lastRenderedPageBreak/>
               <w:t>Dedicated D16</w:t>
             </w:r>
           </w:p>
@@ -7512,7 +7454,6 @@
     </w:tbl>
     <w:p>
       <w:r>
-        <w:lastRenderedPageBreak/>
         <w:t xml:space="preserve">Conclusion: the Consumption plan at 4 vCPU / 8 GiB is the cost-optimal choice for this workload. The 8 GiB ceiling is sufficient for typical deal jacket files without any model configuration </w:t>
       </w:r>
       <w:proofErr w:type="gramStart"/>

</xml_diff>

<commit_message>
docs: clarify chunking needs no config; point to .env.example for overrides
- .env.example: commented out OVERLAP_CHUNK_PAGES (already the code default);
  added note that OCR lines override code defaults and can be removed if unneeded.
  Added note that .env is loaded automatically at startup.
- Docx paras 66 and 101: replaced env var command with explanation that no
  configuration is required and pointer to .env.example as a template.

Generated with Claude Code
</commit_message>
<xml_diff>
--- a/PDF_split_and_Mine.docx
+++ b/PDF_split_and_Mine.docx
@@ -3457,7 +3457,7 @@
     </w:p>
     <w:p>
       <w:r>
-        <w:t>To adjust chunk size: $env:PDF_EXTRACTOR_OVERLAP_CHUNK_PAGES = "20"</w:t>
+        <w:t>No configuration is required — the default of 20 pages takes effect automatically. To use a different chunk size, add PDF_EXTRACTOR_OVERLAP_CHUNK_PAGES=&lt;N&gt; to your .env file. Copy .env.example from the repository root as a starting template.</w:t>
       </w:r>
     </w:p>
     <w:p/>
@@ -5367,20 +5367,6 @@
               </w:rPr>
               <w:t>Daily cost | (20 hrs active)</w:t>
             </w:r>
-            <w:proofErr w:type="spellStart"/>
-            <w:r>
-              <w:rPr>
-                <w:sz w:val="20"/>
-                <w:szCs w:val="20"/>
-              </w:rPr>
-            </w:r>
-            <w:proofErr w:type="spellEnd"/>
-            <w:r>
-              <w:rPr>
-                <w:sz w:val="20"/>
-                <w:szCs w:val="20"/>
-              </w:rPr>
-            </w:r>
           </w:p>
         </w:tc>
       </w:tr>
@@ -6226,22 +6212,6 @@
       <w:r>
         <w:t>The table below estimates total cost to produce 1 million split output documents, based on the throughput rate of ~65 documents/hour (validated for typical scanned files; mixed text+scan files reach 199 docs/hr). Dedicated plans are costed assuming 20 active job hours per day (the remaining 4 hours the environment is idle but still billed).</w:t>
       </w:r>
-      <w:proofErr w:type="spellStart"/>
-      <w:r/>
-      <w:proofErr w:type="spellEnd"/>
-      <w:r/>
-      <w:proofErr w:type="spellStart"/>
-      <w:r/>
-      <w:proofErr w:type="spellEnd"/>
-      <w:r/>
-      <w:proofErr w:type="gramStart"/>
-      <w:r/>
-      <w:proofErr w:type="gramEnd"/>
-      <w:r/>
-      <w:proofErr w:type="gramStart"/>
-      <w:r/>
-      <w:proofErr w:type="gramEnd"/>
-      <w:r/>
     </w:p>
     <w:tbl>
       <w:tblPr>
@@ -6326,18 +6296,6 @@
               </w:rPr>
               <w:t>Days | (20 hrs/day)</w:t>
             </w:r>
-            <w:proofErr w:type="spellStart"/>
-            <w:r>
-              <w:rPr>
-                <w:sz w:val="20"/>
-              </w:rPr>
-            </w:r>
-            <w:proofErr w:type="spellEnd"/>
-            <w:r>
-              <w:rPr>
-                <w:sz w:val="20"/>
-              </w:rPr>
-            </w:r>
           </w:p>
         </w:tc>
         <w:tc>
@@ -6384,18 +6342,6 @@
                 <w:sz w:val="20"/>
               </w:rPr>
               <w:t>Idle cost | (4 hrs/day × days)</w:t>
-            </w:r>
-            <w:proofErr w:type="spellStart"/>
-            <w:r>
-              <w:rPr>
-                <w:sz w:val="20"/>
-              </w:rPr>
-            </w:r>
-            <w:proofErr w:type="spellEnd"/>
-            <w:r>
-              <w:rPr>
-                <w:sz w:val="20"/>
-              </w:rPr>
             </w:r>
           </w:p>
         </w:tc>
@@ -6839,17 +6785,19 @@
           <w:color w:val="C00000"/>
           <w:u w:val="single"/>
         </w:rPr>
-        <w:t>Conclusion: Dedicated plans are significantly more expensive for batch workloads that run 20 hours per day. The Consumption plan remains the most cost-effective option for this workload pattern. Dedicated plans should only be adopted if large-file failures become a consistent operational problem and cannot be resolved by splitting oversized source PDFs before upload.</w:t>
-      </w:r>
-      <w:r/>
+        <w:t xml:space="preserve">Conclusion: </w:t>
+      </w:r>
+      <w:r>
+        <w:t xml:space="preserve">Dedicated plans are significantly more expensive for batch workloads that run 20 hours per day. The Consumption plan remains the most cost-effective option for this workload pattern. Dedicated plans should only be adopted if large-file failures become a consistent operational problem and cannot be resolved by splitting oversized source PDFs before </w:t>
+      </w:r>
       <w:proofErr w:type="gramStart"/>
-      <w:r/>
+      <w:r>
+        <w:t>upload</w:t>
+      </w:r>
       <w:proofErr w:type="gramEnd"/>
-      <w:r/>
-      <w:proofErr w:type="gramStart"/>
-      <w:r/>
-      <w:proofErr w:type="gramEnd"/>
-      <w:r/>
+      <w:r>
+        <w:t>.</w:t>
+      </w:r>
     </w:p>
     <w:p>
       <w:pPr>
@@ -6864,7 +6812,31 @@
         <w:pStyle w:val="ListBullet"/>
       </w:pPr>
       <w:r>
-        <w:t>Sliding-window chunking is always enabled in all modes — local and Azure — with a default chunk size of 20 pages (PDF_EXTRACTOR_OVERLAP_CHUNK_PAGES=20). No manual pre-splitting is needed.</w:t>
+        <w:t>Sliding-window chunking is always enabled in all modes</w:t>
+      </w:r>
+      <w:r>
+        <w:t>,</w:t>
+      </w:r>
+      <w:r>
+        <w:t xml:space="preserve"> local and Azure</w:t>
+      </w:r>
+      <w:r>
+        <w:t xml:space="preserve">, </w:t>
+      </w:r>
+      <w:r>
+        <w:t xml:space="preserve">with a default chunk size of 20 pages </w:t>
+      </w:r>
+      <w:r>
+        <w:rPr>
+          <w:rFonts w:ascii="Courier New" w:hAnsi="Courier New" w:cs="Courier New"/>
+          <w:color w:val="984806" w:themeColor="accent6" w:themeShade="80"/>
+          <w:sz w:val="20"/>
+          <w:szCs w:val="20"/>
+        </w:rPr>
+        <w:t>(PDF_EXTRACTOR_OVERLAP_CHUNK_PAGES=20)</w:t>
+      </w:r>
+      <w:r>
+        <w:t>. No manual pre-splitting is needed.</w:t>
       </w:r>
     </w:p>
     <w:p>
@@ -6876,7 +6848,7 @@
           <w:rFonts w:ascii="Courier New" w:hAnsi="Courier New"/>
           <w:sz w:val="18"/>
         </w:rPr>
-        <w:t>To adjust chunk size: $env:PDF_EXTRACTOR_OVERLAP_CHUNK_PAGES = "20"</w:t>
+        <w:t>No configuration is required — the default of 20 pages takes effect automatically. To use a different chunk size, add PDF_EXTRACTOR_OVERLAP_CHUNK_PAGES=&lt;N&gt; to your .env file. Copy .env.example from the repository root as a starting template.</w:t>
       </w:r>
     </w:p>
     <w:p>
@@ -7021,18 +6993,6 @@
                 <w:sz w:val="20"/>
               </w:rPr>
               <w:t>Effective daily cost | (20 hrs/day active)</w:t>
-            </w:r>
-            <w:proofErr w:type="spellStart"/>
-            <w:r>
-              <w:rPr>
-                <w:sz w:val="20"/>
-              </w:rPr>
-            </w:r>
-            <w:proofErr w:type="spellEnd"/>
-            <w:r>
-              <w:rPr>
-                <w:sz w:val="20"/>
-              </w:rPr>
             </w:r>
           </w:p>
         </w:tc>

</xml_diff>

<commit_message>
feat: add Product Type extraction and update all docs
- Replace _extract_dealer_id with _extract_dealer_section returning
  (dealer_id, product_type) using fitz word-coordinate matching
- Fix RouteOne text path bug where dealer_id was passed a string
  instead of a page object
- Add Product Type column to Excel output (after VIN)
- Update vision prompts to request product_type
- README: fix Excel columns, repo layout, OCR env var values,
  az login steps, remove stale 602819077 validated outcome
- CLAUDE.md: update test count, return format, extraction logic detail

Generated with Claude Code
</commit_message>
<xml_diff>
--- a/PDF_split_and_Mine.docx
+++ b/PDF_split_and_Mine.docx
@@ -610,14 +610,7 @@
               <w:rPr>
                 <w:sz w:val="20"/>
               </w:rPr>
-              <w:t>run-</w:t>
-            </w:r>
-            <w:proofErr w:type="spellStart"/>
-            <w:r>
-              <w:rPr>
-                <w:sz w:val="20"/>
-              </w:rPr>
-              <w:t>config</w:t>
+              <w:t>run-config</w:t>
             </w:r>
             <w:proofErr w:type="gramEnd"/>
             <w:r>
@@ -626,7 +619,6 @@
               </w:rPr>
               <w:t>.json</w:t>
             </w:r>
-            <w:proofErr w:type="spellEnd"/>
           </w:p>
         </w:tc>
         <w:tc>
@@ -650,6 +642,11 @@
         </w:tc>
       </w:tr>
     </w:tbl>
+    <w:p>
+      <w:pPr>
+        <w:pStyle w:val="Heading2"/>
+      </w:pPr>
+    </w:p>
     <w:p>
       <w:pPr>
         <w:pStyle w:val="Heading2"/>
@@ -1066,21 +1063,7 @@
               <w:rPr>
                 <w:sz w:val="20"/>
               </w:rPr>
-              <w:t xml:space="preserve"> PDF directory and output directory. Settings saved to run-</w:t>
-            </w:r>
-            <w:proofErr w:type="spellStart"/>
-            <w:r>
-              <w:rPr>
-                <w:sz w:val="20"/>
-              </w:rPr>
-              <w:t>config.json</w:t>
-            </w:r>
-            <w:proofErr w:type="spellEnd"/>
-            <w:r>
-              <w:rPr>
-                <w:sz w:val="20"/>
-              </w:rPr>
-              <w:t xml:space="preserve"> and persist across runs.</w:t>
+              <w:t xml:space="preserve"> PDF directory and output directory. Settings saved to run-config.json and persist across runs.</w:t>
             </w:r>
           </w:p>
         </w:tc>
@@ -2383,26 +2366,22 @@
         <w:pStyle w:val="Heading2"/>
       </w:pPr>
       <w:r>
-        <w:t>Configuration (run-</w:t>
-      </w:r>
-      <w:proofErr w:type="spellStart"/>
-      <w:r>
-        <w:t>config.json</w:t>
-      </w:r>
-      <w:proofErr w:type="spellEnd"/>
-      <w:r>
-        <w:t>)</w:t>
+        <w:t>Configuration (run-config.json)</w:t>
       </w:r>
     </w:p>
     <w:p>
       <w:r>
-        <w:t>Settings are saved to run-</w:t>
-      </w:r>
-      <w:proofErr w:type="spellStart"/>
-      <w:r>
-        <w:t>config.json</w:t>
-      </w:r>
-      <w:proofErr w:type="spellEnd"/>
+        <w:t xml:space="preserve">Settings are saved to </w:t>
+      </w:r>
+      <w:r>
+        <w:rPr>
+          <w:rFonts w:ascii="Courier New" w:hAnsi="Courier New" w:cs="Courier New"/>
+          <w:color w:val="984806" w:themeColor="accent6" w:themeShade="80"/>
+          <w:sz w:val="20"/>
+          <w:szCs w:val="20"/>
+        </w:rPr>
+        <w:t>run-config.json</w:t>
+      </w:r>
       <w:r>
         <w:t xml:space="preserve"> in the repository root. This allows different machines or users to have different input/output paths without modifying the script. Select "Configure settings" (option 5 in Local mode) to change paths; they persist across sessions.</w:t>
       </w:r>
@@ -2413,19 +2392,11 @@
       </w:r>
       <w:proofErr w:type="gramStart"/>
       <w:r>
-        <w:t>run-</w:t>
-      </w:r>
-      <w:proofErr w:type="spellStart"/>
-      <w:r>
-        <w:t>config</w:t>
+        <w:t>run-config</w:t>
       </w:r>
       <w:proofErr w:type="gramEnd"/>
       <w:r>
-        <w:t>.json</w:t>
-      </w:r>
-      <w:proofErr w:type="spellEnd"/>
-      <w:r>
-        <w:t>:</w:t>
+        <w:t>.json:</w:t>
       </w:r>
     </w:p>
     <w:p>
@@ -3452,12 +3423,60 @@
     <w:p>
       <w:r>
         <w:lastRenderedPageBreak/>
-        <w:t>Windowed chunking is controlled by the PDF_EXTRACTOR_OVERLAP_CHUNK_PAGES environment variable. The default chunk size is 20 pages; chunking is always enabled in all modes (local and Azure).</w:t>
+        <w:t xml:space="preserve">Windowed chunking is controlled by the </w:t>
+      </w:r>
+      <w:r>
+        <w:rPr>
+          <w:rFonts w:ascii="Courier New" w:hAnsi="Courier New" w:cs="Courier New"/>
+          <w:color w:val="984806" w:themeColor="accent6" w:themeShade="80"/>
+          <w:sz w:val="20"/>
+          <w:szCs w:val="20"/>
+        </w:rPr>
+        <w:t>PDF_EXTRACTOR_OVERLAP_CHUNK_PAGES</w:t>
+      </w:r>
+      <w:r>
+        <w:t xml:space="preserve"> environment variable. The default chunk size is 20 pages; chunking is always enabled in all modes (local and Azure).</w:t>
       </w:r>
     </w:p>
     <w:p>
       <w:r>
-        <w:t>No configuration is required — the default of 20 pages takes effect automatically. To use a different chunk size, add PDF_EXTRACTOR_OVERLAP_CHUNK_PAGES=&lt;N&gt; to your .env file. Copy .env.example from the repository root as a starting template.</w:t>
+        <w:t xml:space="preserve">No configuration is required — the default of 20 pages takes effect automatically. To use a different chunk size, add </w:t>
+      </w:r>
+      <w:r>
+        <w:rPr>
+          <w:rFonts w:ascii="Courier New" w:hAnsi="Courier New" w:cs="Courier New"/>
+          <w:color w:val="984806" w:themeColor="accent6" w:themeShade="80"/>
+          <w:sz w:val="20"/>
+          <w:szCs w:val="20"/>
+        </w:rPr>
+        <w:t>PDF_EXTRACTOR_OVERLAP_CHUNK_PAGES=&lt;N&gt;</w:t>
+      </w:r>
+      <w:r>
+        <w:t xml:space="preserve"> to your </w:t>
+      </w:r>
+      <w:r>
+        <w:rPr>
+          <w:rFonts w:ascii="Courier New" w:hAnsi="Courier New" w:cs="Courier New"/>
+          <w:color w:val="984806" w:themeColor="accent6" w:themeShade="80"/>
+          <w:sz w:val="20"/>
+          <w:szCs w:val="20"/>
+        </w:rPr>
+        <w:t>.env</w:t>
+      </w:r>
+      <w:r>
+        <w:t xml:space="preserve"> file. Copy </w:t>
+      </w:r>
+      <w:r>
+        <w:rPr>
+          <w:rFonts w:ascii="Courier New" w:hAnsi="Courier New" w:cs="Courier New"/>
+          <w:color w:val="984806" w:themeColor="accent6" w:themeShade="80"/>
+          <w:sz w:val="20"/>
+          <w:szCs w:val="20"/>
+        </w:rPr>
+        <w:t>.env.example</w:t>
+      </w:r>
+      <w:r>
+        <w:t xml:space="preserve"> from the repository root as a starting template.</w:t>
       </w:r>
     </w:p>
     <w:p/>
@@ -3551,11 +3570,9 @@
       <w:r>
         <w:t xml:space="preserve">Why not just use SHA-256 for all three layers? </w:t>
       </w:r>
-      <w:proofErr w:type="gramStart"/>
-      <w:r>
-        <w:t>A cryptographic</w:t>
-      </w:r>
-      <w:proofErr w:type="gramEnd"/>
+      <w:r>
+        <w:t>Cryptographic</w:t>
+      </w:r>
       <w:r>
         <w:t xml:space="preserve"> hash changes completely if even one pixel differs</w:t>
       </w:r>
@@ -3778,6 +3795,13 @@
           <w:sz w:val="18"/>
         </w:rPr>
         <w:br/>
+      </w:r>
+      <w:r>
+        <w:rPr>
+          <w:rFonts w:ascii="Courier New" w:hAnsi="Courier New"/>
+          <w:sz w:val="18"/>
+        </w:rPr>
+        <w:lastRenderedPageBreak/>
         <w:t xml:space="preserve">         Result: a single 64-bit integer  (the perceptual hash / </w:t>
       </w:r>
       <w:proofErr w:type="spellStart"/>
@@ -3817,13 +3841,6 @@
           <w:sz w:val="18"/>
         </w:rPr>
         <w:br/>
-      </w:r>
-      <w:r>
-        <w:rPr>
-          <w:rFonts w:ascii="Courier New" w:hAnsi="Courier New"/>
-          <w:sz w:val="18"/>
-        </w:rPr>
-        <w:lastRenderedPageBreak/>
         <w:t xml:space="preserve">         (count the bit positions that differ)</w:t>
       </w:r>
       <w:r>
@@ -4638,6 +4655,7 @@
       <w:tr>
         <w:trPr>
           <w:cantSplit/>
+          <w:trHeight w:val="323"/>
         </w:trPr>
         <w:tc>
           <w:tcPr>
@@ -4700,6 +4718,7 @@
       <w:tr>
         <w:trPr>
           <w:cantSplit/>
+          <w:trHeight w:val="341"/>
         </w:trPr>
         <w:tc>
           <w:tcPr>
@@ -4762,6 +4781,7 @@
       <w:tr>
         <w:trPr>
           <w:cantSplit/>
+          <w:trHeight w:val="359"/>
         </w:trPr>
         <w:tc>
           <w:tcPr>
@@ -4862,8 +4882,15 @@
       <w:r>
         <w:br/>
       </w:r>
-      <w:r>
-        <w:br/>
+    </w:p>
+    <w:p>
+      <w:r>
+        <w:br w:type="page"/>
+      </w:r>
+    </w:p>
+    <w:p>
+      <w:r>
+        <w:lastRenderedPageBreak/>
         <w:t>PaddleOCR is the throughput bottleneck and runs single-threaded. The all-scanned figure (238 pages/</w:t>
       </w:r>
       <w:proofErr w:type="spellStart"/>
@@ -4933,6 +4960,7 @@
       <w:tr>
         <w:trPr>
           <w:cantSplit/>
+          <w:trHeight w:val="350"/>
         </w:trPr>
         <w:tc>
           <w:tcPr>
@@ -4983,6 +5011,50 @@
                 <w:sz w:val="20"/>
               </w:rPr>
               <w:t>~238 / 465–549</w:t>
+            </w:r>
+          </w:p>
+        </w:tc>
+      </w:tr>
+      <w:tr>
+        <w:trPr>
+          <w:cantSplit/>
+          <w:trHeight w:val="350"/>
+        </w:trPr>
+        <w:tc>
+          <w:tcPr>
+            <w:tcW w:w="4320" w:type="dxa"/>
+          </w:tcPr>
+          <w:p>
+            <w:pPr>
+              <w:rPr>
+                <w:sz w:val="20"/>
+                <w:szCs w:val="20"/>
+              </w:rPr>
+            </w:pPr>
+            <w:r>
+              <w:rPr>
+                <w:sz w:val="20"/>
+              </w:rPr>
+              <w:t>Cost per source page  (all-scanned / mixed)</w:t>
+            </w:r>
+          </w:p>
+        </w:tc>
+        <w:tc>
+          <w:tcPr>
+            <w:tcW w:w="4320" w:type="dxa"/>
+          </w:tcPr>
+          <w:p>
+            <w:pPr>
+              <w:rPr>
+                <w:sz w:val="20"/>
+                <w:szCs w:val="20"/>
+              </w:rPr>
+            </w:pPr>
+            <w:r>
+              <w:rPr>
+                <w:sz w:val="20"/>
+              </w:rPr>
+              <w:t>$0.00185 / $0.00080–$0.00094</w:t>
             </w:r>
           </w:p>
         </w:tc>
@@ -5006,7 +5078,7 @@
               <w:rPr>
                 <w:sz w:val="20"/>
               </w:rPr>
-              <w:t>Cost per source page  (all-scanned / mixed)</w:t>
+              <w:t>GPT-4o-mini per credit app  (~1.5% of output docs)</w:t>
             </w:r>
           </w:p>
         </w:tc>
@@ -5025,7 +5097,7 @@
               <w:rPr>
                 <w:sz w:val="20"/>
               </w:rPr>
-              <w:t>$0.00185 / $0.00080–$0.00094</w:t>
+              <w:t>~$0.0003</w:t>
             </w:r>
           </w:p>
         </w:tc>
@@ -5049,49 +5121,6 @@
               <w:rPr>
                 <w:sz w:val="20"/>
               </w:rPr>
-              <w:t>GPT-4o-mini per credit app  (~1.5% of output docs)</w:t>
-            </w:r>
-          </w:p>
-        </w:tc>
-        <w:tc>
-          <w:tcPr>
-            <w:tcW w:w="4320" w:type="dxa"/>
-          </w:tcPr>
-          <w:p>
-            <w:pPr>
-              <w:rPr>
-                <w:sz w:val="20"/>
-                <w:szCs w:val="20"/>
-              </w:rPr>
-            </w:pPr>
-            <w:r>
-              <w:rPr>
-                <w:sz w:val="20"/>
-              </w:rPr>
-              <w:t>~$0.0003</w:t>
-            </w:r>
-          </w:p>
-        </w:tc>
-      </w:tr>
-      <w:tr>
-        <w:trPr>
-          <w:cantSplit/>
-        </w:trPr>
-        <w:tc>
-          <w:tcPr>
-            <w:tcW w:w="4320" w:type="dxa"/>
-          </w:tcPr>
-          <w:p>
-            <w:pPr>
-              <w:rPr>
-                <w:sz w:val="20"/>
-                <w:szCs w:val="20"/>
-              </w:rPr>
-            </w:pPr>
-            <w:r>
-              <w:rPr>
-                <w:sz w:val="20"/>
-              </w:rPr>
               <w:t>Estimated cost per 1,000 source pages  (typical mixed files)</w:t>
             </w:r>
           </w:p>
@@ -5118,10 +5147,17 @@
       </w:tr>
     </w:tbl>
     <w:p>
-      <w:r>
-        <w:lastRenderedPageBreak/>
+      <w:pPr>
+        <w:spacing w:before="300" w:line="240" w:lineRule="auto"/>
+      </w:pPr>
+      <w:r>
         <w:t>AI token costs are negligible (under $5 per million documents at the current 1.5% credit application rate). The dominant cost is CPU time for OCR.</w:t>
       </w:r>
+    </w:p>
+    <w:p>
+      <w:pPr>
+        <w:spacing w:before="300" w:line="240" w:lineRule="auto"/>
+      </w:pPr>
     </w:p>
     <w:p>
       <w:pPr>
@@ -5163,9 +5199,24 @@
     </w:p>
     <w:p>
       <w:pPr>
+        <w:rPr>
+          <w:rFonts w:asciiTheme="majorHAnsi" w:eastAsiaTheme="majorEastAsia" w:hAnsiTheme="majorHAnsi" w:cstheme="majorBidi"/>
+          <w:b/>
+          <w:bCs/>
+          <w:color w:val="4F81BD" w:themeColor="accent1"/>
+          <w:szCs w:val="26"/>
+        </w:rPr>
+      </w:pPr>
+      <w:r>
+        <w:br w:type="page"/>
+      </w:r>
+    </w:p>
+    <w:p>
+      <w:pPr>
         <w:pStyle w:val="Heading2"/>
       </w:pPr>
       <w:r>
+        <w:lastRenderedPageBreak/>
         <w:t>Dedicated Workload Profile Options</w:t>
       </w:r>
     </w:p>
@@ -6175,25 +6226,14 @@
     </w:p>
     <w:p>
       <w:pPr>
-        <w:rPr>
-          <w:rFonts w:asciiTheme="majorHAnsi" w:eastAsiaTheme="majorEastAsia" w:hAnsiTheme="majorHAnsi" w:cstheme="majorBidi"/>
-          <w:b/>
-          <w:bCs/>
-          <w:color w:val="4F81BD" w:themeColor="accent1"/>
-          <w:sz w:val="26"/>
-          <w:szCs w:val="26"/>
-        </w:rPr>
+        <w:pStyle w:val="Heading2"/>
       </w:pPr>
-      <w:r>
-        <w:br w:type="page"/>
-      </w:r>
     </w:p>
     <w:p>
       <w:pPr>
         <w:pStyle w:val="Heading2"/>
       </w:pPr>
       <w:r>
-        <w:lastRenderedPageBreak/>
         <w:t xml:space="preserve">Cost Comparison: 1 </w:t>
       </w:r>
       <w:proofErr w:type="gramStart"/>
@@ -6207,7 +6247,7 @@
     </w:p>
     <w:p>
       <w:pPr>
-        <w:spacing w:before="300" w:line="240" w:lineRule="auto"/>
+        <w:spacing w:before="100" w:after="300" w:line="240" w:lineRule="auto"/>
       </w:pPr>
       <w:r>
         <w:t>The table below estimates total cost to produce 1 million split output documents, based on the throughput rate of ~65 documents/hour (validated for typical scanned files; mixed text+scan files reach 199 docs/hr). Dedicated plans are costed assuming 20 active job hours per day (the remaining 4 hours the environment is idle but still billed).</w:t>
@@ -6785,6 +6825,7 @@
           <w:color w:val="C00000"/>
           <w:u w:val="single"/>
         </w:rPr>
+        <w:lastRenderedPageBreak/>
         <w:t xml:space="preserve">Conclusion: </w:t>
       </w:r>
       <w:r>
@@ -7329,7 +7370,6 @@
               <w:rPr>
                 <w:sz w:val="20"/>
               </w:rPr>
-              <w:lastRenderedPageBreak/>
               <w:t>Dedicated D16</w:t>
             </w:r>
           </w:p>
@@ -7413,17 +7453,34 @@
       </w:tr>
     </w:tbl>
     <w:p>
-      <w:r>
-        <w:t xml:space="preserve">Conclusion: the Consumption plan at 4 vCPU / 8 GiB is the cost-optimal choice for this workload. The 8 GiB ceiling is sufficient for typical deal jacket files without any model configuration </w:t>
-      </w:r>
+      <w:pPr>
+        <w:spacing w:before="100" w:line="240" w:lineRule="auto"/>
+      </w:pPr>
       <w:proofErr w:type="gramStart"/>
       <w:r>
+        <w:t>the</w:t>
+      </w:r>
+      <w:proofErr w:type="gramEnd"/>
+      <w:r>
+        <w:t xml:space="preserve"> Consumption plan at 4 vCPU / 8 GiB is the cost-optimal choice for this workload. The 8 GiB ceiling is sufficient for typical deal jacket files without any model configuration </w:t>
+      </w:r>
+      <w:proofErr w:type="gramStart"/>
+      <w:r>
         <w:t>changes, and</w:t>
       </w:r>
       <w:proofErr w:type="gramEnd"/>
       <w:r>
         <w:t xml:space="preserve"> pay-per-use billing eliminates idle cost entirely. For files that exceed the memory ceiling, pre-splitting the source PDF is the recommended solution before considering a dedicated plan upgrade.</w:t>
       </w:r>
+    </w:p>
+    <w:p>
+      <w:pPr>
+        <w:spacing w:before="100" w:line="240" w:lineRule="auto"/>
+        <w:rPr>
+          <w:sz w:val="20"/>
+          <w:szCs w:val="20"/>
+        </w:rPr>
+      </w:pPr>
     </w:p>
     <w:p>
       <w:pPr>
@@ -7444,6 +7501,7 @@
         <w:br/>
       </w:r>
       <w:r>
+        <w:lastRenderedPageBreak/>
         <w:br/>
         <w:t xml:space="preserve">The solution decouples file size from RAM requirement entirely. The source PDF is divided into fixed, non-overlapping 20-page chunks written </w:t>
       </w:r>

</xml_diff>